<commit_message>
fix: pipeline academica com filtro strip-emoji + limpeza de AI fluff nos docx/pdf
- novo filtro pandoc: templates/strip-emoji.lua (remove emojis de Str e Header)
- pipeline atualizada: sed pre-processa removendo blockquotes de working-document
  (Documento VIVO, Status:, Observacao, Nome do arquivo, Sugestoes, etc.)
- gera .pdf para proposta e problema-real (antes so .docx)
- mantem .md fonte com estilo disruptivo, so limpa na conversao
- todos os 8 arquivos academicos regenerados sem emojis
</commit_message>
<xml_diff>
--- a/disciplinas/gcetens843-projeto-algoritmo-i/atividades/trabalhos/projeto-algoritmos/Index-Geral.docx
+++ b/disciplinas/gcetens843-projeto-algoritmo-i/atividades/trabalhos/projeto-algoritmos/Index-Geral.docx
@@ -10,93 +10,71 @@
         <w:t xml:space="preserve">Index Geral - FilaClara</w:t>
       </w:r>
     </w:p>
-    <w:bookmarkStart w:id="55" w:name="index-geral-filaclara"/>
+    <w:bookmarkStart w:id="57" w:name="index-geral-filaclara"/>
     <w:p>
       <w:pPr>
         <w:pStyle w:val="Heading1"/>
       </w:pPr>
       <w:r>
-        <w:t xml:space="preserve">Index Geral — FilaClara</w:t>
+        <w:t xml:space="preserve">Index Geral  FilaClara</w:t>
       </w:r>
     </w:p>
     <w:p>
       <w:pPr>
-        <w:pStyle w:val="BlockText"/>
-      </w:pPr>
-      <w:r>
-        <w:rPr>
-          <w:b/>
-          <w:bCs/>
-        </w:rPr>
-        <w:t xml:space="preserve">Core do grupo:</w:t>
-      </w:r>
-      <w:r>
-        <w:t xml:space="preserve"> </w:t>
-      </w:r>
-      <w:r>
-        <w:t xml:space="preserve">este arquivo é o ponto de partida. Fixado no grupo do WhatsApp para que qualquer integrante entenda rapidamente o projeto, encontre os documentos certos e saiba o que já foi feito e o que ainda precisa ser entregue.</w:t>
+        <w:pStyle w:val="CaptionedFigure"/>
+      </w:pPr>
+      <w:r>
+        <w:drawing>
+          <wp:inline>
+            <wp:extent cx="5334000" cy="3001970"/>
+            <wp:effectExtent b="0" l="0" r="0" t="0"/>
+            <wp:docPr descr="Foto do grupo" title="" id="21" name="Picture"/>
+            <a:graphic>
+              <a:graphicData uri="http://schemas.openxmlformats.org/drawingml/2006/picture">
+                <pic:pic>
+                  <pic:nvPicPr>
+                    <pic:cNvPr descr="imagens-grupo/nova-foto-grupo.png" id="22" name="Picture"/>
+                    <pic:cNvPicPr>
+                      <a:picLocks noChangeArrowheads="1" noChangeAspect="1"/>
+                    </pic:cNvPicPr>
+                  </pic:nvPicPr>
+                  <pic:blipFill>
+                    <a:blip r:embed="rId20"/>
+                    <a:stretch>
+                      <a:fillRect/>
+                    </a:stretch>
+                  </pic:blipFill>
+                  <pic:spPr bwMode="auto">
+                    <a:xfrm>
+                      <a:off x="0" y="0"/>
+                      <a:ext cx="5334000" cy="3001970"/>
+                    </a:xfrm>
+                    <a:prstGeom prst="rect">
+                      <a:avLst/>
+                    </a:prstGeom>
+                    <a:noFill/>
+                    <a:ln w="9525">
+                      <a:noFill/>
+                      <a:headEnd/>
+                      <a:tailEnd/>
+                    </a:ln>
+                  </pic:spPr>
+                </pic:pic>
+              </a:graphicData>
+            </a:graphic>
+          </wp:inline>
+        </w:drawing>
       </w:r>
     </w:p>
     <w:p>
-      <w:r>
-        <w:pict>
-          <v:rect style="width:0;height:1.5pt" o:hralign="center" o:hrstd="t" o:hr="t"/>
-        </w:pict>
+      <w:pPr>
+        <w:pStyle w:val="ImageCaption"/>
+      </w:pPr>
+      <w:r>
+        <w:t xml:space="preserve">Foto do grupo</w:t>
       </w:r>
     </w:p>
-    <w:tbl>
-      <w:tblPr>
-        <w:tblStyle w:val="FigureTable"/>
-        <w:tblW w:type="auto" w:w="0"/>
-        <w:jc w:val="center"/>
-        <w:tblLook w:firstRow="0" w:lastRow="0" w:firstColumn="0" w:lastColumn="0"/>
-      </w:tblPr>
-      <w:tblGrid>
-        <w:gridCol w:w="7920"/>
-      </w:tblGrid>
-      <w:tr>
-        <w:tc>
-          <w:tcPr/>
-          <w:p>
-            <w:pPr>
-              <w:pStyle w:val="Compact"/>
-              <w:jc w:val="center"/>
-            </w:pPr>
-            <w:r>
-              <w:t xml:space="preserve">Foto do grupo</w:t>
-            </w:r>
-          </w:p>
-        </w:tc>
-      </w:tr>
-    </w:tbl>
-    <w:p>
-      <w:pPr>
-        <w:pStyle w:val="ImageCaption"/>
-      </w:pPr>
-      <w:r>
-        <w:t xml:space="preserve">Foto do grupo</w:t>
-      </w:r>
-    </w:p>
-    <w:p>
-      <w:pPr>
-        <w:pStyle w:val="BlockText"/>
-      </w:pPr>
-      <w:r>
-        <w:rPr>
-          <w:i/>
-          <w:iCs/>
-        </w:rPr>
-        <w:t xml:space="preserve">Grupo: Deivison, Ausiane, Rios, Artur, Uélinton, Nubia e Marcos Vinicius. Wallace ainda não mandou imagem — bora, Wallace! 😅</w:t>
-      </w:r>
-    </w:p>
-    <w:p>
-      <w:r>
-        <w:pict>
-          <v:rect style="width:0;height:1.5pt" o:hralign="center" o:hrstd="t" o:hr="t"/>
-        </w:pict>
-      </w:r>
-    </w:p>
-    <w:bookmarkStart w:id="24" w:name="resumo-do-projeto"/>
+    <w:bookmarkStart w:id="23" w:name="resumo-do-projeto"/>
     <w:p>
       <w:pPr>
         <w:pStyle w:val="Heading2"/>
@@ -179,9 +157,6 @@
             <w:r>
               <w:t xml:space="preserve"> </w:t>
             </w:r>
-            <w:r>
-              <w:t xml:space="preserve">✅</w:t>
-            </w:r>
           </w:p>
         </w:tc>
       </w:tr>
@@ -210,7 +185,7 @@
               <w:jc w:val="left"/>
             </w:pPr>
             <w:r>
-              <w:t xml:space="preserve">UFRB — Universidade Federal do Recôncavo da Bahia</w:t>
+              <w:t xml:space="preserve">UFRB  Universidade Federal do Recôncavo da Bahia</w:t>
             </w:r>
           </w:p>
         </w:tc>
@@ -270,7 +245,7 @@
               <w:jc w:val="left"/>
             </w:pPr>
             <w:r>
-              <w:t xml:space="preserve">GCETENS843 — Projeto Algoritmo I</w:t>
+              <w:t xml:space="preserve">GCETENS843  Projeto Algoritmo I</w:t>
             </w:r>
           </w:p>
         </w:tc>
@@ -398,91 +373,14 @@
                 <w:b/>
                 <w:bCs/>
               </w:rPr>
-              <w:t xml:space="preserve">4 dias ⏳</w:t>
+              <w:t xml:space="preserve">4 dias </w:t>
             </w:r>
           </w:p>
         </w:tc>
       </w:tr>
     </w:tbl>
-    <w:p>
-      <w:pPr>
-        <w:pStyle w:val="BlockText"/>
-      </w:pPr>
-      <w:r>
-        <w:t xml:space="preserve">📄</w:t>
-      </w:r>
-      <w:r>
-        <w:t xml:space="preserve"> </w:t>
-      </w:r>
-      <w:hyperlink r:id="rId20">
-        <w:r>
-          <w:rPr>
-            <w:rStyle w:val="Hyperlink"/>
-          </w:rPr>
-          <w:t xml:space="preserve">Tema completo</w:t>
-        </w:r>
-      </w:hyperlink>
-      <w:r>
-        <w:t xml:space="preserve"> </w:t>
-      </w:r>
-      <w:r>
-        <w:t xml:space="preserve">·</w:t>
-      </w:r>
-      <w:r>
-        <w:t xml:space="preserve"> </w:t>
-      </w:r>
-      <w:hyperlink r:id="rId21">
-        <w:r>
-          <w:rPr>
-            <w:rStyle w:val="Hyperlink"/>
-          </w:rPr>
-          <w:t xml:space="preserve">Divisão de tarefas</w:t>
-        </w:r>
-      </w:hyperlink>
-      <w:r>
-        <w:t xml:space="preserve"> </w:t>
-      </w:r>
-      <w:r>
-        <w:t xml:space="preserve">·</w:t>
-      </w:r>
-      <w:r>
-        <w:t xml:space="preserve"> </w:t>
-      </w:r>
-      <w:hyperlink r:id="rId22">
-        <w:r>
-          <w:rPr>
-            <w:rStyle w:val="Hyperlink"/>
-          </w:rPr>
-          <w:t xml:space="preserve">Decisões do projeto</w:t>
-        </w:r>
-      </w:hyperlink>
-      <w:r>
-        <w:t xml:space="preserve"> </w:t>
-      </w:r>
-      <w:r>
-        <w:t xml:space="preserve">·</w:t>
-      </w:r>
-      <w:r>
-        <w:t xml:space="preserve"> </w:t>
-      </w:r>
-      <w:hyperlink r:id="rId23">
-        <w:r>
-          <w:rPr>
-            <w:rStyle w:val="Hyperlink"/>
-          </w:rPr>
-          <w:t xml:space="preserve">Protótipo ao vivo</w:t>
-        </w:r>
-      </w:hyperlink>
-    </w:p>
-    <w:p>
-      <w:r>
-        <w:pict>
-          <v:rect style="width:0;height:1.5pt" o:hralign="center" o:hrstd="t" o:hr="t"/>
-        </w:pict>
-      </w:r>
-    </w:p>
-    <w:bookmarkEnd w:id="24"/>
-    <w:bookmarkStart w:id="25" w:name="integrantes-e-tarefas"/>
+    <w:bookmarkEnd w:id="23"/>
+    <w:bookmarkStart w:id="24" w:name="integrantes-e-tarefas"/>
     <w:p>
       <w:pPr>
         <w:pStyle w:val="Heading2"/>
@@ -565,9 +463,6 @@
               <w:pStyle w:val="Compact"/>
               <w:jc w:val="center"/>
             </w:pPr>
-            <w:r>
-              <w:t xml:space="preserve">🧠</w:t>
-            </w:r>
           </w:p>
         </w:tc>
         <w:tc>
@@ -606,22 +501,19 @@
               <w:jc w:val="center"/>
             </w:pPr>
             <w:r>
-              <w:t xml:space="preserve">✅ Ativo</w:t>
-            </w:r>
-          </w:p>
-        </w:tc>
-      </w:tr>
-      <w:tr>
-        <w:tc>
-          <w:tcPr/>
-          <w:p>
-            <w:pPr>
-              <w:pStyle w:val="Compact"/>
-              <w:jc w:val="center"/>
-            </w:pPr>
-            <w:r>
-              <w:t xml:space="preserve">🏥</w:t>
-            </w:r>
+              <w:t xml:space="preserve"> Ativo</w:t>
+            </w:r>
+          </w:p>
+        </w:tc>
+      </w:tr>
+      <w:tr>
+        <w:tc>
+          <w:tcPr/>
+          <w:p>
+            <w:pPr>
+              <w:pStyle w:val="Compact"/>
+              <w:jc w:val="center"/>
+            </w:pPr>
           </w:p>
         </w:tc>
         <w:tc>
@@ -660,22 +552,19 @@
               <w:jc w:val="center"/>
             </w:pPr>
             <w:r>
-              <w:t xml:space="preserve">✅ Ativo</w:t>
-            </w:r>
-          </w:p>
-        </w:tc>
-      </w:tr>
-      <w:tr>
-        <w:tc>
-          <w:tcPr/>
-          <w:p>
-            <w:pPr>
-              <w:pStyle w:val="Compact"/>
-              <w:jc w:val="center"/>
-            </w:pPr>
-            <w:r>
-              <w:t xml:space="preserve">♿</w:t>
-            </w:r>
+              <w:t xml:space="preserve"> Ativo</w:t>
+            </w:r>
+          </w:p>
+        </w:tc>
+      </w:tr>
+      <w:tr>
+        <w:tc>
+          <w:tcPr/>
+          <w:p>
+            <w:pPr>
+              <w:pStyle w:val="Compact"/>
+              <w:jc w:val="center"/>
+            </w:pPr>
           </w:p>
         </w:tc>
         <w:tc>
@@ -714,22 +603,19 @@
               <w:jc w:val="center"/>
             </w:pPr>
             <w:r>
-              <w:t xml:space="preserve">✅ Ativo</w:t>
-            </w:r>
-          </w:p>
-        </w:tc>
-      </w:tr>
-      <w:tr>
-        <w:tc>
-          <w:tcPr/>
-          <w:p>
-            <w:pPr>
-              <w:pStyle w:val="Compact"/>
-              <w:jc w:val="center"/>
-            </w:pPr>
-            <w:r>
-              <w:t xml:space="preserve">📚</w:t>
-            </w:r>
+              <w:t xml:space="preserve"> Ativo</w:t>
+            </w:r>
+          </w:p>
+        </w:tc>
+      </w:tr>
+      <w:tr>
+        <w:tc>
+          <w:tcPr/>
+          <w:p>
+            <w:pPr>
+              <w:pStyle w:val="Compact"/>
+              <w:jc w:val="center"/>
+            </w:pPr>
           </w:p>
         </w:tc>
         <w:tc>
@@ -768,22 +654,19 @@
               <w:jc w:val="center"/>
             </w:pPr>
             <w:r>
-              <w:t xml:space="preserve">✅ Ativo</w:t>
-            </w:r>
-          </w:p>
-        </w:tc>
-      </w:tr>
-      <w:tr>
-        <w:tc>
-          <w:tcPr/>
-          <w:p>
-            <w:pPr>
-              <w:pStyle w:val="Compact"/>
-              <w:jc w:val="center"/>
-            </w:pPr>
-            <w:r>
-              <w:t xml:space="preserve">📊</w:t>
-            </w:r>
+              <w:t xml:space="preserve"> Ativo</w:t>
+            </w:r>
+          </w:p>
+        </w:tc>
+      </w:tr>
+      <w:tr>
+        <w:tc>
+          <w:tcPr/>
+          <w:p>
+            <w:pPr>
+              <w:pStyle w:val="Compact"/>
+              <w:jc w:val="center"/>
+            </w:pPr>
           </w:p>
         </w:tc>
         <w:tc>
@@ -822,22 +705,19 @@
               <w:jc w:val="center"/>
             </w:pPr>
             <w:r>
-              <w:t xml:space="preserve">✅ Ativo</w:t>
-            </w:r>
-          </w:p>
-        </w:tc>
-      </w:tr>
-      <w:tr>
-        <w:tc>
-          <w:tcPr/>
-          <w:p>
-            <w:pPr>
-              <w:pStyle w:val="Compact"/>
-              <w:jc w:val="center"/>
-            </w:pPr>
-            <w:r>
-              <w:t xml:space="preserve">🆕</w:t>
-            </w:r>
+              <w:t xml:space="preserve"> Ativo</w:t>
+            </w:r>
+          </w:p>
+        </w:tc>
+      </w:tr>
+      <w:tr>
+        <w:tc>
+          <w:tcPr/>
+          <w:p>
+            <w:pPr>
+              <w:pStyle w:val="Compact"/>
+              <w:jc w:val="center"/>
+            </w:pPr>
           </w:p>
         </w:tc>
         <w:tc>
@@ -876,22 +756,19 @@
               <w:jc w:val="center"/>
             </w:pPr>
             <w:r>
-              <w:t xml:space="preserve">✅ Ativo</w:t>
-            </w:r>
-          </w:p>
-        </w:tc>
-      </w:tr>
-      <w:tr>
-        <w:tc>
-          <w:tcPr/>
-          <w:p>
-            <w:pPr>
-              <w:pStyle w:val="Compact"/>
-              <w:jc w:val="center"/>
-            </w:pPr>
-            <w:r>
-              <w:t xml:space="preserve">🎤</w:t>
-            </w:r>
+              <w:t xml:space="preserve"> Ativo</w:t>
+            </w:r>
+          </w:p>
+        </w:tc>
+      </w:tr>
+      <w:tr>
+        <w:tc>
+          <w:tcPr/>
+          <w:p>
+            <w:pPr>
+              <w:pStyle w:val="Compact"/>
+              <w:jc w:val="center"/>
+            </w:pPr>
           </w:p>
         </w:tc>
         <w:tc>
@@ -936,22 +813,19 @@
               <w:jc w:val="center"/>
             </w:pPr>
             <w:r>
-              <w:t xml:space="preserve">✅ Ativo</w:t>
-            </w:r>
-          </w:p>
-        </w:tc>
-      </w:tr>
-      <w:tr>
-        <w:tc>
-          <w:tcPr/>
-          <w:p>
-            <w:pPr>
-              <w:pStyle w:val="Compact"/>
-              <w:jc w:val="center"/>
-            </w:pPr>
-            <w:r>
-              <w:t xml:space="preserve">👤</w:t>
-            </w:r>
+              <w:t xml:space="preserve"> Ativo</w:t>
+            </w:r>
+          </w:p>
+        </w:tc>
+      </w:tr>
+      <w:tr>
+        <w:tc>
+          <w:tcPr/>
+          <w:p>
+            <w:pPr>
+              <w:pStyle w:val="Compact"/>
+              <w:jc w:val="center"/>
+            </w:pPr>
           </w:p>
         </w:tc>
         <w:tc>
@@ -990,40 +864,14 @@
               <w:jc w:val="center"/>
             </w:pPr>
             <w:r>
-              <w:t xml:space="preserve">⏳ Pendente</w:t>
+              <w:t xml:space="preserve"> Pendente</w:t>
             </w:r>
           </w:p>
         </w:tc>
       </w:tr>
     </w:tbl>
-    <w:p>
-      <w:pPr>
-        <w:pStyle w:val="BlockText"/>
-      </w:pPr>
-      <w:r>
-        <w:t xml:space="preserve">📋</w:t>
-      </w:r>
-      <w:r>
-        <w:t xml:space="preserve"> </w:t>
-      </w:r>
-      <w:hyperlink r:id="rId21">
-        <w:r>
-          <w:rPr>
-            <w:rStyle w:val="Hyperlink"/>
-          </w:rPr>
-          <w:t xml:space="preserve">Divisão de tarefas completa com justificativas</w:t>
-        </w:r>
-      </w:hyperlink>
-    </w:p>
-    <w:p>
-      <w:r>
-        <w:pict>
-          <v:rect style="width:0;height:1.5pt" o:hralign="center" o:hrstd="t" o:hr="t"/>
-        </w:pict>
-      </w:r>
-    </w:p>
-    <w:bookmarkEnd w:id="25"/>
-    <w:bookmarkStart w:id="26" w:name="o-que-o-professor-pediu"/>
+    <w:bookmarkEnd w:id="24"/>
+    <w:bookmarkStart w:id="25" w:name="o-que-o-professor-pediu"/>
     <w:p>
       <w:pPr>
         <w:pStyle w:val="Heading2"/>
@@ -1105,20 +953,17 @@
               <w:jc w:val="center"/>
             </w:pPr>
             <w:r>
-              <w:t xml:space="preserve">✅ Sim</w:t>
-            </w:r>
-          </w:p>
-        </w:tc>
-        <w:tc>
-          <w:tcPr/>
-          <w:p>
-            <w:pPr>
-              <w:pStyle w:val="Compact"/>
-              <w:jc w:val="center"/>
-            </w:pPr>
-            <w:r>
-              <w:t xml:space="preserve">✅</w:t>
-            </w:r>
+              <w:t xml:space="preserve"> Sim</w:t>
+            </w:r>
+          </w:p>
+        </w:tc>
+        <w:tc>
+          <w:tcPr/>
+          <w:p>
+            <w:pPr>
+              <w:pStyle w:val="Compact"/>
+              <w:jc w:val="center"/>
+            </w:pPr>
             <w:r>
               <w:t xml:space="preserve"> </w:t>
             </w:r>
@@ -1153,19 +998,19 @@
               <w:jc w:val="center"/>
             </w:pPr>
             <w:r>
-              <w:t xml:space="preserve">✅ Sim</w:t>
-            </w:r>
-          </w:p>
-        </w:tc>
-        <w:tc>
-          <w:tcPr/>
-          <w:p>
-            <w:pPr>
-              <w:pStyle w:val="Compact"/>
-              <w:jc w:val="center"/>
-            </w:pPr>
-            <w:r>
-              <w:t xml:space="preserve">🔄 Em andamento</w:t>
+              <w:t xml:space="preserve"> Sim</w:t>
+            </w:r>
+          </w:p>
+        </w:tc>
+        <w:tc>
+          <w:tcPr/>
+          <w:p>
+            <w:pPr>
+              <w:pStyle w:val="Compact"/>
+              <w:jc w:val="center"/>
+            </w:pPr>
+            <w:r>
+              <w:t xml:space="preserve"> Em andamento</w:t>
             </w:r>
           </w:p>
         </w:tc>
@@ -1191,19 +1036,19 @@
               <w:jc w:val="center"/>
             </w:pPr>
             <w:r>
-              <w:t xml:space="preserve">✅ Sim</w:t>
-            </w:r>
-          </w:p>
-        </w:tc>
-        <w:tc>
-          <w:tcPr/>
-          <w:p>
-            <w:pPr>
-              <w:pStyle w:val="Compact"/>
-              <w:jc w:val="center"/>
-            </w:pPr>
-            <w:r>
-              <w:t xml:space="preserve">🔄 Em andamento</w:t>
+              <w:t xml:space="preserve"> Sim</w:t>
+            </w:r>
+          </w:p>
+        </w:tc>
+        <w:tc>
+          <w:tcPr/>
+          <w:p>
+            <w:pPr>
+              <w:pStyle w:val="Compact"/>
+              <w:jc w:val="center"/>
+            </w:pPr>
+            <w:r>
+              <w:t xml:space="preserve"> Em andamento</w:t>
             </w:r>
           </w:p>
         </w:tc>
@@ -1229,20 +1074,17 @@
               <w:jc w:val="center"/>
             </w:pPr>
             <w:r>
-              <w:t xml:space="preserve">✅ Sim</w:t>
-            </w:r>
-          </w:p>
-        </w:tc>
-        <w:tc>
-          <w:tcPr/>
-          <w:p>
-            <w:pPr>
-              <w:pStyle w:val="Compact"/>
-              <w:jc w:val="center"/>
-            </w:pPr>
-            <w:r>
-              <w:t xml:space="preserve">✅</w:t>
-            </w:r>
+              <w:t xml:space="preserve"> Sim</w:t>
+            </w:r>
+          </w:p>
+        </w:tc>
+        <w:tc>
+          <w:tcPr/>
+          <w:p>
+            <w:pPr>
+              <w:pStyle w:val="Compact"/>
+              <w:jc w:val="center"/>
+            </w:pPr>
             <w:r>
               <w:t xml:space="preserve"> </w:t>
             </w:r>
@@ -1277,19 +1119,19 @@
               <w:jc w:val="center"/>
             </w:pPr>
             <w:r>
-              <w:t xml:space="preserve">✅ Sim</w:t>
-            </w:r>
-          </w:p>
-        </w:tc>
-        <w:tc>
-          <w:tcPr/>
-          <w:p>
-            <w:pPr>
-              <w:pStyle w:val="Compact"/>
-              <w:jc w:val="center"/>
-            </w:pPr>
-            <w:r>
-              <w:t xml:space="preserve">🔄 Em andamento</w:t>
+              <w:t xml:space="preserve"> Sim</w:t>
+            </w:r>
+          </w:p>
+        </w:tc>
+        <w:tc>
+          <w:tcPr/>
+          <w:p>
+            <w:pPr>
+              <w:pStyle w:val="Compact"/>
+              <w:jc w:val="center"/>
+            </w:pPr>
+            <w:r>
+              <w:t xml:space="preserve"> Em andamento</w:t>
             </w:r>
           </w:p>
         </w:tc>
@@ -1315,7 +1157,7 @@
               <w:jc w:val="center"/>
             </w:pPr>
             <w:r>
-              <w:t xml:space="preserve">✅ Sim</w:t>
+              <w:t xml:space="preserve"> Sim</w:t>
             </w:r>
           </w:p>
         </w:tc>
@@ -1357,9 +1199,6 @@
               <w:jc w:val="center"/>
             </w:pPr>
             <w:r>
-              <w:t xml:space="preserve">❌</w:t>
-            </w:r>
-            <w:r>
               <w:t xml:space="preserve"> </w:t>
             </w:r>
             <w:r>
@@ -1385,30 +1224,23 @@
         </w:tc>
       </w:tr>
     </w:tbl>
+    <w:bookmarkEnd w:id="25"/>
+    <w:bookmarkStart w:id="40" w:name="roadmap-status-geral-25062026"/>
     <w:p>
-      <w:r>
-        <w:pict>
-          <v:rect style="width:0;height:1.5pt" o:hralign="center" o:hrstd="t" o:hr="t"/>
-        </w:pict>
+      <w:pPr>
+        <w:pStyle w:val="Heading2"/>
+      </w:pPr>
+      <w:r>
+        <w:t xml:space="preserve">4. Roadmap  Status Geral (25/06/2026)</w:t>
       </w:r>
     </w:p>
-    <w:bookmarkEnd w:id="26"/>
-    <w:bookmarkStart w:id="37" w:name="roadmap-status-geral-25062026"/>
+    <w:bookmarkStart w:id="35" w:name="pronto"/>
     <w:p>
       <w:pPr>
-        <w:pStyle w:val="Heading2"/>
-      </w:pPr>
-      <w:r>
-        <w:t xml:space="preserve">4. Roadmap — Status Geral (25/06/2026)</w:t>
-      </w:r>
-    </w:p>
-    <w:bookmarkStart w:id="32" w:name="pronto"/>
-    <w:p>
-      <w:pPr>
         <w:pStyle w:val="Heading3"/>
       </w:pPr>
       <w:r>
-        <w:t xml:space="preserve">✅ Pronto</w:t>
+        <w:t xml:space="preserve"> Pronto</w:t>
       </w:r>
     </w:p>
     <w:tbl>
@@ -1484,7 +1316,7 @@
               <w:pStyle w:val="Compact"/>
               <w:jc w:val="left"/>
             </w:pPr>
-            <w:hyperlink r:id="rId20">
+            <w:hyperlink r:id="rId26">
               <w:r>
                 <w:rPr>
                   <w:rStyle w:val="VerbatimChar"/>
@@ -1527,7 +1359,7 @@
               <w:pStyle w:val="Compact"/>
               <w:jc w:val="left"/>
             </w:pPr>
-            <w:hyperlink r:id="rId21">
+            <w:hyperlink r:id="rId27">
               <w:r>
                 <w:rPr>
                   <w:rStyle w:val="VerbatimChar"/>
@@ -1570,7 +1402,7 @@
               <w:pStyle w:val="Compact"/>
               <w:jc w:val="left"/>
             </w:pPr>
-            <w:hyperlink r:id="rId22">
+            <w:hyperlink r:id="rId28">
               <w:r>
                 <w:rPr>
                   <w:rStyle w:val="VerbatimChar"/>
@@ -1661,7 +1493,7 @@
               <w:pStyle w:val="Compact"/>
               <w:jc w:val="left"/>
             </w:pPr>
-            <w:hyperlink r:id="rId27">
+            <w:hyperlink r:id="rId29">
               <w:r>
                 <w:rPr>
                   <w:rStyle w:val="VerbatimChar"/>
@@ -1710,7 +1542,7 @@
               <w:pStyle w:val="Compact"/>
               <w:jc w:val="left"/>
             </w:pPr>
-            <w:hyperlink r:id="rId28">
+            <w:hyperlink r:id="rId30">
               <w:r>
                 <w:rPr>
                   <w:rStyle w:val="VerbatimChar"/>
@@ -1753,7 +1585,7 @@
               <w:pStyle w:val="Compact"/>
               <w:jc w:val="left"/>
             </w:pPr>
-            <w:hyperlink r:id="rId29">
+            <w:hyperlink r:id="rId31">
               <w:r>
                 <w:rPr>
                   <w:rStyle w:val="VerbatimChar"/>
@@ -1770,7 +1602,7 @@
             <w:r>
               <w:t xml:space="preserve"> </w:t>
             </w:r>
-            <w:hyperlink r:id="rId30">
+            <w:hyperlink r:id="rId32">
               <w:r>
                 <w:rPr>
                   <w:rStyle w:val="VerbatimChar"/>
@@ -1813,7 +1645,7 @@
               <w:pStyle w:val="Compact"/>
               <w:jc w:val="left"/>
             </w:pPr>
-            <w:hyperlink r:id="rId23">
+            <w:hyperlink r:id="rId33">
               <w:r>
                 <w:rPr>
                   <w:rStyle w:val="VerbatimChar"/>
@@ -1830,7 +1662,7 @@
             <w:r>
               <w:t xml:space="preserve"> </w:t>
             </w:r>
-            <w:hyperlink r:id="rId31">
+            <w:hyperlink r:id="rId34">
               <w:r>
                 <w:rPr>
                   <w:rStyle w:val="Hyperlink"/>
@@ -1854,14 +1686,14 @@
         </w:tc>
       </w:tr>
     </w:tbl>
-    <w:bookmarkEnd w:id="32"/>
-    <w:bookmarkStart w:id="35" w:name="em-andamento"/>
+    <w:bookmarkEnd w:id="35"/>
+    <w:bookmarkStart w:id="38" w:name="em-andamento"/>
     <w:p>
       <w:pPr>
         <w:pStyle w:val="Heading3"/>
       </w:pPr>
       <w:r>
-        <w:t xml:space="preserve">🔄 Em andamento</w:t>
+        <w:t xml:space="preserve"> Em andamento</w:t>
       </w:r>
     </w:p>
     <w:tbl>
@@ -1949,7 +1781,7 @@
               <w:pStyle w:val="Compact"/>
               <w:jc w:val="left"/>
             </w:pPr>
-            <w:hyperlink r:id="rId33">
+            <w:hyperlink r:id="rId36">
               <w:r>
                 <w:rPr>
                   <w:rStyle w:val="Hyperlink"/>
@@ -1992,7 +1824,7 @@
               <w:pStyle w:val="Compact"/>
               <w:jc w:val="left"/>
             </w:pPr>
-            <w:hyperlink r:id="rId34">
+            <w:hyperlink r:id="rId37">
               <w:r>
                 <w:rPr>
                   <w:rStyle w:val="VerbatimChar"/>
@@ -2004,14 +1836,14 @@
         </w:tc>
       </w:tr>
     </w:tbl>
-    <w:bookmarkEnd w:id="35"/>
-    <w:bookmarkStart w:id="36" w:name="pendente-prazo-28-2906"/>
+    <w:bookmarkEnd w:id="38"/>
+    <w:bookmarkStart w:id="39" w:name="pendente-prazo-28-2906"/>
     <w:p>
       <w:pPr>
         <w:pStyle w:val="Heading3"/>
       </w:pPr>
       <w:r>
-        <w:t xml:space="preserve">🔒 Pendente (prazo: 28-29/06)</w:t>
+        <w:t xml:space="preserve"> Pendente (prazo: 28-29/06)</w:t>
       </w:r>
     </w:p>
     <w:tbl>
@@ -2181,59 +2013,18 @@
         </w:tc>
       </w:tr>
     </w:tbl>
+    <w:bookmarkEnd w:id="39"/>
+    <w:bookmarkEnd w:id="40"/>
+    <w:bookmarkStart w:id="43" w:name="prioridade-materiais-acadêmicos-finais"/>
     <w:p>
-      <w:r>
-        <w:pict>
-          <v:rect style="width:0;height:1.5pt" o:hralign="center" o:hrstd="t" o:hr="t"/>
-        </w:pict>
+      <w:pPr>
+        <w:pStyle w:val="Heading2"/>
+      </w:pPr>
+      <w:r>
+        <w:t xml:space="preserve">5.  PRIORIDADE: Materiais Acadêmicos Finais</w:t>
       </w:r>
     </w:p>
-    <w:bookmarkEnd w:id="36"/>
-    <w:bookmarkEnd w:id="37"/>
-    <w:bookmarkStart w:id="41" w:name="prioridade-materiais-acadêmicos-finais"/>
-    <w:p>
-      <w:pPr>
-        <w:pStyle w:val="Heading2"/>
-      </w:pPr>
-      <w:r>
-        <w:t xml:space="preserve">5. ⚡ PRIORIDADE: Materiais Acadêmicos Finais</w:t>
-      </w:r>
-    </w:p>
-    <w:p>
-      <w:pPr>
-        <w:pStyle w:val="BlockText"/>
-      </w:pPr>
-      <w:r>
-        <w:rPr>
-          <w:b/>
-          <w:bCs/>
-        </w:rPr>
-        <w:t xml:space="preserve">Faltam 4 dias para a apresentação.</w:t>
-      </w:r>
-      <w:r>
-        <w:t xml:space="preserve"> </w:t>
-      </w:r>
-      <w:r>
-        <w:t xml:space="preserve">Precisamos dos materiais nos</w:t>
-      </w:r>
-      <w:r>
-        <w:t xml:space="preserve"> </w:t>
-      </w:r>
-      <w:r>
-        <w:rPr>
-          <w:b/>
-          <w:bCs/>
-        </w:rPr>
-        <w:t xml:space="preserve">formatos corretos</w:t>
-      </w:r>
-      <w:r>
-        <w:t xml:space="preserve"> </w:t>
-      </w:r>
-      <w:r>
-        <w:t xml:space="preserve">para submissão e apresentação.</w:t>
-      </w:r>
-    </w:p>
-    <w:bookmarkStart w:id="38" w:name="pipeline-de-geração"/>
+    <w:bookmarkStart w:id="41" w:name="pipeline-de-geração"/>
     <w:p>
       <w:pPr>
         <w:pStyle w:val="Heading3"/>
@@ -2392,7 +2183,7 @@
               <w:jc w:val="center"/>
             </w:pPr>
             <w:r>
-              <w:t xml:space="preserve">⏳ Converter</w:t>
+              <w:t xml:space="preserve"> Converter</w:t>
             </w:r>
           </w:p>
         </w:tc>
@@ -2458,7 +2249,7 @@
               <w:jc w:val="center"/>
             </w:pPr>
             <w:r>
-              <w:t xml:space="preserve">⏳ Aguardando conteúdo</w:t>
+              <w:t xml:space="preserve"> Aguardando conteúdo</w:t>
             </w:r>
           </w:p>
         </w:tc>
@@ -2524,7 +2315,7 @@
               <w:jc w:val="center"/>
             </w:pPr>
             <w:r>
-              <w:t xml:space="preserve">⏳ Finalizar + converter</w:t>
+              <w:t xml:space="preserve"> Finalizar + converter</w:t>
             </w:r>
           </w:p>
         </w:tc>
@@ -2629,7 +2420,7 @@
               <w:jc w:val="center"/>
             </w:pPr>
             <w:r>
-              <w:t xml:space="preserve">🔄 Fazer</w:t>
+              <w:t xml:space="preserve"> Fazer</w:t>
             </w:r>
             <w:r>
               <w:t xml:space="preserve"> </w:t>
@@ -2707,7 +2498,7 @@
               <w:jc w:val="center"/>
             </w:pPr>
             <w:r>
-              <w:t xml:space="preserve">⏳ Aguardando Figma</w:t>
+              <w:t xml:space="preserve"> Aguardando Figma</w:t>
             </w:r>
           </w:p>
         </w:tc>
@@ -2773,7 +2564,7 @@
               <w:jc w:val="center"/>
             </w:pPr>
             <w:r>
-              <w:t xml:space="preserve">⏳ Criar</w:t>
+              <w:t xml:space="preserve"> Criar</w:t>
             </w:r>
           </w:p>
         </w:tc>
@@ -2839,7 +2630,7 @@
               <w:jc w:val="center"/>
             </w:pPr>
             <w:r>
-              <w:t xml:space="preserve">⏳ Criar</w:t>
+              <w:t xml:space="preserve"> Criar</w:t>
             </w:r>
           </w:p>
         </w:tc>
@@ -2935,14 +2726,14 @@
               <w:jc w:val="center"/>
             </w:pPr>
             <w:r>
-              <w:t xml:space="preserve">⏳ Consolidar</w:t>
+              <w:t xml:space="preserve"> Consolidar</w:t>
             </w:r>
           </w:p>
         </w:tc>
       </w:tr>
     </w:tbl>
-    <w:bookmarkEnd w:id="38"/>
-    <w:bookmarkStart w:id="40" w:name="scripts-de-automação-disponíveis"/>
+    <w:bookmarkEnd w:id="41"/>
+    <w:bookmarkStart w:id="42" w:name="scripts-de-automação-disponíveis"/>
     <w:p>
       <w:pPr>
         <w:pStyle w:val="Heading3"/>
@@ -3115,56 +2906,24 @@
         <w:t xml:space="preserve"> scripts/gerar-slides.py</w:t>
       </w:r>
     </w:p>
+    <w:bookmarkEnd w:id="42"/>
+    <w:bookmarkEnd w:id="43"/>
+    <w:bookmarkStart w:id="50" w:name="status-atual-25062026"/>
     <w:p>
       <w:pPr>
-        <w:pStyle w:val="BlockText"/>
-      </w:pPr>
-      <w:r>
-        <w:t xml:space="preserve">📁 Modelos e templates em</w:t>
-      </w:r>
-      <w:r>
-        <w:t xml:space="preserve"> </w:t>
-      </w:r>
-      <w:hyperlink r:id="rId39">
-        <w:r>
-          <w:rPr>
-            <w:rStyle w:val="VerbatimChar"/>
-          </w:rPr>
-          <w:t xml:space="preserve">templates/</w:t>
-        </w:r>
-      </w:hyperlink>
-      <w:r>
-        <w:t xml:space="preserve"> </w:t>
-      </w:r>
-      <w:r>
-        <w:t xml:space="preserve">(ABNT, CSS, logo UFRB)</w:t>
+        <w:pStyle w:val="Heading2"/>
+      </w:pPr>
+      <w:r>
+        <w:t xml:space="preserve">6. Status Atual (25/06/2026)</w:t>
       </w:r>
     </w:p>
+    <w:bookmarkStart w:id="45" w:name="enquete-de-nomes-encerrada"/>
     <w:p>
-      <w:r>
-        <w:pict>
-          <v:rect style="width:0;height:1.5pt" o:hralign="center" o:hrstd="t" o:hr="t"/>
-        </w:pict>
-      </w:r>
-    </w:p>
-    <w:bookmarkEnd w:id="40"/>
-    <w:bookmarkEnd w:id="41"/>
-    <w:bookmarkStart w:id="48" w:name="status-atual-25062026"/>
-    <w:p>
-      <w:pPr>
-        <w:pStyle w:val="Heading2"/>
-      </w:pPr>
-      <w:r>
-        <w:t xml:space="preserve">6. Status Atual (25/06/2026)</w:t>
-      </w:r>
-    </w:p>
-    <w:bookmarkStart w:id="43" w:name="enquete-de-nomes-encerrada"/>
-    <w:p>
       <w:pPr>
         <w:pStyle w:val="Heading3"/>
       </w:pPr>
       <w:r>
-        <w:t xml:space="preserve">✅ Enquete de nomes — ENCERRADA</w:t>
+        <w:t xml:space="preserve"> Enquete de nomes  ENCERRADA</w:t>
       </w:r>
     </w:p>
     <w:p>
@@ -3185,7 +2944,7 @@
         <w:t xml:space="preserve">FilaClara</w:t>
       </w:r>
       <w:r>
-        <w:t xml:space="preserve">! 🎉</w:t>
+        <w:t xml:space="preserve">! </w:t>
       </w:r>
       <w:r>
         <w:t xml:space="preserve"> </w:t>
@@ -3196,7 +2955,7 @@
       <w:r>
         <w:t xml:space="preserve"> </w:t>
       </w:r>
-      <w:hyperlink r:id="rId42">
+      <w:hyperlink r:id="rId44">
         <w:r>
           <w:rPr>
             <w:rStyle w:val="Hyperlink"/>
@@ -3208,7 +2967,7 @@
         <w:t xml:space="preserve"> </w:t>
       </w:r>
       <w:r>
-        <w:t xml:space="preserve">- Sugestões: FilaAcessível (Deivison), Sistema Inteligente de Gestão de Filas… (Rios), Minha Fila (Marcos)</w:t>
+        <w:t xml:space="preserve">- Sugestões: FilaAcessível (Deivison), Sistema Inteligente de Gestão de Filas (Rios), Minha Fila (Marcos)</w:t>
       </w:r>
       <w:r>
         <w:t xml:space="preserve"> </w:t>
@@ -3233,14 +2992,14 @@
         <w:t xml:space="preserve">(já em uso no protótipo)</w:t>
       </w:r>
     </w:p>
-    <w:bookmarkEnd w:id="43"/>
-    <w:bookmarkStart w:id="44" w:name="fluxograma-finalizado"/>
+    <w:bookmarkEnd w:id="45"/>
+    <w:bookmarkStart w:id="46" w:name="fluxograma-finalizado"/>
     <w:p>
       <w:pPr>
         <w:pStyle w:val="Heading3"/>
       </w:pPr>
       <w:r>
-        <w:t xml:space="preserve">✅ Fluxograma finalizado</w:t>
+        <w:t xml:space="preserve"> Fluxograma finalizado</w:t>
       </w:r>
     </w:p>
     <w:p>
@@ -3253,7 +3012,7 @@
       <w:r>
         <w:t xml:space="preserve"> </w:t>
       </w:r>
-      <w:hyperlink r:id="rId29">
+      <w:hyperlink r:id="rId31">
         <w:r>
           <w:rPr>
             <w:rStyle w:val="VerbatimChar"/>
@@ -3268,14 +3027,14 @@
         <w:t xml:space="preserve">com base no JPEG original.</w:t>
       </w:r>
     </w:p>
-    <w:bookmarkEnd w:id="44"/>
-    <w:bookmarkStart w:id="45" w:name="uélinton-confirmado"/>
+    <w:bookmarkEnd w:id="46"/>
+    <w:bookmarkStart w:id="47" w:name="uélinton-confirmado"/>
     <w:p>
       <w:pPr>
         <w:pStyle w:val="Heading3"/>
       </w:pPr>
       <w:r>
-        <w:t xml:space="preserve">✅ Uélinton confirmado</w:t>
+        <w:t xml:space="preserve"> Uélinton confirmado</w:t>
       </w:r>
     </w:p>
     <w:p>
@@ -3296,14 +3055,14 @@
         <w:t xml:space="preserve">Uélinton Cardoso Santana</w:t>
       </w:r>
     </w:p>
-    <w:bookmarkEnd w:id="45"/>
-    <w:bookmarkStart w:id="46" w:name="histórico-do-whatsapp"/>
+    <w:bookmarkEnd w:id="47"/>
+    <w:bookmarkStart w:id="48" w:name="histórico-do-whatsapp"/>
     <w:p>
       <w:pPr>
         <w:pStyle w:val="Heading3"/>
       </w:pPr>
       <w:r>
-        <w:t xml:space="preserve">✅ Histórico do WhatsApp</w:t>
+        <w:t xml:space="preserve"> Histórico do WhatsApp</w:t>
       </w:r>
     </w:p>
     <w:p>
@@ -3316,7 +3075,7 @@
       <w:r>
         <w:t xml:space="preserve"> </w:t>
       </w:r>
-      <w:hyperlink r:id="rId27">
+      <w:hyperlink r:id="rId29">
         <w:r>
           <w:rPr>
             <w:rStyle w:val="VerbatimChar"/>
@@ -3325,14 +3084,14 @@
         </w:r>
       </w:hyperlink>
     </w:p>
-    <w:bookmarkEnd w:id="46"/>
-    <w:bookmarkStart w:id="47" w:name="github-pages-ativo"/>
+    <w:bookmarkEnd w:id="48"/>
+    <w:bookmarkStart w:id="49" w:name="github-pages-ativo"/>
     <w:p>
       <w:pPr>
         <w:pStyle w:val="Heading3"/>
       </w:pPr>
       <w:r>
-        <w:t xml:space="preserve">✅ GitHub Pages ativo</w:t>
+        <w:t xml:space="preserve"> GitHub Pages ativo</w:t>
       </w:r>
     </w:p>
     <w:p>
@@ -3340,19 +3099,12 @@
         <w:pStyle w:val="FirstParagraph"/>
       </w:pPr>
       <w:r>
-        <w:t xml:space="preserve">🌐 https://deivisan.github.io/Metodologia-EAD/</w:t>
+        <w:t xml:space="preserve"> https://deivisan.github.io/Metodologia-EAD/</w:t>
       </w:r>
     </w:p>
-    <w:p>
-      <w:r>
-        <w:pict>
-          <v:rect style="width:0;height:1.5pt" o:hralign="center" o:hrstd="t" o:hr="t"/>
-        </w:pict>
-      </w:r>
-    </w:p>
-    <w:bookmarkEnd w:id="47"/>
-    <w:bookmarkEnd w:id="48"/>
-    <w:bookmarkStart w:id="49" w:name="o-que-já-está-sólido"/>
+    <w:bookmarkEnd w:id="49"/>
+    <w:bookmarkEnd w:id="50"/>
+    <w:bookmarkStart w:id="51" w:name="o-que-já-está-sólido"/>
     <w:p>
       <w:pPr>
         <w:pStyle w:val="Heading2"/>
@@ -3370,7 +3122,7 @@
         </w:numPr>
       </w:pPr>
       <w:r>
-        <w:t xml:space="preserve">✅ Tema escolhido + acessibilidade como pilar obrigatório</w:t>
+        <w:t xml:space="preserve"> Tema escolhido + acessibilidade como pilar obrigatório</w:t>
       </w:r>
     </w:p>
     <w:p>
@@ -3382,7 +3134,7 @@
         </w:numPr>
       </w:pPr>
       <w:r>
-        <w:t xml:space="preserve">✅ Problema real definido com fundamentação em literatura (Aggarwal, Chianca, Clemente, Farias, Giannotti, Ha, Jonsson, Kessel, Melo, Thompson etc.)</w:t>
+        <w:t xml:space="preserve"> Problema real definido com fundamentação em literatura (Aggarwal, Chianca, Clemente, Farias, Giannotti, Ha, Jonsson, Kessel, Melo, Thompson etc.)</w:t>
       </w:r>
     </w:p>
     <w:p>
@@ -3394,7 +3146,7 @@
         </w:numPr>
       </w:pPr>
       <w:r>
-        <w:t xml:space="preserve">✅ Pergunta central:</w:t>
+        <w:t xml:space="preserve"> Pergunta central:</w:t>
       </w:r>
       <w:r>
         <w:t xml:space="preserve"> </w:t>
@@ -3416,7 +3168,7 @@
         </w:numPr>
       </w:pPr>
       <w:r>
-        <w:t xml:space="preserve">✅ Código em C cancelado oficialmente (decisão do grupo em 12/06)</w:t>
+        <w:t xml:space="preserve"> Código em C cancelado oficialmente (decisão do grupo em 12/06)</w:t>
       </w:r>
     </w:p>
     <w:p>
@@ -3428,7 +3180,7 @@
         </w:numPr>
       </w:pPr>
       <w:r>
-        <w:t xml:space="preserve">✅ Divisão de tarefas equilibrada (8 integrantes)</w:t>
+        <w:t xml:space="preserve"> Divisão de tarefas equilibrada (8 integrantes)</w:t>
       </w:r>
     </w:p>
     <w:p>
@@ -3440,7 +3192,7 @@
         </w:numPr>
       </w:pPr>
       <w:r>
-        <w:t xml:space="preserve">✅ Esclarecimento da tutora Lorena sobre</w:t>
+        <w:t xml:space="preserve"> Esclarecimento da tutora Lorena sobre</w:t>
       </w:r>
       <w:r>
         <w:t xml:space="preserve"> </w:t>
@@ -3452,15 +3204,8 @@
         <w:t xml:space="preserve">: analisar soluções já existentes no mercado e propor melhorias</w:t>
       </w:r>
     </w:p>
-    <w:p>
-      <w:r>
-        <w:pict>
-          <v:rect style="width:0;height:1.5pt" o:hralign="center" o:hrstd="t" o:hr="t"/>
-        </w:pict>
-      </w:r>
-    </w:p>
-    <w:bookmarkEnd w:id="49"/>
-    <w:bookmarkStart w:id="53" w:name="links-rápidos"/>
+    <w:bookmarkEnd w:id="51"/>
+    <w:bookmarkStart w:id="55" w:name="links-rápidos"/>
     <w:p>
       <w:pPr>
         <w:pStyle w:val="Heading2"/>
@@ -3518,7 +3263,7 @@
               <w:jc w:val="left"/>
             </w:pPr>
             <w:r>
-              <w:t xml:space="preserve">🌐 Site do projeto (GitHub Pages)</w:t>
+              <w:t xml:space="preserve"> Site do projeto (GitHub Pages)</w:t>
             </w:r>
           </w:p>
         </w:tc>
@@ -3544,18 +3289,18 @@
               <w:jc w:val="left"/>
             </w:pPr>
             <w:r>
-              <w:t xml:space="preserve">📱 Protótipo FilaClara</w:t>
-            </w:r>
-          </w:p>
-        </w:tc>
-        <w:tc>
-          <w:tcPr/>
-          <w:p>
-            <w:pPr>
-              <w:pStyle w:val="Compact"/>
-              <w:jc w:val="left"/>
-            </w:pPr>
-            <w:hyperlink r:id="rId23">
+              <w:t xml:space="preserve"> Protótipo FilaClara</w:t>
+            </w:r>
+          </w:p>
+        </w:tc>
+        <w:tc>
+          <w:tcPr/>
+          <w:p>
+            <w:pPr>
+              <w:pStyle w:val="Compact"/>
+              <w:jc w:val="left"/>
+            </w:pPr>
+            <w:hyperlink r:id="rId33">
               <w:r>
                 <w:rPr>
                   <w:rStyle w:val="VerbatimChar"/>
@@ -3575,18 +3320,18 @@
               <w:jc w:val="left"/>
             </w:pPr>
             <w:r>
-              <w:t xml:space="preserve">🏥 Painel da clínica</w:t>
-            </w:r>
-          </w:p>
-        </w:tc>
-        <w:tc>
-          <w:tcPr/>
-          <w:p>
-            <w:pPr>
-              <w:pStyle w:val="Compact"/>
-              <w:jc w:val="left"/>
-            </w:pPr>
-            <w:hyperlink r:id="rId31">
+              <w:t xml:space="preserve"> Painel da clínica</w:t>
+            </w:r>
+          </w:p>
+        </w:tc>
+        <w:tc>
+          <w:tcPr/>
+          <w:p>
+            <w:pPr>
+              <w:pStyle w:val="Compact"/>
+              <w:jc w:val="left"/>
+            </w:pPr>
+            <w:hyperlink r:id="rId34">
               <w:r>
                 <w:rPr>
                   <w:rStyle w:val="VerbatimChar"/>
@@ -3606,18 +3351,18 @@
               <w:jc w:val="left"/>
             </w:pPr>
             <w:r>
-              <w:t xml:space="preserve">📄 Tema completo</w:t>
-            </w:r>
-          </w:p>
-        </w:tc>
-        <w:tc>
-          <w:tcPr/>
-          <w:p>
-            <w:pPr>
-              <w:pStyle w:val="Compact"/>
-              <w:jc w:val="left"/>
-            </w:pPr>
-            <w:hyperlink r:id="rId20">
+              <w:t xml:space="preserve"> Tema completo</w:t>
+            </w:r>
+          </w:p>
+        </w:tc>
+        <w:tc>
+          <w:tcPr/>
+          <w:p>
+            <w:pPr>
+              <w:pStyle w:val="Compact"/>
+              <w:jc w:val="left"/>
+            </w:pPr>
+            <w:hyperlink r:id="rId26">
               <w:r>
                 <w:rPr>
                   <w:rStyle w:val="VerbatimChar"/>
@@ -3637,18 +3382,18 @@
               <w:jc w:val="left"/>
             </w:pPr>
             <w:r>
-              <w:t xml:space="preserve">👥 Divisão de tarefas</w:t>
-            </w:r>
-          </w:p>
-        </w:tc>
-        <w:tc>
-          <w:tcPr/>
-          <w:p>
-            <w:pPr>
-              <w:pStyle w:val="Compact"/>
-              <w:jc w:val="left"/>
-            </w:pPr>
-            <w:hyperlink r:id="rId21">
+              <w:t xml:space="preserve"> Divisão de tarefas</w:t>
+            </w:r>
+          </w:p>
+        </w:tc>
+        <w:tc>
+          <w:tcPr/>
+          <w:p>
+            <w:pPr>
+              <w:pStyle w:val="Compact"/>
+              <w:jc w:val="left"/>
+            </w:pPr>
+            <w:hyperlink r:id="rId27">
               <w:r>
                 <w:rPr>
                   <w:rStyle w:val="VerbatimChar"/>
@@ -3668,18 +3413,18 @@
               <w:jc w:val="left"/>
             </w:pPr>
             <w:r>
-              <w:t xml:space="preserve">📋 Decisões do projeto</w:t>
-            </w:r>
-          </w:p>
-        </w:tc>
-        <w:tc>
-          <w:tcPr/>
-          <w:p>
-            <w:pPr>
-              <w:pStyle w:val="Compact"/>
-              <w:jc w:val="left"/>
-            </w:pPr>
-            <w:hyperlink r:id="rId22">
+              <w:t xml:space="preserve"> Decisões do projeto</w:t>
+            </w:r>
+          </w:p>
+        </w:tc>
+        <w:tc>
+          <w:tcPr/>
+          <w:p>
+            <w:pPr>
+              <w:pStyle w:val="Compact"/>
+              <w:jc w:val="left"/>
+            </w:pPr>
+            <w:hyperlink r:id="rId28">
               <w:r>
                 <w:rPr>
                   <w:rStyle w:val="VerbatimChar"/>
@@ -3699,18 +3444,18 @@
               <w:jc w:val="left"/>
             </w:pPr>
             <w:r>
-              <w:t xml:space="preserve">📊 Fluxograma</w:t>
-            </w:r>
-          </w:p>
-        </w:tc>
-        <w:tc>
-          <w:tcPr/>
-          <w:p>
-            <w:pPr>
-              <w:pStyle w:val="Compact"/>
-              <w:jc w:val="left"/>
-            </w:pPr>
-            <w:hyperlink r:id="rId29">
+              <w:t xml:space="preserve"> Fluxograma</w:t>
+            </w:r>
+          </w:p>
+        </w:tc>
+        <w:tc>
+          <w:tcPr/>
+          <w:p>
+            <w:pPr>
+              <w:pStyle w:val="Compact"/>
+              <w:jc w:val="left"/>
+            </w:pPr>
+            <w:hyperlink r:id="rId31">
               <w:r>
                 <w:rPr>
                   <w:rStyle w:val="VerbatimChar"/>
@@ -3730,18 +3475,18 @@
               <w:jc w:val="left"/>
             </w:pPr>
             <w:r>
-              <w:t xml:space="preserve">🧾 Proposta</w:t>
-            </w:r>
-          </w:p>
-        </w:tc>
-        <w:tc>
-          <w:tcPr/>
-          <w:p>
-            <w:pPr>
-              <w:pStyle w:val="Compact"/>
-              <w:jc w:val="left"/>
-            </w:pPr>
-            <w:hyperlink r:id="rId34">
+              <w:t xml:space="preserve"> Proposta</w:t>
+            </w:r>
+          </w:p>
+        </w:tc>
+        <w:tc>
+          <w:tcPr/>
+          <w:p>
+            <w:pPr>
+              <w:pStyle w:val="Compact"/>
+              <w:jc w:val="left"/>
+            </w:pPr>
+            <w:hyperlink r:id="rId37">
               <w:r>
                 <w:rPr>
                   <w:rStyle w:val="VerbatimChar"/>
@@ -3761,18 +3506,18 @@
               <w:jc w:val="left"/>
             </w:pPr>
             <w:r>
-              <w:t xml:space="preserve">🔍 Problema real (Rios)</w:t>
-            </w:r>
-          </w:p>
-        </w:tc>
-        <w:tc>
-          <w:tcPr/>
-          <w:p>
-            <w:pPr>
-              <w:pStyle w:val="Compact"/>
-              <w:jc w:val="left"/>
-            </w:pPr>
-            <w:hyperlink r:id="rId28">
+              <w:t xml:space="preserve"> Problema real (Rios)</w:t>
+            </w:r>
+          </w:p>
+        </w:tc>
+        <w:tc>
+          <w:tcPr/>
+          <w:p>
+            <w:pPr>
+              <w:pStyle w:val="Compact"/>
+              <w:jc w:val="left"/>
+            </w:pPr>
+            <w:hyperlink r:id="rId30">
               <w:r>
                 <w:rPr>
                   <w:rStyle w:val="VerbatimChar"/>
@@ -3792,18 +3537,18 @@
               <w:jc w:val="left"/>
             </w:pPr>
             <w:r>
-              <w:t xml:space="preserve">🎨 Identidade visual</w:t>
-            </w:r>
-          </w:p>
-        </w:tc>
-        <w:tc>
-          <w:tcPr/>
-          <w:p>
-            <w:pPr>
-              <w:pStyle w:val="Compact"/>
-              <w:jc w:val="left"/>
-            </w:pPr>
-            <w:hyperlink r:id="rId50">
+              <w:t xml:space="preserve"> Identidade visual</w:t>
+            </w:r>
+          </w:p>
+        </w:tc>
+        <w:tc>
+          <w:tcPr/>
+          <w:p>
+            <w:pPr>
+              <w:pStyle w:val="Compact"/>
+              <w:jc w:val="left"/>
+            </w:pPr>
+            <w:hyperlink r:id="rId52">
               <w:r>
                 <w:rPr>
                   <w:rStyle w:val="VerbatimChar"/>
@@ -3823,18 +3568,18 @@
               <w:jc w:val="left"/>
             </w:pPr>
             <w:r>
-              <w:t xml:space="preserve">📜 Histórico WhatsApp</w:t>
-            </w:r>
-          </w:p>
-        </w:tc>
-        <w:tc>
-          <w:tcPr/>
-          <w:p>
-            <w:pPr>
-              <w:pStyle w:val="Compact"/>
-              <w:jc w:val="left"/>
-            </w:pPr>
-            <w:hyperlink r:id="rId27">
+              <w:t xml:space="preserve"> Histórico WhatsApp</w:t>
+            </w:r>
+          </w:p>
+        </w:tc>
+        <w:tc>
+          <w:tcPr/>
+          <w:p>
+            <w:pPr>
+              <w:pStyle w:val="Compact"/>
+              <w:jc w:val="left"/>
+            </w:pPr>
+            <w:hyperlink r:id="rId29">
               <w:r>
                 <w:rPr>
                   <w:rStyle w:val="VerbatimChar"/>
@@ -3854,18 +3599,18 @@
               <w:jc w:val="left"/>
             </w:pPr>
             <w:r>
-              <w:t xml:space="preserve">📚 Documentação geral</w:t>
-            </w:r>
-          </w:p>
-        </w:tc>
-        <w:tc>
-          <w:tcPr/>
-          <w:p>
-            <w:pPr>
-              <w:pStyle w:val="Compact"/>
-              <w:jc w:val="left"/>
-            </w:pPr>
-            <w:hyperlink r:id="rId51">
+              <w:t xml:space="preserve"> Documentação geral</w:t>
+            </w:r>
+          </w:p>
+        </w:tc>
+        <w:tc>
+          <w:tcPr/>
+          <w:p>
+            <w:pPr>
+              <w:pStyle w:val="Compact"/>
+              <w:jc w:val="left"/>
+            </w:pPr>
+            <w:hyperlink r:id="rId53">
               <w:r>
                 <w:rPr>
                   <w:rStyle w:val="VerbatimChar"/>
@@ -3885,18 +3630,18 @@
               <w:jc w:val="left"/>
             </w:pPr>
             <w:r>
-              <w:t xml:space="preserve">🖼️ Imagens do grupo</w:t>
-            </w:r>
-          </w:p>
-        </w:tc>
-        <w:tc>
-          <w:tcPr/>
-          <w:p>
-            <w:pPr>
-              <w:pStyle w:val="Compact"/>
-              <w:jc w:val="left"/>
-            </w:pPr>
-            <w:hyperlink r:id="rId52">
+              <w:t xml:space="preserve"> Imagens do grupo</w:t>
+            </w:r>
+          </w:p>
+        </w:tc>
+        <w:tc>
+          <w:tcPr/>
+          <w:p>
+            <w:pPr>
+              <w:pStyle w:val="Compact"/>
+              <w:jc w:val="left"/>
+            </w:pPr>
+            <w:hyperlink r:id="rId54">
               <w:r>
                 <w:rPr>
                   <w:rStyle w:val="VerbatimChar"/>
@@ -3908,15 +3653,8 @@
         </w:tc>
       </w:tr>
     </w:tbl>
-    <w:p>
-      <w:r>
-        <w:pict>
-          <v:rect style="width:0;height:1.5pt" o:hralign="center" o:hrstd="t" o:hr="t"/>
-        </w:pict>
-      </w:r>
-    </w:p>
-    <w:bookmarkEnd w:id="53"/>
-    <w:bookmarkStart w:id="54" w:name="regras-do-repositório"/>
+    <w:bookmarkEnd w:id="55"/>
+    <w:bookmarkStart w:id="56" w:name="regras-do-repositório"/>
     <w:p>
       <w:pPr>
         <w:pStyle w:val="Heading2"/>
@@ -3934,7 +3672,7 @@
         </w:numPr>
       </w:pPr>
       <w:r>
-        <w:t xml:space="preserve">📌 Este link está fixado no grupo do WhatsApp</w:t>
+        <w:t xml:space="preserve"> Este link está fixado no grupo do WhatsApp</w:t>
       </w:r>
     </w:p>
     <w:p>
@@ -3946,7 +3684,7 @@
         </w:numPr>
       </w:pPr>
       <w:r>
-        <w:t xml:space="preserve">📁 Todo novo documento deve ser linkado aqui</w:t>
+        <w:t xml:space="preserve"> Todo novo documento deve ser linkado aqui</w:t>
       </w:r>
     </w:p>
     <w:p>
@@ -3958,7 +3696,7 @@
         </w:numPr>
       </w:pPr>
       <w:r>
-        <w:t xml:space="preserve">🔒 Não publique telefones, senhas ou dados pessoais</w:t>
+        <w:t xml:space="preserve"> Não publique telefones, senhas ou dados pessoais</w:t>
       </w:r>
     </w:p>
     <w:p>
@@ -3970,7 +3708,7 @@
         </w:numPr>
       </w:pPr>
       <w:r>
-        <w:t xml:space="preserve">💬 Dúvidas? Pergunte no grupo do WhatsApp</w:t>
+        <w:t xml:space="preserve"> Dúvidas? Pergunte no grupo do WhatsApp</w:t>
       </w:r>
     </w:p>
     <w:p>
@@ -3982,7 +3720,7 @@
         </w:numPr>
       </w:pPr>
       <w:r>
-        <w:t xml:space="preserve">📝 Todo material final deve ser convertido para</w:t>
+        <w:t xml:space="preserve"> Todo material final deve ser convertido para</w:t>
       </w:r>
       <w:r>
         <w:t xml:space="preserve"> </w:t>
@@ -4016,94 +3754,6 @@
       </w:r>
     </w:p>
     <w:p>
-      <w:r>
-        <w:pict>
-          <v:rect style="width:0;height:1.5pt" o:hralign="center" o:hrstd="t" o:hr="t"/>
-        </w:pict>
-      </w:r>
-    </w:p>
-    <w:p>
-      <w:pPr>
-        <w:pStyle w:val="BlockText"/>
-      </w:pPr>
-      <w:r>
-        <w:rPr>
-          <w:b/>
-          <w:bCs/>
-        </w:rPr>
-        <w:t xml:space="preserve">Resumo para a apresentação (29/06 às 20h):</w:t>
-      </w:r>
-      <w:r>
-        <w:t xml:space="preserve"> </w:t>
-      </w:r>
-      <w:r>
-        <w:t xml:space="preserve">- Problema real sólido e fundamentado</w:t>
-      </w:r>
-      <w:r>
-        <w:t xml:space="preserve"> </w:t>
-      </w:r>
-      <w:r>
-        <w:t xml:space="preserve">- Acessibilidade como diferencial central (TEA, auditiva, visual, idosos, gestantes)</w:t>
-      </w:r>
-      <w:r>
-        <w:t xml:space="preserve"> </w:t>
-      </w:r>
-      <w:r>
-        <w:t xml:space="preserve">- Foco total nos entregáveis obrigatórios (sem Código em C)</w:t>
-      </w:r>
-      <w:r>
-        <w:t xml:space="preserve"> </w:t>
-      </w:r>
-      <w:r>
-        <w:t xml:space="preserve">- Equipe completa com 8 integrantes</w:t>
-      </w:r>
-      <w:r>
-        <w:t xml:space="preserve"> </w:t>
-      </w:r>
-      <w:r>
-        <w:t xml:space="preserve">- Nome oficial:</w:t>
-      </w:r>
-      <w:r>
-        <w:t xml:space="preserve"> </w:t>
-      </w:r>
-      <w:r>
-        <w:rPr>
-          <w:b/>
-          <w:bCs/>
-        </w:rPr>
-        <w:t xml:space="preserve">FilaClara</w:t>
-      </w:r>
-      <w:r>
-        <w:t xml:space="preserve"> </w:t>
-      </w:r>
-      <w:r>
-        <w:t xml:space="preserve">✅</w:t>
-      </w:r>
-      <w:r>
-        <w:t xml:space="preserve"> </w:t>
-      </w:r>
-      <w:r>
-        <w:t xml:space="preserve">-</w:t>
-      </w:r>
-      <w:r>
-        <w:t xml:space="preserve"> </w:t>
-      </w:r>
-      <w:r>
-        <w:rPr>
-          <w:b/>
-          <w:bCs/>
-        </w:rPr>
-        <w:t xml:space="preserve">⚠️ PRIORIDADE: converter todos os materiais para formatos acadêmicos (docx, pdf, pptx)</w:t>
-      </w:r>
-    </w:p>
-    <w:p>
-      <w:r>
-        <w:pict>
-          <v:rect style="width:0;height:1.5pt" o:hralign="center" o:hrstd="t" o:hr="t"/>
-        </w:pict>
-      </w:r>
-    </w:p>
-    <w:p>
       <w:pPr>
         <w:pStyle w:val="FirstParagraph"/>
       </w:pPr>
@@ -4112,11 +3762,11 @@
           <w:i/>
           <w:iCs/>
         </w:rPr>
-        <w:t xml:space="preserve">Última atualização: 25/06/2026 — nome oficial definido (FilaClara), enquete encerrada, fluxograma finalizado, prioridade em materiais acadêmicos.</w:t>
+        <w:t xml:space="preserve">Última atualização: 25/06/2026  nome oficial definido (FilaClara), enquete encerrada, fluxograma finalizado, prioridade em materiais acadêmicos.</w:t>
       </w:r>
     </w:p>
-    <w:bookmarkEnd w:id="54"/>
-    <w:bookmarkEnd w:id="55"/>
+    <w:bookmarkEnd w:id="56"/>
+    <w:bookmarkEnd w:id="57"/>
     <w:sectPr/>
   </w:body>
 </w:document>

</xml_diff>

<commit_message>
feat: rebranding completo filaclara → minhafila + docx/pdf regenerados
- renomeado: filaclara → minhafila em todos os documentos
- escopo expandido: saude → multissetorial (bancos, saude, comercio, educacao, governo)
- identidade visual cancelada, prompt de prototipo reescrito com abas por setor
- linguagem agentica removida de 12 arquivos
- docx e pdf regenerados a partir dos .md atualizados
- opendesigner atualizado para v0.12.0 (detached head, build pronto)
</commit_message>
<xml_diff>
--- a/disciplinas/gcetens843-projeto-algoritmo-i/atividades/trabalhos/projeto-algoritmos/Index-Geral.docx
+++ b/disciplinas/gcetens843-projeto-algoritmo-i/atividades/trabalhos/projeto-algoritmos/Index-Geral.docx
@@ -2,71 +2,56 @@
 <file path=word/document.xml><?xml version="1.0" encoding="utf-8"?>
 <w:document xmlns:w="http://schemas.openxmlformats.org/wordprocessingml/2006/main" xmlns:m="http://schemas.openxmlformats.org/officeDocument/2006/math" xmlns:r="http://schemas.openxmlformats.org/officeDocument/2006/relationships" xmlns:o="urn:schemas-microsoft-com:office:office" xmlns:v="urn:schemas-microsoft-com:vml" xmlns:w10="urn:schemas-microsoft-com:office:word" xmlns:a="http://schemas.openxmlformats.org/drawingml/2006/main" xmlns:pic="http://schemas.openxmlformats.org/drawingml/2006/picture" xmlns:wp="http://schemas.openxmlformats.org/drawingml/2006/wordprocessingDrawing">
   <w:body>
+    <w:bookmarkStart w:id="45" w:name="index-geral-minhafila"/>
     <w:p>
       <w:pPr>
-        <w:pStyle w:val="Title"/>
-      </w:pPr>
-      <w:r>
-        <w:t xml:space="preserve">Index Geral - FilaClara</w:t>
-      </w:r>
-    </w:p>
-    <w:bookmarkStart w:id="57" w:name="index-geral-filaclara"/>
-    <w:p>
-      <w:pPr>
         <w:pStyle w:val="Heading1"/>
       </w:pPr>
       <w:r>
-        <w:t xml:space="preserve">Index Geral  FilaClara</w:t>
+        <w:t xml:space="preserve">Index Geral — MinhaFila</w:t>
       </w:r>
     </w:p>
     <w:p>
       <w:pPr>
-        <w:pStyle w:val="CaptionedFigure"/>
-      </w:pPr>
-      <w:r>
-        <w:drawing>
-          <wp:inline>
-            <wp:extent cx="5334000" cy="3001970"/>
-            <wp:effectExtent b="0" l="0" r="0" t="0"/>
-            <wp:docPr descr="Foto do grupo" title="" id="21" name="Picture"/>
-            <a:graphic>
-              <a:graphicData uri="http://schemas.openxmlformats.org/drawingml/2006/picture">
-                <pic:pic>
-                  <pic:nvPicPr>
-                    <pic:cNvPr descr="imagens-grupo/nova-foto-grupo.png" id="22" name="Picture"/>
-                    <pic:cNvPicPr>
-                      <a:picLocks noChangeArrowheads="1" noChangeAspect="1"/>
-                    </pic:cNvPicPr>
-                  </pic:nvPicPr>
-                  <pic:blipFill>
-                    <a:blip r:embed="rId20"/>
-                    <a:stretch>
-                      <a:fillRect/>
-                    </a:stretch>
-                  </pic:blipFill>
-                  <pic:spPr bwMode="auto">
-                    <a:xfrm>
-                      <a:off x="0" y="0"/>
-                      <a:ext cx="5334000" cy="3001970"/>
-                    </a:xfrm>
-                    <a:prstGeom prst="rect">
-                      <a:avLst/>
-                    </a:prstGeom>
-                    <a:noFill/>
-                    <a:ln w="9525">
-                      <a:noFill/>
-                      <a:headEnd/>
-                      <a:tailEnd/>
-                    </a:ln>
-                  </pic:spPr>
-                </pic:pic>
-              </a:graphicData>
-            </a:graphic>
-          </wp:inline>
-        </w:drawing>
+        <w:pStyle w:val="BlockText"/>
+      </w:pPr>
+      <w:r>
+        <w:t xml:space="preserve">Documento central do grupo. Reúne o status do projeto, integrantes, entregáveis e roadmap.</w:t>
       </w:r>
     </w:p>
     <w:p>
+      <w:r>
+        <w:pict>
+          <v:rect style="width:0;height:1.5pt" o:hralign="center" o:hrstd="t" o:hr="t"/>
+        </w:pict>
+      </w:r>
+    </w:p>
+    <w:tbl>
+      <w:tblPr>
+        <w:tblStyle w:val="FigureTable"/>
+        <w:tblW w:type="auto" w:w="0"/>
+        <w:jc w:val="center"/>
+        <w:tblLook w:firstRow="0" w:lastRow="0" w:firstColumn="0" w:lastColumn="0"/>
+      </w:tblPr>
+      <w:tblGrid>
+        <w:gridCol w:w="7920"/>
+      </w:tblGrid>
+      <w:tr>
+        <w:tc>
+          <w:tcPr/>
+          <w:p>
+            <w:pPr>
+              <w:pStyle w:val="Compact"/>
+              <w:jc w:val="center"/>
+            </w:pPr>
+            <w:r>
+              <w:t xml:space="preserve">Foto do grupo</w:t>
+            </w:r>
+          </w:p>
+        </w:tc>
+      </w:tr>
+    </w:tbl>
+    <w:p>
       <w:pPr>
         <w:pStyle w:val="ImageCaption"/>
       </w:pPr>
@@ -74,7 +59,26 @@
         <w:t xml:space="preserve">Foto do grupo</w:t>
       </w:r>
     </w:p>
-    <w:bookmarkStart w:id="23" w:name="resumo-do-projeto"/>
+    <w:p>
+      <w:pPr>
+        <w:pStyle w:val="BodyText"/>
+      </w:pPr>
+      <w:r>
+        <w:rPr>
+          <w:i/>
+          <w:iCs/>
+        </w:rPr>
+        <w:t xml:space="preserve">Grupo: Deivison, Ausiane, Rios, Artur, Uélinton, Nubia, Marcos Vinicius e Wallace.</w:t>
+      </w:r>
+    </w:p>
+    <w:p>
+      <w:r>
+        <w:pict>
+          <v:rect style="width:0;height:1.5pt" o:hralign="center" o:hrstd="t" o:hr="t"/>
+        </w:pict>
+      </w:r>
+    </w:p>
+    <w:bookmarkStart w:id="24" w:name="resumo-do-projeto"/>
     <w:p>
       <w:pPr>
         <w:pStyle w:val="Heading2"/>
@@ -152,10 +156,7 @@
                 <w:b/>
                 <w:bCs/>
               </w:rPr>
-              <w:t xml:space="preserve">FilaClara</w:t>
-            </w:r>
-            <w:r>
-              <w:t xml:space="preserve"> </w:t>
+              <w:t xml:space="preserve">MinhaFila</w:t>
             </w:r>
           </w:p>
         </w:tc>
@@ -185,7 +186,7 @@
               <w:jc w:val="left"/>
             </w:pPr>
             <w:r>
-              <w:t xml:space="preserve">UFRB  Universidade Federal do Recôncavo da Bahia</w:t>
+              <w:t xml:space="preserve">UFRB — Universidade Federal do Recôncavo da Bahia</w:t>
             </w:r>
           </w:p>
         </w:tc>
@@ -245,7 +246,7 @@
               <w:jc w:val="left"/>
             </w:pPr>
             <w:r>
-              <w:t xml:space="preserve">GCETENS843  Projeto Algoritmo I</w:t>
+              <w:t xml:space="preserve">GCETENS843 — Projeto Algoritmo I</w:t>
             </w:r>
           </w:p>
         </w:tc>
@@ -305,7 +306,7 @@
               <w:jc w:val="left"/>
             </w:pPr>
             <w:r>
-              <w:t xml:space="preserve">Filas Inteligentes em Serviços de Saúde com Foco em Acessibilidade</w:t>
+              <w:t xml:space="preserve">Solução de Gerenciamento Inteligente de Filas para Múltiplos Setores</w:t>
             </w:r>
           </w:p>
         </w:tc>
@@ -339,54 +340,91 @@
                 <w:b/>
                 <w:bCs/>
               </w:rPr>
-              <w:t xml:space="preserve">29/06/2026 às 20h (AO VIVO)</w:t>
-            </w:r>
-          </w:p>
-        </w:tc>
-      </w:tr>
-      <w:tr>
-        <w:tc>
-          <w:tcPr/>
-          <w:p>
-            <w:pPr>
-              <w:pStyle w:val="Compact"/>
-              <w:jc w:val="left"/>
-            </w:pPr>
-            <w:r>
-              <w:rPr>
-                <w:b/>
-                <w:bCs/>
-              </w:rPr>
-              <w:t xml:space="preserve">Dias restantes</w:t>
-            </w:r>
-          </w:p>
-        </w:tc>
-        <w:tc>
-          <w:tcPr/>
-          <w:p>
-            <w:pPr>
-              <w:pStyle w:val="Compact"/>
-              <w:jc w:val="left"/>
-            </w:pPr>
-            <w:r>
-              <w:rPr>
-                <w:b/>
-                <w:bCs/>
-              </w:rPr>
-              <w:t xml:space="preserve">4 dias </w:t>
+              <w:t xml:space="preserve">29/06/2026 às 20h</w:t>
             </w:r>
           </w:p>
         </w:tc>
       </w:tr>
     </w:tbl>
-    <w:bookmarkEnd w:id="23"/>
-    <w:bookmarkStart w:id="24" w:name="integrantes-e-tarefas"/>
     <w:p>
       <w:pPr>
+        <w:pStyle w:val="BlockText"/>
+      </w:pPr>
+      <w:hyperlink r:id="rId20">
+        <w:r>
+          <w:rPr>
+            <w:rStyle w:val="Hyperlink"/>
+          </w:rPr>
+          <w:t xml:space="preserve">Tema completo</w:t>
+        </w:r>
+      </w:hyperlink>
+      <w:r>
+        <w:t xml:space="preserve"> </w:t>
+      </w:r>
+      <w:r>
+        <w:t xml:space="preserve">·</w:t>
+      </w:r>
+      <w:r>
+        <w:t xml:space="preserve"> </w:t>
+      </w:r>
+      <w:hyperlink r:id="rId21">
+        <w:r>
+          <w:rPr>
+            <w:rStyle w:val="Hyperlink"/>
+          </w:rPr>
+          <w:t xml:space="preserve">Divisão de tarefas</w:t>
+        </w:r>
+      </w:hyperlink>
+      <w:r>
+        <w:t xml:space="preserve"> </w:t>
+      </w:r>
+      <w:r>
+        <w:t xml:space="preserve">·</w:t>
+      </w:r>
+      <w:r>
+        <w:t xml:space="preserve"> </w:t>
+      </w:r>
+      <w:hyperlink r:id="rId22">
+        <w:r>
+          <w:rPr>
+            <w:rStyle w:val="Hyperlink"/>
+          </w:rPr>
+          <w:t xml:space="preserve">Decisões do projeto</w:t>
+        </w:r>
+      </w:hyperlink>
+      <w:r>
+        <w:t xml:space="preserve"> </w:t>
+      </w:r>
+      <w:r>
+        <w:t xml:space="preserve">·</w:t>
+      </w:r>
+      <w:r>
+        <w:t xml:space="preserve"> </w:t>
+      </w:r>
+      <w:hyperlink r:id="rId23">
+        <w:r>
+          <w:rPr>
+            <w:rStyle w:val="Hyperlink"/>
+          </w:rPr>
+          <w:t xml:space="preserve">Protótipo</w:t>
+        </w:r>
+      </w:hyperlink>
+    </w:p>
+    <w:p>
+      <w:r>
+        <w:pict>
+          <v:rect style="width:0;height:1.5pt" o:hralign="center" o:hrstd="t" o:hr="t"/>
+        </w:pict>
+      </w:r>
+    </w:p>
+    <w:bookmarkEnd w:id="24"/>
+    <w:bookmarkStart w:id="25" w:name="integrantes-e-atribuições"/>
+    <w:p>
+      <w:pPr>
         <w:pStyle w:val="Heading2"/>
       </w:pPr>
       <w:r>
-        <w:t xml:space="preserve">2. Integrantes e Tarefas</w:t>
+        <w:t xml:space="preserve">2. Integrantes e Atribuições</w:t>
       </w:r>
     </w:p>
     <w:tbl>
@@ -397,10 +435,10 @@
         <w:tblLook w:firstRow="1" w:lastRow="0" w:firstColumn="0" w:lastColumn="0" w:noHBand="0" w:noVBand="0" w:val="0020"/>
       </w:tblPr>
       <w:tblGrid>
-        <w:gridCol w:w="742"/>
-        <w:gridCol w:w="2970"/>
-        <w:gridCol w:w="2227"/>
-        <w:gridCol w:w="1980"/>
+        <w:gridCol w:w="660"/>
+        <w:gridCol w:w="2640"/>
+        <w:gridCol w:w="2860"/>
+        <w:gridCol w:w="1760"/>
       </w:tblGrid>
       <w:tr>
         <w:trPr>
@@ -438,7 +476,7 @@
               <w:jc w:val="left"/>
             </w:pPr>
             <w:r>
-              <w:t xml:space="preserve">Tarefas</w:t>
+              <w:t xml:space="preserve">Atribuições</w:t>
             </w:r>
           </w:p>
         </w:tc>
@@ -463,6 +501,9 @@
               <w:pStyle w:val="Compact"/>
               <w:jc w:val="center"/>
             </w:pPr>
+            <w:r>
+              <w:t xml:space="preserve">1</w:t>
+            </w:r>
           </w:p>
         </w:tc>
         <w:tc>
@@ -489,31 +530,34 @@
               <w:jc w:val="left"/>
             </w:pPr>
             <w:r>
-              <w:t xml:space="preserve">Proposta + Documentação + Repositório</w:t>
-            </w:r>
-          </w:p>
-        </w:tc>
-        <w:tc>
-          <w:tcPr/>
-          <w:p>
-            <w:pPr>
-              <w:pStyle w:val="Compact"/>
-              <w:jc w:val="center"/>
-            </w:pPr>
-            <w:r>
-              <w:t xml:space="preserve"> Ativo</w:t>
-            </w:r>
-          </w:p>
-        </w:tc>
-      </w:tr>
-      <w:tr>
-        <w:tc>
-          <w:tcPr/>
-          <w:p>
-            <w:pPr>
-              <w:pStyle w:val="Compact"/>
-              <w:jc w:val="center"/>
-            </w:pPr>
+              <w:t xml:space="preserve">Proposta, documentação, protótipo geral, repositório, refatoração do fluxograma</w:t>
+            </w:r>
+          </w:p>
+        </w:tc>
+        <w:tc>
+          <w:tcPr/>
+          <w:p>
+            <w:pPr>
+              <w:pStyle w:val="Compact"/>
+              <w:jc w:val="center"/>
+            </w:pPr>
+            <w:r>
+              <w:t xml:space="preserve">Ativo</w:t>
+            </w:r>
+          </w:p>
+        </w:tc>
+      </w:tr>
+      <w:tr>
+        <w:tc>
+          <w:tcPr/>
+          <w:p>
+            <w:pPr>
+              <w:pStyle w:val="Compact"/>
+              <w:jc w:val="center"/>
+            </w:pPr>
+            <w:r>
+              <w:t xml:space="preserve">2</w:t>
+            </w:r>
           </w:p>
         </w:tc>
         <w:tc>
@@ -540,31 +584,34 @@
               <w:jc w:val="left"/>
             </w:pPr>
             <w:r>
-              <w:t xml:space="preserve">Pesquisa + Proposta (experiência em saúde)</w:t>
-            </w:r>
-          </w:p>
-        </w:tc>
-        <w:tc>
-          <w:tcPr/>
-          <w:p>
-            <w:pPr>
-              <w:pStyle w:val="Compact"/>
-              <w:jc w:val="center"/>
-            </w:pPr>
-            <w:r>
-              <w:t xml:space="preserve"> Ativo</w:t>
-            </w:r>
-          </w:p>
-        </w:tc>
-      </w:tr>
-      <w:tr>
-        <w:tc>
-          <w:tcPr/>
-          <w:p>
-            <w:pPr>
-              <w:pStyle w:val="Compact"/>
-              <w:jc w:val="center"/>
-            </w:pPr>
+              <w:t xml:space="preserve">Pesquisa de campo, proposta (experiência em saúde), problema real</w:t>
+            </w:r>
+          </w:p>
+        </w:tc>
+        <w:tc>
+          <w:tcPr/>
+          <w:p>
+            <w:pPr>
+              <w:pStyle w:val="Compact"/>
+              <w:jc w:val="center"/>
+            </w:pPr>
+            <w:r>
+              <w:t xml:space="preserve">Ativo</w:t>
+            </w:r>
+          </w:p>
+        </w:tc>
+      </w:tr>
+      <w:tr>
+        <w:tc>
+          <w:tcPr/>
+          <w:p>
+            <w:pPr>
+              <w:pStyle w:val="Compact"/>
+              <w:jc w:val="center"/>
+            </w:pPr>
+            <w:r>
+              <w:t xml:space="preserve">3</w:t>
+            </w:r>
           </w:p>
         </w:tc>
         <w:tc>
@@ -591,31 +638,34 @@
               <w:jc w:val="left"/>
             </w:pPr>
             <w:r>
-              <w:t xml:space="preserve">Casos Existentes + Protótipo (design e acessibilidade)</w:t>
-            </w:r>
-          </w:p>
-        </w:tc>
-        <w:tc>
-          <w:tcPr/>
-          <w:p>
-            <w:pPr>
-              <w:pStyle w:val="Compact"/>
-              <w:jc w:val="center"/>
-            </w:pPr>
-            <w:r>
-              <w:t xml:space="preserve"> Ativo</w:t>
-            </w:r>
-          </w:p>
-        </w:tc>
-      </w:tr>
-      <w:tr>
-        <w:tc>
-          <w:tcPr/>
-          <w:p>
-            <w:pPr>
-              <w:pStyle w:val="Compact"/>
-              <w:jc w:val="center"/>
-            </w:pPr>
+              <w:t xml:space="preserve">Casos existentes, protótipo (design e acessibilidade), documentação de acessibilidade</w:t>
+            </w:r>
+          </w:p>
+        </w:tc>
+        <w:tc>
+          <w:tcPr/>
+          <w:p>
+            <w:pPr>
+              <w:pStyle w:val="Compact"/>
+              <w:jc w:val="center"/>
+            </w:pPr>
+            <w:r>
+              <w:t xml:space="preserve">Ativo</w:t>
+            </w:r>
+          </w:p>
+        </w:tc>
+      </w:tr>
+      <w:tr>
+        <w:tc>
+          <w:tcPr/>
+          <w:p>
+            <w:pPr>
+              <w:pStyle w:val="Compact"/>
+              <w:jc w:val="center"/>
+            </w:pPr>
+            <w:r>
+              <w:t xml:space="preserve">4</w:t>
+            </w:r>
           </w:p>
         </w:tc>
         <w:tc>
@@ -642,31 +692,34 @@
               <w:jc w:val="left"/>
             </w:pPr>
             <w:r>
-              <w:t xml:space="preserve">Pesquisa + Casos Existentes (inclusão)</w:t>
-            </w:r>
-          </w:p>
-        </w:tc>
-        <w:tc>
-          <w:tcPr/>
-          <w:p>
-            <w:pPr>
-              <w:pStyle w:val="Compact"/>
-              <w:jc w:val="center"/>
-            </w:pPr>
-            <w:r>
-              <w:t xml:space="preserve"> Ativo</w:t>
-            </w:r>
-          </w:p>
-        </w:tc>
-      </w:tr>
-      <w:tr>
-        <w:tc>
-          <w:tcPr/>
-          <w:p>
-            <w:pPr>
-              <w:pStyle w:val="Compact"/>
-              <w:jc w:val="center"/>
-            </w:pPr>
+              <w:t xml:space="preserve">Pesquisa e casos existentes (inclusão e diagnóstico tardio)</w:t>
+            </w:r>
+          </w:p>
+        </w:tc>
+        <w:tc>
+          <w:tcPr/>
+          <w:p>
+            <w:pPr>
+              <w:pStyle w:val="Compact"/>
+              <w:jc w:val="center"/>
+            </w:pPr>
+            <w:r>
+              <w:t xml:space="preserve">Ativo</w:t>
+            </w:r>
+          </w:p>
+        </w:tc>
+      </w:tr>
+      <w:tr>
+        <w:tc>
+          <w:tcPr/>
+          <w:p>
+            <w:pPr>
+              <w:pStyle w:val="Compact"/>
+              <w:jc w:val="center"/>
+            </w:pPr>
+            <w:r>
+              <w:t xml:space="preserve">5</w:t>
+            </w:r>
           </w:p>
         </w:tc>
         <w:tc>
@@ -693,31 +746,34 @@
               <w:jc w:val="left"/>
             </w:pPr>
             <w:r>
-              <w:t xml:space="preserve">Fluxograma (perfil técnico)</w:t>
-            </w:r>
-          </w:p>
-        </w:tc>
-        <w:tc>
-          <w:tcPr/>
-          <w:p>
-            <w:pPr>
-              <w:pStyle w:val="Compact"/>
-              <w:jc w:val="center"/>
-            </w:pPr>
-            <w:r>
-              <w:t xml:space="preserve"> Ativo</w:t>
-            </w:r>
-          </w:p>
-        </w:tc>
-      </w:tr>
-      <w:tr>
-        <w:tc>
-          <w:tcPr/>
-          <w:p>
-            <w:pPr>
-              <w:pStyle w:val="Compact"/>
-              <w:jc w:val="center"/>
-            </w:pPr>
+              <w:t xml:space="preserve">Fluxograma do sistema</w:t>
+            </w:r>
+          </w:p>
+        </w:tc>
+        <w:tc>
+          <w:tcPr/>
+          <w:p>
+            <w:pPr>
+              <w:pStyle w:val="Compact"/>
+              <w:jc w:val="center"/>
+            </w:pPr>
+            <w:r>
+              <w:t xml:space="preserve">Ativo</w:t>
+            </w:r>
+          </w:p>
+        </w:tc>
+      </w:tr>
+      <w:tr>
+        <w:tc>
+          <w:tcPr/>
+          <w:p>
+            <w:pPr>
+              <w:pStyle w:val="Compact"/>
+              <w:jc w:val="center"/>
+            </w:pPr>
+            <w:r>
+              <w:t xml:space="preserve">6</w:t>
+            </w:r>
           </w:p>
         </w:tc>
         <w:tc>
@@ -744,31 +800,34 @@
               <w:jc w:val="left"/>
             </w:pPr>
             <w:r>
-              <w:t xml:space="preserve">Fluxograma</w:t>
-            </w:r>
-          </w:p>
-        </w:tc>
-        <w:tc>
-          <w:tcPr/>
-          <w:p>
-            <w:pPr>
-              <w:pStyle w:val="Compact"/>
-              <w:jc w:val="center"/>
-            </w:pPr>
-            <w:r>
-              <w:t xml:space="preserve"> Ativo</w:t>
-            </w:r>
-          </w:p>
-        </w:tc>
-      </w:tr>
-      <w:tr>
-        <w:tc>
-          <w:tcPr/>
-          <w:p>
-            <w:pPr>
-              <w:pStyle w:val="Compact"/>
-              <w:jc w:val="center"/>
-            </w:pPr>
+              <w:t xml:space="preserve">Fluxograma do sistema</w:t>
+            </w:r>
+          </w:p>
+        </w:tc>
+        <w:tc>
+          <w:tcPr/>
+          <w:p>
+            <w:pPr>
+              <w:pStyle w:val="Compact"/>
+              <w:jc w:val="center"/>
+            </w:pPr>
+            <w:r>
+              <w:t xml:space="preserve">Ativo</w:t>
+            </w:r>
+          </w:p>
+        </w:tc>
+      </w:tr>
+      <w:tr>
+        <w:tc>
+          <w:tcPr/>
+          <w:p>
+            <w:pPr>
+              <w:pStyle w:val="Compact"/>
+              <w:jc w:val="center"/>
+            </w:pPr>
+            <w:r>
+              <w:t xml:space="preserve">7</w:t>
+            </w:r>
           </w:p>
         </w:tc>
         <w:tc>
@@ -785,47 +844,44 @@
               </w:rPr>
               <w:t xml:space="preserve">Uélinton</w:t>
             </w:r>
-            <w:r>
-              <w:t xml:space="preserve"> </w:t>
-            </w:r>
-            <w:r>
-              <w:t xml:space="preserve">(Uélinton Cardoso Santana)</w:t>
-            </w:r>
-          </w:p>
-        </w:tc>
-        <w:tc>
-          <w:tcPr/>
-          <w:p>
-            <w:pPr>
-              <w:pStyle w:val="Compact"/>
-              <w:jc w:val="left"/>
-            </w:pPr>
-            <w:r>
-              <w:t xml:space="preserve">Protótipo + Slides</w:t>
-            </w:r>
-          </w:p>
-        </w:tc>
-        <w:tc>
-          <w:tcPr/>
-          <w:p>
-            <w:pPr>
-              <w:pStyle w:val="Compact"/>
-              <w:jc w:val="center"/>
-            </w:pPr>
-            <w:r>
-              <w:t xml:space="preserve"> Ativo</w:t>
-            </w:r>
-          </w:p>
-        </w:tc>
-      </w:tr>
-      <w:tr>
-        <w:tc>
-          <w:tcPr/>
-          <w:p>
-            <w:pPr>
-              <w:pStyle w:val="Compact"/>
-              <w:jc w:val="center"/>
-            </w:pPr>
+          </w:p>
+        </w:tc>
+        <w:tc>
+          <w:tcPr/>
+          <w:p>
+            <w:pPr>
+              <w:pStyle w:val="Compact"/>
+              <w:jc w:val="left"/>
+            </w:pPr>
+            <w:r>
+              <w:t xml:space="preserve">Protótipo de telas e slides da apresentação</w:t>
+            </w:r>
+          </w:p>
+        </w:tc>
+        <w:tc>
+          <w:tcPr/>
+          <w:p>
+            <w:pPr>
+              <w:pStyle w:val="Compact"/>
+              <w:jc w:val="center"/>
+            </w:pPr>
+            <w:r>
+              <w:t xml:space="preserve">Ativo</w:t>
+            </w:r>
+          </w:p>
+        </w:tc>
+      </w:tr>
+      <w:tr>
+        <w:tc>
+          <w:tcPr/>
+          <w:p>
+            <w:pPr>
+              <w:pStyle w:val="Compact"/>
+              <w:jc w:val="center"/>
+            </w:pPr>
+            <w:r>
+              <w:t xml:space="preserve">8</w:t>
+            </w:r>
           </w:p>
         </w:tc>
         <w:tc>
@@ -852,32 +908,52 @@
               <w:jc w:val="left"/>
             </w:pPr>
             <w:r>
-              <w:t xml:space="preserve">Slides (apoio)</w:t>
-            </w:r>
-          </w:p>
-        </w:tc>
-        <w:tc>
-          <w:tcPr/>
-          <w:p>
-            <w:pPr>
-              <w:pStyle w:val="Compact"/>
-              <w:jc w:val="center"/>
-            </w:pPr>
-            <w:r>
-              <w:t xml:space="preserve"> Pendente</w:t>
+              <w:t xml:space="preserve">Slides da apresentação</w:t>
+            </w:r>
+          </w:p>
+        </w:tc>
+        <w:tc>
+          <w:tcPr/>
+          <w:p>
+            <w:pPr>
+              <w:pStyle w:val="Compact"/>
+              <w:jc w:val="center"/>
+            </w:pPr>
+            <w:r>
+              <w:t xml:space="preserve">A definir</w:t>
             </w:r>
           </w:p>
         </w:tc>
       </w:tr>
     </w:tbl>
-    <w:bookmarkEnd w:id="24"/>
-    <w:bookmarkStart w:id="25" w:name="o-que-o-professor-pediu"/>
     <w:p>
       <w:pPr>
+        <w:pStyle w:val="BlockText"/>
+      </w:pPr>
+      <w:hyperlink r:id="rId21">
+        <w:r>
+          <w:rPr>
+            <w:rStyle w:val="Hyperlink"/>
+          </w:rPr>
+          <w:t xml:space="preserve">Divisão de tarefas completa com justificativas</w:t>
+        </w:r>
+      </w:hyperlink>
+    </w:p>
+    <w:p>
+      <w:r>
+        <w:pict>
+          <v:rect style="width:0;height:1.5pt" o:hralign="center" o:hrstd="t" o:hr="t"/>
+        </w:pict>
+      </w:r>
+    </w:p>
+    <w:bookmarkEnd w:id="25"/>
+    <w:bookmarkStart w:id="26" w:name="requisitos-da-disciplina"/>
+    <w:p>
+      <w:pPr>
         <w:pStyle w:val="Heading2"/>
       </w:pPr>
       <w:r>
-        <w:t xml:space="preserve">3. O Que o Professor Pediu</w:t>
+        <w:t xml:space="preserve">3. Requisitos da Disciplina</w:t>
       </w:r>
     </w:p>
     <w:tbl>
@@ -915,19 +991,19 @@
               <w:jc w:val="center"/>
             </w:pPr>
             <w:r>
-              <w:t xml:space="preserve">Obrigatório?</w:t>
-            </w:r>
-          </w:p>
-        </w:tc>
-        <w:tc>
-          <w:tcPr/>
-          <w:p>
-            <w:pPr>
-              <w:pStyle w:val="Compact"/>
-              <w:jc w:val="center"/>
-            </w:pPr>
-            <w:r>
-              <w:t xml:space="preserve">Status</w:t>
+              <w:t xml:space="preserve">Exigido</w:t>
+            </w:r>
+          </w:p>
+        </w:tc>
+        <w:tc>
+          <w:tcPr/>
+          <w:p>
+            <w:pPr>
+              <w:pStyle w:val="Compact"/>
+              <w:jc w:val="center"/>
+            </w:pPr>
+            <w:r>
+              <w:t xml:space="preserve">Situação</w:t>
             </w:r>
           </w:p>
         </w:tc>
@@ -953,26 +1029,19 @@
               <w:jc w:val="center"/>
             </w:pPr>
             <w:r>
-              <w:t xml:space="preserve"> Sim</w:t>
-            </w:r>
-          </w:p>
-        </w:tc>
-        <w:tc>
-          <w:tcPr/>
-          <w:p>
-            <w:pPr>
-              <w:pStyle w:val="Compact"/>
-              <w:jc w:val="center"/>
-            </w:pPr>
-            <w:r>
-              <w:t xml:space="preserve"> </w:t>
-            </w:r>
-            <w:r>
-              <w:rPr>
-                <w:b/>
-                <w:bCs/>
-              </w:rPr>
-              <w:t xml:space="preserve">Feito</w:t>
+              <w:t xml:space="preserve">Sim</w:t>
+            </w:r>
+          </w:p>
+        </w:tc>
+        <w:tc>
+          <w:tcPr/>
+          <w:p>
+            <w:pPr>
+              <w:pStyle w:val="Compact"/>
+              <w:jc w:val="center"/>
+            </w:pPr>
+            <w:r>
+              <w:t xml:space="preserve">Concluído</w:t>
             </w:r>
           </w:p>
         </w:tc>
@@ -998,57 +1067,57 @@
               <w:jc w:val="center"/>
             </w:pPr>
             <w:r>
-              <w:t xml:space="preserve"> Sim</w:t>
-            </w:r>
-          </w:p>
-        </w:tc>
-        <w:tc>
-          <w:tcPr/>
-          <w:p>
-            <w:pPr>
-              <w:pStyle w:val="Compact"/>
-              <w:jc w:val="center"/>
-            </w:pPr>
-            <w:r>
-              <w:t xml:space="preserve"> Em andamento</w:t>
-            </w:r>
-          </w:p>
-        </w:tc>
-      </w:tr>
-      <w:tr>
-        <w:tc>
-          <w:tcPr/>
-          <w:p>
-            <w:pPr>
-              <w:pStyle w:val="Compact"/>
-              <w:jc w:val="left"/>
-            </w:pPr>
-            <w:r>
-              <w:t xml:space="preserve">Proposta/solução inovadora</w:t>
-            </w:r>
-          </w:p>
-        </w:tc>
-        <w:tc>
-          <w:tcPr/>
-          <w:p>
-            <w:pPr>
-              <w:pStyle w:val="Compact"/>
-              <w:jc w:val="center"/>
-            </w:pPr>
-            <w:r>
-              <w:t xml:space="preserve"> Sim</w:t>
-            </w:r>
-          </w:p>
-        </w:tc>
-        <w:tc>
-          <w:tcPr/>
-          <w:p>
-            <w:pPr>
-              <w:pStyle w:val="Compact"/>
-              <w:jc w:val="center"/>
-            </w:pPr>
-            <w:r>
-              <w:t xml:space="preserve"> Em andamento</w:t>
+              <w:t xml:space="preserve">Sim</w:t>
+            </w:r>
+          </w:p>
+        </w:tc>
+        <w:tc>
+          <w:tcPr/>
+          <w:p>
+            <w:pPr>
+              <w:pStyle w:val="Compact"/>
+              <w:jc w:val="center"/>
+            </w:pPr>
+            <w:r>
+              <w:t xml:space="preserve">Em andamento</w:t>
+            </w:r>
+          </w:p>
+        </w:tc>
+      </w:tr>
+      <w:tr>
+        <w:tc>
+          <w:tcPr/>
+          <w:p>
+            <w:pPr>
+              <w:pStyle w:val="Compact"/>
+              <w:jc w:val="left"/>
+            </w:pPr>
+            <w:r>
+              <w:t xml:space="preserve">Proposta/solução</w:t>
+            </w:r>
+          </w:p>
+        </w:tc>
+        <w:tc>
+          <w:tcPr/>
+          <w:p>
+            <w:pPr>
+              <w:pStyle w:val="Compact"/>
+              <w:jc w:val="center"/>
+            </w:pPr>
+            <w:r>
+              <w:t xml:space="preserve">Sim</w:t>
+            </w:r>
+          </w:p>
+        </w:tc>
+        <w:tc>
+          <w:tcPr/>
+          <w:p>
+            <w:pPr>
+              <w:pStyle w:val="Compact"/>
+              <w:jc w:val="center"/>
+            </w:pPr>
+            <w:r>
+              <w:t xml:space="preserve">Em andamento</w:t>
             </w:r>
           </w:p>
         </w:tc>
@@ -1074,90 +1143,83 @@
               <w:jc w:val="center"/>
             </w:pPr>
             <w:r>
-              <w:t xml:space="preserve"> Sim</w:t>
-            </w:r>
-          </w:p>
-        </w:tc>
-        <w:tc>
-          <w:tcPr/>
-          <w:p>
-            <w:pPr>
-              <w:pStyle w:val="Compact"/>
-              <w:jc w:val="center"/>
-            </w:pPr>
-            <w:r>
-              <w:t xml:space="preserve"> </w:t>
-            </w:r>
-            <w:r>
-              <w:rPr>
-                <w:b/>
-                <w:bCs/>
-              </w:rPr>
-              <w:t xml:space="preserve">Feito</w:t>
-            </w:r>
-          </w:p>
-        </w:tc>
-      </w:tr>
-      <w:tr>
-        <w:tc>
-          <w:tcPr/>
-          <w:p>
-            <w:pPr>
-              <w:pStyle w:val="Compact"/>
-              <w:jc w:val="left"/>
-            </w:pPr>
-            <w:r>
-              <w:t xml:space="preserve">Protótipo de telas (mockups)</w:t>
-            </w:r>
-          </w:p>
-        </w:tc>
-        <w:tc>
-          <w:tcPr/>
-          <w:p>
-            <w:pPr>
-              <w:pStyle w:val="Compact"/>
-              <w:jc w:val="center"/>
-            </w:pPr>
-            <w:r>
-              <w:t xml:space="preserve"> Sim</w:t>
-            </w:r>
-          </w:p>
-        </w:tc>
-        <w:tc>
-          <w:tcPr/>
-          <w:p>
-            <w:pPr>
-              <w:pStyle w:val="Compact"/>
-              <w:jc w:val="center"/>
-            </w:pPr>
-            <w:r>
-              <w:t xml:space="preserve"> Em andamento</w:t>
-            </w:r>
-          </w:p>
-        </w:tc>
-      </w:tr>
-      <w:tr>
-        <w:tc>
-          <w:tcPr/>
-          <w:p>
-            <w:pPr>
-              <w:pStyle w:val="Compact"/>
-              <w:jc w:val="left"/>
-            </w:pPr>
-            <w:r>
-              <w:t xml:space="preserve">Apresentação AO VIVO</w:t>
-            </w:r>
-          </w:p>
-        </w:tc>
-        <w:tc>
-          <w:tcPr/>
-          <w:p>
-            <w:pPr>
-              <w:pStyle w:val="Compact"/>
-              <w:jc w:val="center"/>
-            </w:pPr>
-            <w:r>
-              <w:t xml:space="preserve"> Sim</w:t>
+              <w:t xml:space="preserve">Sim</w:t>
+            </w:r>
+          </w:p>
+        </w:tc>
+        <w:tc>
+          <w:tcPr/>
+          <w:p>
+            <w:pPr>
+              <w:pStyle w:val="Compact"/>
+              <w:jc w:val="center"/>
+            </w:pPr>
+            <w:r>
+              <w:t xml:space="preserve">Concluído</w:t>
+            </w:r>
+          </w:p>
+        </w:tc>
+      </w:tr>
+      <w:tr>
+        <w:tc>
+          <w:tcPr/>
+          <w:p>
+            <w:pPr>
+              <w:pStyle w:val="Compact"/>
+              <w:jc w:val="left"/>
+            </w:pPr>
+            <w:r>
+              <w:t xml:space="preserve">Protótipo de telas</w:t>
+            </w:r>
+          </w:p>
+        </w:tc>
+        <w:tc>
+          <w:tcPr/>
+          <w:p>
+            <w:pPr>
+              <w:pStyle w:val="Compact"/>
+              <w:jc w:val="center"/>
+            </w:pPr>
+            <w:r>
+              <w:t xml:space="preserve">Sim</w:t>
+            </w:r>
+          </w:p>
+        </w:tc>
+        <w:tc>
+          <w:tcPr/>
+          <w:p>
+            <w:pPr>
+              <w:pStyle w:val="Compact"/>
+              <w:jc w:val="center"/>
+            </w:pPr>
+            <w:r>
+              <w:t xml:space="preserve">Em andamento</w:t>
+            </w:r>
+          </w:p>
+        </w:tc>
+      </w:tr>
+      <w:tr>
+        <w:tc>
+          <w:tcPr/>
+          <w:p>
+            <w:pPr>
+              <w:pStyle w:val="Compact"/>
+              <w:jc w:val="left"/>
+            </w:pPr>
+            <w:r>
+              <w:t xml:space="preserve">Apresentação ao vivo</w:t>
+            </w:r>
+          </w:p>
+        </w:tc>
+        <w:tc>
+          <w:tcPr/>
+          <w:p>
+            <w:pPr>
+              <w:pStyle w:val="Compact"/>
+              <w:jc w:val="center"/>
+            </w:pPr>
+            <w:r>
+              <w:t xml:space="preserve">Sim</w:t>
             </w:r>
           </w:p>
         </w:tc>
@@ -1178,69 +1240,31 @@
           </w:p>
         </w:tc>
       </w:tr>
-      <w:tr>
-        <w:tc>
-          <w:tcPr/>
-          <w:p>
-            <w:pPr>
-              <w:pStyle w:val="Compact"/>
-              <w:jc w:val="left"/>
-            </w:pPr>
-            <w:r>
-              <w:t xml:space="preserve">Código em C</w:t>
-            </w:r>
-          </w:p>
-        </w:tc>
-        <w:tc>
-          <w:tcPr/>
-          <w:p>
-            <w:pPr>
-              <w:pStyle w:val="Compact"/>
-              <w:jc w:val="center"/>
-            </w:pPr>
-            <w:r>
-              <w:t xml:space="preserve"> </w:t>
-            </w:r>
-            <w:r>
-              <w:rPr>
-                <w:b/>
-                <w:bCs/>
-              </w:rPr>
-              <w:t xml:space="preserve">Cancelado</w:t>
-            </w:r>
-          </w:p>
-        </w:tc>
-        <w:tc>
-          <w:tcPr/>
-          <w:p>
-            <w:pPr>
-              <w:pStyle w:val="Compact"/>
-              <w:jc w:val="center"/>
-            </w:pPr>
-            <w:r>
-              <w:t xml:space="preserve">Decisão do grupo em 12/06</w:t>
-            </w:r>
-          </w:p>
-        </w:tc>
-      </w:tr>
     </w:tbl>
-    <w:bookmarkEnd w:id="25"/>
-    <w:bookmarkStart w:id="40" w:name="roadmap-status-geral-25062026"/>
     <w:p>
+      <w:r>
+        <w:pict>
+          <v:rect style="width:0;height:1.5pt" o:hralign="center" o:hrstd="t" o:hr="t"/>
+        </w:pict>
+      </w:r>
+    </w:p>
+    <w:bookmarkEnd w:id="26"/>
+    <w:bookmarkStart w:id="36" w:name="roadmap-25062026"/>
+    <w:p>
       <w:pPr>
         <w:pStyle w:val="Heading2"/>
       </w:pPr>
       <w:r>
-        <w:t xml:space="preserve">4. Roadmap  Status Geral (25/06/2026)</w:t>
+        <w:t xml:space="preserve">4. Roadmap (25/06/2026)</w:t>
       </w:r>
     </w:p>
-    <w:bookmarkStart w:id="35" w:name="pronto"/>
+    <w:bookmarkStart w:id="31" w:name="concluído"/>
     <w:p>
       <w:pPr>
         <w:pStyle w:val="Heading3"/>
       </w:pPr>
       <w:r>
-        <w:t xml:space="preserve"> Pronto</w:t>
+        <w:t xml:space="preserve">Concluído</w:t>
       </w:r>
     </w:p>
     <w:tbl>
@@ -1316,7 +1340,7 @@
               <w:pStyle w:val="Compact"/>
               <w:jc w:val="left"/>
             </w:pPr>
-            <w:hyperlink r:id="rId26">
+            <w:hyperlink r:id="rId20">
               <w:r>
                 <w:rPr>
                   <w:rStyle w:val="VerbatimChar"/>
@@ -1359,7 +1383,7 @@
               <w:pStyle w:val="Compact"/>
               <w:jc w:val="left"/>
             </w:pPr>
-            <w:hyperlink r:id="rId27">
+            <w:hyperlink r:id="rId21">
               <w:r>
                 <w:rPr>
                   <w:rStyle w:val="VerbatimChar"/>
@@ -1402,7 +1426,7 @@
               <w:pStyle w:val="Compact"/>
               <w:jc w:val="left"/>
             </w:pPr>
-            <w:hyperlink r:id="rId28">
+            <w:hyperlink r:id="rId22">
               <w:r>
                 <w:rPr>
                   <w:rStyle w:val="VerbatimChar"/>
@@ -1450,13 +1474,7 @@
                 <w:b/>
                 <w:bCs/>
               </w:rPr>
-              <w:t xml:space="preserve">FilaClara</w:t>
-            </w:r>
-            <w:r>
-              <w:t xml:space="preserve"> </w:t>
-            </w:r>
-            <w:r>
-              <w:t xml:space="preserve">(enquete encerrada)</w:t>
+              <w:t xml:space="preserve">MinhaFila</w:t>
             </w:r>
           </w:p>
         </w:tc>
@@ -1493,7 +1511,7 @@
               <w:pStyle w:val="Compact"/>
               <w:jc w:val="left"/>
             </w:pPr>
-            <w:hyperlink r:id="rId29">
+            <w:hyperlink r:id="rId27">
               <w:r>
                 <w:rPr>
                   <w:rStyle w:val="VerbatimChar"/>
@@ -1505,7 +1523,7 @@
               <w:t xml:space="preserve"> </w:t>
             </w:r>
             <w:r>
-              <w:t xml:space="preserve">(519 msgs)</w:t>
+              <w:t xml:space="preserve">(519 mensagens)</w:t>
             </w:r>
           </w:p>
         </w:tc>
@@ -1531,18 +1549,18 @@
               <w:jc w:val="left"/>
             </w:pPr>
             <w:r>
-              <w:t xml:space="preserve">Problema real (Rios)</w:t>
-            </w:r>
-          </w:p>
-        </w:tc>
-        <w:tc>
-          <w:tcPr/>
-          <w:p>
-            <w:pPr>
-              <w:pStyle w:val="Compact"/>
-              <w:jc w:val="left"/>
-            </w:pPr>
-            <w:hyperlink r:id="rId30">
+              <w:t xml:space="preserve">Problema real</w:t>
+            </w:r>
+          </w:p>
+        </w:tc>
+        <w:tc>
+          <w:tcPr/>
+          <w:p>
+            <w:pPr>
+              <w:pStyle w:val="Compact"/>
+              <w:jc w:val="left"/>
+            </w:pPr>
+            <w:hyperlink r:id="rId28">
               <w:r>
                 <w:rPr>
                   <w:rStyle w:val="VerbatimChar"/>
@@ -1585,7 +1603,7 @@
               <w:pStyle w:val="Compact"/>
               <w:jc w:val="left"/>
             </w:pPr>
-            <w:hyperlink r:id="rId31">
+            <w:hyperlink r:id="rId29">
               <w:r>
                 <w:rPr>
                   <w:rStyle w:val="VerbatimChar"/>
@@ -1602,7 +1620,7 @@
             <w:r>
               <w:t xml:space="preserve"> </w:t>
             </w:r>
-            <w:hyperlink r:id="rId32">
+            <w:hyperlink r:id="rId30">
               <w:r>
                 <w:rPr>
                   <w:rStyle w:val="VerbatimChar"/>
@@ -1620,7 +1638,7 @@
               <w:jc w:val="center"/>
             </w:pPr>
             <w:r>
-              <w:t xml:space="preserve">Deivison (refatorado)</w:t>
+              <w:t xml:space="preserve">Artur, Marcos, Deivison</w:t>
             </w:r>
           </w:p>
         </w:tc>
@@ -1645,55 +1663,38 @@
               <w:pStyle w:val="Compact"/>
               <w:jc w:val="left"/>
             </w:pPr>
-            <w:hyperlink r:id="rId33">
+            <w:hyperlink r:id="rId23">
               <w:r>
                 <w:rPr>
                   <w:rStyle w:val="VerbatimChar"/>
                 </w:rPr>
-                <w:t xml:space="preserve">prototipo-filaclara-opendesigner/index.html</w:t>
+                <w:t xml:space="preserve">prototipo-minhafila/index.html</w:t>
               </w:r>
             </w:hyperlink>
-            <w:r>
-              <w:t xml:space="preserve"> </w:t>
-            </w:r>
-            <w:r>
-              <w:t xml:space="preserve">+</w:t>
-            </w:r>
-            <w:r>
-              <w:t xml:space="preserve"> </w:t>
-            </w:r>
-            <w:hyperlink r:id="rId34">
-              <w:r>
-                <w:rPr>
-                  <w:rStyle w:val="Hyperlink"/>
-                </w:rPr>
-                <w:t xml:space="preserve">admin.html</w:t>
-              </w:r>
-            </w:hyperlink>
-          </w:p>
-        </w:tc>
-        <w:tc>
-          <w:tcPr/>
-          <w:p>
-            <w:pPr>
-              <w:pStyle w:val="Compact"/>
-              <w:jc w:val="center"/>
-            </w:pPr>
-            <w:r>
-              <w:t xml:space="preserve">Open Designer</w:t>
+          </w:p>
+        </w:tc>
+        <w:tc>
+          <w:tcPr/>
+          <w:p>
+            <w:pPr>
+              <w:pStyle w:val="Compact"/>
+              <w:jc w:val="center"/>
+            </w:pPr>
+            <w:r>
+              <w:t xml:space="preserve">Deivison</w:t>
             </w:r>
           </w:p>
         </w:tc>
       </w:tr>
     </w:tbl>
-    <w:bookmarkEnd w:id="35"/>
-    <w:bookmarkStart w:id="38" w:name="em-andamento"/>
+    <w:bookmarkEnd w:id="31"/>
+    <w:bookmarkStart w:id="34" w:name="em-andamento"/>
     <w:p>
       <w:pPr>
         <w:pStyle w:val="Heading3"/>
       </w:pPr>
       <w:r>
-        <w:t xml:space="preserve"> Em andamento</w:t>
+        <w:t xml:space="preserve">Em andamento</w:t>
       </w:r>
     </w:p>
     <w:tbl>
@@ -1704,9 +1705,9 @@
         <w:tblLook w:firstRow="1" w:lastRow="0" w:firstColumn="0" w:lastColumn="0" w:noHBand="0" w:noVBand="0" w:val="0020"/>
       </w:tblPr>
       <w:tblGrid>
-        <w:gridCol w:w="2053"/>
-        <w:gridCol w:w="4106"/>
-        <w:gridCol w:w="1760"/>
+        <w:gridCol w:w="1980"/>
+        <w:gridCol w:w="3960"/>
+        <w:gridCol w:w="1980"/>
       </w:tblGrid>
       <w:tr>
         <w:trPr>
@@ -1744,7 +1745,7 @@
               <w:jc w:val="left"/>
             </w:pPr>
             <w:r>
-              <w:t xml:space="preserve">Onde</w:t>
+              <w:t xml:space="preserve">Local</w:t>
             </w:r>
           </w:p>
         </w:tc>
@@ -1781,7 +1782,7 @@
               <w:pStyle w:val="Compact"/>
               <w:jc w:val="left"/>
             </w:pPr>
-            <w:hyperlink r:id="rId36">
+            <w:hyperlink r:id="rId32">
               <w:r>
                 <w:rPr>
                   <w:rStyle w:val="Hyperlink"/>
@@ -1824,7 +1825,7 @@
               <w:pStyle w:val="Compact"/>
               <w:jc w:val="left"/>
             </w:pPr>
-            <w:hyperlink r:id="rId37">
+            <w:hyperlink r:id="rId33">
               <w:r>
                 <w:rPr>
                   <w:rStyle w:val="VerbatimChar"/>
@@ -1836,14 +1837,14 @@
         </w:tc>
       </w:tr>
     </w:tbl>
-    <w:bookmarkEnd w:id="38"/>
-    <w:bookmarkStart w:id="39" w:name="pendente-prazo-28-2906"/>
+    <w:bookmarkEnd w:id="34"/>
+    <w:bookmarkStart w:id="35" w:name="pendente-prazo-28-2906"/>
     <w:p>
       <w:pPr>
         <w:pStyle w:val="Heading3"/>
       </w:pPr>
       <w:r>
-        <w:t xml:space="preserve"> Pendente (prazo: 28-29/06)</w:t>
+        <w:t xml:space="preserve">Pendente (prazo: 28-29/06)</w:t>
       </w:r>
     </w:p>
     <w:tbl>
@@ -1945,7 +1946,7 @@
               <w:jc w:val="left"/>
             </w:pPr>
             <w:r>
-              <w:t xml:space="preserve">Slides da apresentação (.pptx)</w:t>
+              <w:t xml:space="preserve">Slides da apresentação</w:t>
             </w:r>
           </w:p>
         </w:tc>
@@ -2013,47 +2014,626 @@
         </w:tc>
       </w:tr>
     </w:tbl>
-    <w:bookmarkEnd w:id="39"/>
-    <w:bookmarkEnd w:id="40"/>
-    <w:bookmarkStart w:id="43" w:name="prioridade-materiais-acadêmicos-finais"/>
     <w:p>
+      <w:r>
+        <w:pict>
+          <v:rect style="width:0;height:1.5pt" o:hralign="center" o:hrstd="t" o:hr="t"/>
+        </w:pict>
+      </w:r>
+    </w:p>
+    <w:bookmarkEnd w:id="35"/>
+    <w:bookmarkEnd w:id="36"/>
+    <w:bookmarkStart w:id="37" w:name="documentos-finais"/>
+    <w:p>
       <w:pPr>
         <w:pStyle w:val="Heading2"/>
       </w:pPr>
       <w:r>
-        <w:t xml:space="preserve">5.  PRIORIDADE: Materiais Acadêmicos Finais</w:t>
+        <w:t xml:space="preserve">5. Documentos Finais</w:t>
       </w:r>
     </w:p>
-    <w:bookmarkStart w:id="41" w:name="pipeline-de-geração"/>
+    <w:tbl>
+      <w:tblPr>
+        <w:tblStyle w:val="Table"/>
+        <w:tblW w:type="auto" w:w="0"/>
+        <w:tblLook w:firstRow="1" w:lastRow="0" w:firstColumn="0" w:lastColumn="0" w:noHBand="0" w:noVBand="0" w:val="0020"/>
+      </w:tblPr>
+      <w:tblGrid>
+        <w:gridCol w:w="2640"/>
+        <w:gridCol w:w="2640"/>
+        <w:gridCol w:w="2640"/>
+      </w:tblGrid>
+      <w:tr>
+        <w:trPr>
+          <w:tblHeader w:val="on"/>
+        </w:trPr>
+        <w:tc>
+          <w:tcPr/>
+          <w:p>
+            <w:pPr>
+              <w:pStyle w:val="Compact"/>
+              <w:jc w:val="left"/>
+            </w:pPr>
+            <w:r>
+              <w:t xml:space="preserve">Documento</w:t>
+            </w:r>
+          </w:p>
+        </w:tc>
+        <w:tc>
+          <w:tcPr/>
+          <w:p>
+            <w:pPr>
+              <w:pStyle w:val="Compact"/>
+              <w:jc w:val="left"/>
+            </w:pPr>
+            <w:r>
+              <w:t xml:space="preserve">Formato</w:t>
+            </w:r>
+          </w:p>
+        </w:tc>
+        <w:tc>
+          <w:tcPr/>
+          <w:p>
+            <w:pPr>
+              <w:pStyle w:val="Compact"/>
+              <w:jc w:val="center"/>
+            </w:pPr>
+            <w:r>
+              <w:t xml:space="preserve">Situação</w:t>
+            </w:r>
+          </w:p>
+        </w:tc>
+      </w:tr>
+      <w:tr>
+        <w:tc>
+          <w:tcPr/>
+          <w:p>
+            <w:pPr>
+              <w:pStyle w:val="Compact"/>
+              <w:jc w:val="left"/>
+            </w:pPr>
+            <w:r>
+              <w:t xml:space="preserve">Problema Real</w:t>
+            </w:r>
+          </w:p>
+        </w:tc>
+        <w:tc>
+          <w:tcPr/>
+          <w:p>
+            <w:pPr>
+              <w:pStyle w:val="Compact"/>
+              <w:jc w:val="left"/>
+            </w:pPr>
+            <w:r>
+              <w:t xml:space="preserve">DOCX</w:t>
+            </w:r>
+          </w:p>
+        </w:tc>
+        <w:tc>
+          <w:tcPr/>
+          <w:p>
+            <w:pPr>
+              <w:pStyle w:val="Compact"/>
+              <w:jc w:val="center"/>
+            </w:pPr>
+            <w:r>
+              <w:t xml:space="preserve">Converter</w:t>
+            </w:r>
+          </w:p>
+        </w:tc>
+      </w:tr>
+      <w:tr>
+        <w:tc>
+          <w:tcPr/>
+          <w:p>
+            <w:pPr>
+              <w:pStyle w:val="Compact"/>
+              <w:jc w:val="left"/>
+            </w:pPr>
+            <w:r>
+              <w:t xml:space="preserve">Casos Existentes</w:t>
+            </w:r>
+          </w:p>
+        </w:tc>
+        <w:tc>
+          <w:tcPr/>
+          <w:p>
+            <w:pPr>
+              <w:pStyle w:val="Compact"/>
+              <w:jc w:val="left"/>
+            </w:pPr>
+            <w:r>
+              <w:t xml:space="preserve">DOCX</w:t>
+            </w:r>
+          </w:p>
+        </w:tc>
+        <w:tc>
+          <w:tcPr/>
+          <w:p>
+            <w:pPr>
+              <w:pStyle w:val="Compact"/>
+              <w:jc w:val="center"/>
+            </w:pPr>
+            <w:r>
+              <w:t xml:space="preserve">Em elaboração</w:t>
+            </w:r>
+          </w:p>
+        </w:tc>
+      </w:tr>
+      <w:tr>
+        <w:tc>
+          <w:tcPr/>
+          <w:p>
+            <w:pPr>
+              <w:pStyle w:val="Compact"/>
+              <w:jc w:val="left"/>
+            </w:pPr>
+            <w:r>
+              <w:t xml:space="preserve">Proposta</w:t>
+            </w:r>
+          </w:p>
+        </w:tc>
+        <w:tc>
+          <w:tcPr/>
+          <w:p>
+            <w:pPr>
+              <w:pStyle w:val="Compact"/>
+              <w:jc w:val="left"/>
+            </w:pPr>
+            <w:r>
+              <w:t xml:space="preserve">DOCX</w:t>
+            </w:r>
+          </w:p>
+        </w:tc>
+        <w:tc>
+          <w:tcPr/>
+          <w:p>
+            <w:pPr>
+              <w:pStyle w:val="Compact"/>
+              <w:jc w:val="center"/>
+            </w:pPr>
+            <w:r>
+              <w:t xml:space="preserve">Finalizar e converter</w:t>
+            </w:r>
+          </w:p>
+        </w:tc>
+      </w:tr>
+      <w:tr>
+        <w:tc>
+          <w:tcPr/>
+          <w:p>
+            <w:pPr>
+              <w:pStyle w:val="Compact"/>
+              <w:jc w:val="left"/>
+            </w:pPr>
+            <w:r>
+              <w:t xml:space="preserve">Fluxograma</w:t>
+            </w:r>
+          </w:p>
+        </w:tc>
+        <w:tc>
+          <w:tcPr/>
+          <w:p>
+            <w:pPr>
+              <w:pStyle w:val="Compact"/>
+              <w:jc w:val="left"/>
+            </w:pPr>
+            <w:r>
+              <w:t xml:space="preserve">PDF + JPEG + DOCX</w:t>
+            </w:r>
+          </w:p>
+        </w:tc>
+        <w:tc>
+          <w:tcPr/>
+          <w:p>
+            <w:pPr>
+              <w:pStyle w:val="Compact"/>
+              <w:jc w:val="center"/>
+            </w:pPr>
+            <w:r>
+              <w:t xml:space="preserve">Converter</w:t>
+            </w:r>
+          </w:p>
+        </w:tc>
+      </w:tr>
+      <w:tr>
+        <w:tc>
+          <w:tcPr/>
+          <w:p>
+            <w:pPr>
+              <w:pStyle w:val="Compact"/>
+              <w:jc w:val="left"/>
+            </w:pPr>
+            <w:r>
+              <w:t xml:space="preserve">Protótipo</w:t>
+            </w:r>
+          </w:p>
+        </w:tc>
+        <w:tc>
+          <w:tcPr/>
+          <w:p>
+            <w:pPr>
+              <w:pStyle w:val="Compact"/>
+              <w:jc w:val="left"/>
+            </w:pPr>
+            <w:r>
+              <w:t xml:space="preserve">PDF com prints</w:t>
+            </w:r>
+          </w:p>
+        </w:tc>
+        <w:tc>
+          <w:tcPr/>
+          <w:p>
+            <w:pPr>
+              <w:pStyle w:val="Compact"/>
+              <w:jc w:val="center"/>
+            </w:pPr>
+            <w:r>
+              <w:t xml:space="preserve">Em produção no Figma</w:t>
+            </w:r>
+          </w:p>
+        </w:tc>
+      </w:tr>
+      <w:tr>
+        <w:tc>
+          <w:tcPr/>
+          <w:p>
+            <w:pPr>
+              <w:pStyle w:val="Compact"/>
+              <w:jc w:val="left"/>
+            </w:pPr>
+            <w:r>
+              <w:t xml:space="preserve">Slides</w:t>
+            </w:r>
+          </w:p>
+        </w:tc>
+        <w:tc>
+          <w:tcPr/>
+          <w:p>
+            <w:pPr>
+              <w:pStyle w:val="Compact"/>
+              <w:jc w:val="left"/>
+            </w:pPr>
+            <w:r>
+              <w:t xml:space="preserve">PPTX</w:t>
+            </w:r>
+          </w:p>
+        </w:tc>
+        <w:tc>
+          <w:tcPr/>
+          <w:p>
+            <w:pPr>
+              <w:pStyle w:val="Compact"/>
+              <w:jc w:val="center"/>
+            </w:pPr>
+            <w:r>
+              <w:t xml:space="preserve">Criar</w:t>
+            </w:r>
+          </w:p>
+        </w:tc>
+      </w:tr>
+      <w:tr>
+        <w:tc>
+          <w:tcPr/>
+          <w:p>
+            <w:pPr>
+              <w:pStyle w:val="Compact"/>
+              <w:jc w:val="left"/>
+            </w:pPr>
+            <w:r>
+              <w:t xml:space="preserve">Roteiro</w:t>
+            </w:r>
+          </w:p>
+        </w:tc>
+        <w:tc>
+          <w:tcPr/>
+          <w:p>
+            <w:pPr>
+              <w:pStyle w:val="Compact"/>
+              <w:jc w:val="left"/>
+            </w:pPr>
+            <w:r>
+              <w:t xml:space="preserve">DOCX</w:t>
+            </w:r>
+          </w:p>
+        </w:tc>
+        <w:tc>
+          <w:tcPr/>
+          <w:p>
+            <w:pPr>
+              <w:pStyle w:val="Compact"/>
+              <w:jc w:val="center"/>
+            </w:pPr>
+            <w:r>
+              <w:t xml:space="preserve">Criar</w:t>
+            </w:r>
+          </w:p>
+        </w:tc>
+      </w:tr>
+      <w:tr>
+        <w:tc>
+          <w:tcPr/>
+          <w:p>
+            <w:pPr>
+              <w:pStyle w:val="Compact"/>
+              <w:jc w:val="left"/>
+            </w:pPr>
+            <w:r>
+              <w:t xml:space="preserve">Relatório do Projeto</w:t>
+            </w:r>
+          </w:p>
+        </w:tc>
+        <w:tc>
+          <w:tcPr/>
+          <w:p>
+            <w:pPr>
+              <w:pStyle w:val="Compact"/>
+              <w:jc w:val="left"/>
+            </w:pPr>
+            <w:r>
+              <w:t xml:space="preserve">DOCX + PDF</w:t>
+            </w:r>
+          </w:p>
+        </w:tc>
+        <w:tc>
+          <w:tcPr/>
+          <w:p>
+            <w:pPr>
+              <w:pStyle w:val="Compact"/>
+              <w:jc w:val="center"/>
+            </w:pPr>
+            <w:r>
+              <w:t xml:space="preserve">Consolidar</w:t>
+            </w:r>
+          </w:p>
+        </w:tc>
+      </w:tr>
+    </w:tbl>
     <w:p>
-      <w:pPr>
-        <w:pStyle w:val="Heading3"/>
-      </w:pPr>
-      <w:r>
-        <w:t xml:space="preserve">Pipeline de Geração</w:t>
+      <w:r>
+        <w:pict>
+          <v:rect style="width:0;height:1.5pt" o:hralign="center" o:hrstd="t" o:hr="t"/>
+        </w:pict>
+      </w:r>
+    </w:p>
+    <w:bookmarkEnd w:id="37"/>
+    <w:bookmarkStart w:id="39" w:name="status-atual"/>
+    <w:p>
+      <w:pPr>
+        <w:pStyle w:val="Heading2"/>
+      </w:pPr>
+      <w:r>
+        <w:t xml:space="preserve">6. Status Atual</w:t>
       </w:r>
     </w:p>
     <w:p>
       <w:pPr>
+        <w:pStyle w:val="Compact"/>
+        <w:numPr>
+          <w:ilvl w:val="0"/>
+          <w:numId w:val="1001"/>
+        </w:numPr>
+      </w:pPr>
+      <w:r>
+        <w:rPr>
+          <w:b/>
+          <w:bCs/>
+        </w:rPr>
+        <w:t xml:space="preserve">Nome do projeto:</w:t>
+      </w:r>
+      <w:r>
+        <w:t xml:space="preserve"> </w:t>
+      </w:r>
+      <w:r>
+        <w:t xml:space="preserve">MinhaFila (substitui FilaClara — escopo ampliado para múltiplos setores)</w:t>
+      </w:r>
+    </w:p>
+    <w:p>
+      <w:pPr>
+        <w:pStyle w:val="Compact"/>
+        <w:numPr>
+          <w:ilvl w:val="0"/>
+          <w:numId w:val="1001"/>
+        </w:numPr>
+      </w:pPr>
+      <w:r>
+        <w:rPr>
+          <w:b/>
+          <w:bCs/>
+        </w:rPr>
+        <w:t xml:space="preserve">Escopo:</w:t>
+      </w:r>
+      <w:r>
+        <w:t xml:space="preserve"> </w:t>
+      </w:r>
+      <w:r>
+        <w:t xml:space="preserve">bancos, unidades de saúde, faculdades, comércio, serviços públicos</w:t>
+      </w:r>
+    </w:p>
+    <w:p>
+      <w:pPr>
+        <w:pStyle w:val="Compact"/>
+        <w:numPr>
+          <w:ilvl w:val="0"/>
+          <w:numId w:val="1001"/>
+        </w:numPr>
+      </w:pPr>
+      <w:r>
+        <w:rPr>
+          <w:b/>
+          <w:bCs/>
+        </w:rPr>
+        <w:t xml:space="preserve">Acessibilidade:</w:t>
+      </w:r>
+      <w:r>
+        <w:t xml:space="preserve"> </w:t>
+      </w:r>
+      <w:r>
+        <w:t xml:space="preserve">recurso importante do produto (não é mais o pilar central); inclui suporte para TEA, deficiência auditiva, baixa visão, idosos e gestantes</w:t>
+      </w:r>
+    </w:p>
+    <w:p>
+      <w:pPr>
+        <w:pStyle w:val="Compact"/>
+        <w:numPr>
+          <w:ilvl w:val="0"/>
+          <w:numId w:val="1001"/>
+        </w:numPr>
+      </w:pPr>
+      <w:r>
+        <w:rPr>
+          <w:b/>
+          <w:bCs/>
+        </w:rPr>
+        <w:t xml:space="preserve">Fluxograma:</w:t>
+      </w:r>
+      <w:r>
+        <w:t xml:space="preserve"> </w:t>
+      </w:r>
+      <w:r>
+        <w:t xml:space="preserve">finalizado e documentado</w:t>
+      </w:r>
+    </w:p>
+    <w:p>
+      <w:pPr>
+        <w:pStyle w:val="Compact"/>
+        <w:numPr>
+          <w:ilvl w:val="0"/>
+          <w:numId w:val="1001"/>
+        </w:numPr>
+      </w:pPr>
+      <w:r>
+        <w:rPr>
+          <w:b/>
+          <w:bCs/>
+        </w:rPr>
+        <w:t xml:space="preserve">Protótipo:</w:t>
+      </w:r>
+      <w:r>
+        <w:t xml:space="preserve"> </w:t>
+      </w:r>
+      <w:r>
+        <w:t xml:space="preserve">versão inicial disponível em</w:t>
+      </w:r>
+      <w:r>
+        <w:t xml:space="preserve"> </w:t>
+      </w:r>
+      <w:hyperlink r:id="rId38">
+        <w:r>
+          <w:rPr>
+            <w:rStyle w:val="VerbatimChar"/>
+          </w:rPr>
+          <w:t xml:space="preserve">prototipo-minhafila/</w:t>
+        </w:r>
+      </w:hyperlink>
+    </w:p>
+    <w:p>
+      <w:pPr>
+        <w:pStyle w:val="Compact"/>
+        <w:numPr>
+          <w:ilvl w:val="0"/>
+          <w:numId w:val="1001"/>
+        </w:numPr>
+      </w:pPr>
+      <w:r>
+        <w:rPr>
+          <w:b/>
+          <w:bCs/>
+        </w:rPr>
+        <w:t xml:space="preserve">Histórico do WhatsApp:</w:t>
+      </w:r>
+      <w:r>
+        <w:t xml:space="preserve"> </w:t>
+      </w:r>
+      <w:r>
+        <w:t xml:space="preserve">519 mensagens (05/06 a 25/06) em</w:t>
+      </w:r>
+      <w:r>
+        <w:t xml:space="preserve"> </w:t>
+      </w:r>
+      <w:hyperlink r:id="rId27">
+        <w:r>
+          <w:rPr>
+            <w:rStyle w:val="VerbatimChar"/>
+          </w:rPr>
+          <w:t xml:space="preserve">historico-whatsapp.json</w:t>
+        </w:r>
+      </w:hyperlink>
+    </w:p>
+    <w:p>
+      <w:pPr>
+        <w:pStyle w:val="Compact"/>
+        <w:numPr>
+          <w:ilvl w:val="0"/>
+          <w:numId w:val="1001"/>
+        </w:numPr>
+      </w:pPr>
+      <w:r>
+        <w:rPr>
+          <w:b/>
+          <w:bCs/>
+        </w:rPr>
+        <w:t xml:space="preserve">GitHub Pages:</w:t>
+      </w:r>
+      <w:r>
+        <w:t xml:space="preserve"> </w:t>
+      </w:r>
+      <w:r>
+        <w:t xml:space="preserve">https://deivisan.github.io/Metodologia-EAD/</w:t>
+      </w:r>
+    </w:p>
+    <w:p>
+      <w:r>
+        <w:pict>
+          <v:rect style="width:0;height:1.5pt" o:hralign="center" o:hrstd="t" o:hr="t"/>
+        </w:pict>
+      </w:r>
+    </w:p>
+    <w:bookmarkEnd w:id="39"/>
+    <w:bookmarkStart w:id="40" w:name="fundamentação"/>
+    <w:p>
+      <w:pPr>
+        <w:pStyle w:val="Heading2"/>
+      </w:pPr>
+      <w:r>
+        <w:t xml:space="preserve">7. Fundamentação</w:t>
+      </w:r>
+    </w:p>
+    <w:p>
+      <w:pPr>
         <w:pStyle w:val="FirstParagraph"/>
       </w:pPr>
       <w:r>
-        <w:t xml:space="preserve">Cada documento</w:t>
-      </w:r>
-      <w:r>
-        <w:t xml:space="preserve"> </w:t>
-      </w:r>
+        <w:t xml:space="preserve">O problema real está fundamentado em literatura consolidada (Aggarwal, Chianca, Clemente, Farias, Giannotti, Ha, Jonsson, Kessel, Melo, Thompson, entre outros). A pergunta central que orienta o projeto:</w:t>
+      </w:r>
+    </w:p>
+    <w:p>
+      <w:pPr>
+        <w:pStyle w:val="BodyText"/>
+      </w:pPr>
       <w:r>
         <w:rPr>
-          <w:rStyle w:val="VerbatimChar"/>
+          <w:i/>
+          <w:iCs/>
         </w:rPr>
-        <w:t xml:space="preserve">.md</w:t>
-      </w:r>
-      <w:r>
-        <w:t xml:space="preserve"> </w:t>
-      </w:r>
-      <w:r>
-        <w:t xml:space="preserve">precisa ser convertido para o formato acadêmico adequado:</w:t>
+        <w:t xml:space="preserve">“Como reduzir o tempo de permanência física dos usuários em filas de diferentes setores e aumentar a previsibilidade do atendimento por meio de uma solução digital acessível?”</w:t>
+      </w:r>
+    </w:p>
+    <w:p>
+      <w:r>
+        <w:pict>
+          <v:rect style="width:0;height:1.5pt" o:hralign="center" o:hrstd="t" o:hr="t"/>
+        </w:pict>
+      </w:r>
+    </w:p>
+    <w:bookmarkEnd w:id="40"/>
+    <w:bookmarkStart w:id="44" w:name="links-rápidos"/>
+    <w:p>
+      <w:pPr>
+        <w:pStyle w:val="Heading2"/>
+      </w:pPr>
+      <w:r>
+        <w:t xml:space="preserve">8. Links Rápidos</w:t>
       </w:r>
     </w:p>
     <w:tbl>
@@ -2064,10 +2644,8 @@
         <w:tblLook w:firstRow="1" w:lastRow="0" w:firstColumn="0" w:lastColumn="0" w:noHBand="0" w:noVBand="0" w:val="0020"/>
       </w:tblPr>
       <w:tblGrid>
-        <w:gridCol w:w="1742"/>
-        <w:gridCol w:w="3168"/>
-        <w:gridCol w:w="1742"/>
-        <w:gridCol w:w="1267"/>
+        <w:gridCol w:w="4264"/>
+        <w:gridCol w:w="3655"/>
       </w:tblGrid>
       <w:tr>
         <w:trPr>
@@ -2081,1163 +2659,7 @@
               <w:jc w:val="left"/>
             </w:pPr>
             <w:r>
-              <w:t xml:space="preserve">Documento</w:t>
-            </w:r>
-          </w:p>
-        </w:tc>
-        <w:tc>
-          <w:tcPr/>
-          <w:p>
-            <w:pPr>
-              <w:pStyle w:val="Compact"/>
-              <w:jc w:val="left"/>
-            </w:pPr>
-            <w:r>
-              <w:t xml:space="preserve">Formato de entrega</w:t>
-            </w:r>
-          </w:p>
-        </w:tc>
-        <w:tc>
-          <w:tcPr/>
-          <w:p>
-            <w:pPr>
-              <w:pStyle w:val="Compact"/>
-              <w:jc w:val="left"/>
-            </w:pPr>
-            <w:r>
-              <w:t xml:space="preserve">Conversão</w:t>
-            </w:r>
-          </w:p>
-        </w:tc>
-        <w:tc>
-          <w:tcPr/>
-          <w:p>
-            <w:pPr>
-              <w:pStyle w:val="Compact"/>
-              <w:jc w:val="center"/>
-            </w:pPr>
-            <w:r>
-              <w:t xml:space="preserve">Status</w:t>
-            </w:r>
-          </w:p>
-        </w:tc>
-      </w:tr>
-      <w:tr>
-        <w:tc>
-          <w:tcPr/>
-          <w:p>
-            <w:pPr>
-              <w:pStyle w:val="Compact"/>
-              <w:jc w:val="left"/>
-            </w:pPr>
-            <w:r>
-              <w:rPr>
-                <w:b/>
-                <w:bCs/>
-              </w:rPr>
-              <w:t xml:space="preserve">Problema Real</w:t>
-            </w:r>
-          </w:p>
-        </w:tc>
-        <w:tc>
-          <w:tcPr/>
-          <w:p>
-            <w:pPr>
-              <w:pStyle w:val="Compact"/>
-              <w:jc w:val="left"/>
-            </w:pPr>
-            <w:r>
-              <w:rPr>
-                <w:rStyle w:val="VerbatimChar"/>
-              </w:rPr>
-              <w:t xml:space="preserve">.docx</w:t>
-            </w:r>
-            <w:r>
-              <w:t xml:space="preserve"> </w:t>
-            </w:r>
-            <w:r>
-              <w:t xml:space="preserve">(Word ABNT)</w:t>
-            </w:r>
-          </w:p>
-        </w:tc>
-        <w:tc>
-          <w:tcPr/>
-          <w:p>
-            <w:pPr>
-              <w:pStyle w:val="Compact"/>
-              <w:jc w:val="left"/>
-            </w:pPr>
-            <w:r>
-              <w:rPr>
-                <w:rStyle w:val="VerbatimChar"/>
-              </w:rPr>
-              <w:t xml:space="preserve">pandoc</w:t>
-            </w:r>
-          </w:p>
-        </w:tc>
-        <w:tc>
-          <w:tcPr/>
-          <w:p>
-            <w:pPr>
-              <w:pStyle w:val="Compact"/>
-              <w:jc w:val="center"/>
-            </w:pPr>
-            <w:r>
-              <w:t xml:space="preserve"> Converter</w:t>
-            </w:r>
-          </w:p>
-        </w:tc>
-      </w:tr>
-      <w:tr>
-        <w:tc>
-          <w:tcPr/>
-          <w:p>
-            <w:pPr>
-              <w:pStyle w:val="Compact"/>
-              <w:jc w:val="left"/>
-            </w:pPr>
-            <w:r>
-              <w:rPr>
-                <w:b/>
-                <w:bCs/>
-              </w:rPr>
-              <w:t xml:space="preserve">Casos Existentes</w:t>
-            </w:r>
-          </w:p>
-        </w:tc>
-        <w:tc>
-          <w:tcPr/>
-          <w:p>
-            <w:pPr>
-              <w:pStyle w:val="Compact"/>
-              <w:jc w:val="left"/>
-            </w:pPr>
-            <w:r>
-              <w:rPr>
-                <w:rStyle w:val="VerbatimChar"/>
-              </w:rPr>
-              <w:t xml:space="preserve">.docx</w:t>
-            </w:r>
-            <w:r>
-              <w:t xml:space="preserve"> </w:t>
-            </w:r>
-            <w:r>
-              <w:t xml:space="preserve">(Word ABNT)</w:t>
-            </w:r>
-          </w:p>
-        </w:tc>
-        <w:tc>
-          <w:tcPr/>
-          <w:p>
-            <w:pPr>
-              <w:pStyle w:val="Compact"/>
-              <w:jc w:val="left"/>
-            </w:pPr>
-            <w:r>
-              <w:rPr>
-                <w:rStyle w:val="VerbatimChar"/>
-              </w:rPr>
-              <w:t xml:space="preserve">pandoc</w:t>
-            </w:r>
-          </w:p>
-        </w:tc>
-        <w:tc>
-          <w:tcPr/>
-          <w:p>
-            <w:pPr>
-              <w:pStyle w:val="Compact"/>
-              <w:jc w:val="center"/>
-            </w:pPr>
-            <w:r>
-              <w:t xml:space="preserve"> Aguardando conteúdo</w:t>
-            </w:r>
-          </w:p>
-        </w:tc>
-      </w:tr>
-      <w:tr>
-        <w:tc>
-          <w:tcPr/>
-          <w:p>
-            <w:pPr>
-              <w:pStyle w:val="Compact"/>
-              <w:jc w:val="left"/>
-            </w:pPr>
-            <w:r>
-              <w:rPr>
-                <w:b/>
-                <w:bCs/>
-              </w:rPr>
-              <w:t xml:space="preserve">Proposta</w:t>
-            </w:r>
-          </w:p>
-        </w:tc>
-        <w:tc>
-          <w:tcPr/>
-          <w:p>
-            <w:pPr>
-              <w:pStyle w:val="Compact"/>
-              <w:jc w:val="left"/>
-            </w:pPr>
-            <w:r>
-              <w:rPr>
-                <w:rStyle w:val="VerbatimChar"/>
-              </w:rPr>
-              <w:t xml:space="preserve">.docx</w:t>
-            </w:r>
-            <w:r>
-              <w:t xml:space="preserve"> </w:t>
-            </w:r>
-            <w:r>
-              <w:t xml:space="preserve">(Word ABNT)</w:t>
-            </w:r>
-          </w:p>
-        </w:tc>
-        <w:tc>
-          <w:tcPr/>
-          <w:p>
-            <w:pPr>
-              <w:pStyle w:val="Compact"/>
-              <w:jc w:val="left"/>
-            </w:pPr>
-            <w:r>
-              <w:rPr>
-                <w:rStyle w:val="VerbatimChar"/>
-              </w:rPr>
-              <w:t xml:space="preserve">pandoc</w:t>
-            </w:r>
-          </w:p>
-        </w:tc>
-        <w:tc>
-          <w:tcPr/>
-          <w:p>
-            <w:pPr>
-              <w:pStyle w:val="Compact"/>
-              <w:jc w:val="center"/>
-            </w:pPr>
-            <w:r>
-              <w:t xml:space="preserve"> Finalizar + converter</w:t>
-            </w:r>
-          </w:p>
-        </w:tc>
-      </w:tr>
-      <w:tr>
-        <w:tc>
-          <w:tcPr/>
-          <w:p>
-            <w:pPr>
-              <w:pStyle w:val="Compact"/>
-              <w:jc w:val="left"/>
-            </w:pPr>
-            <w:r>
-              <w:rPr>
-                <w:b/>
-                <w:bCs/>
-              </w:rPr>
-              <w:t xml:space="preserve">Fluxograma</w:t>
-            </w:r>
-          </w:p>
-        </w:tc>
-        <w:tc>
-          <w:tcPr/>
-          <w:p>
-            <w:pPr>
-              <w:pStyle w:val="Compact"/>
-              <w:jc w:val="left"/>
-            </w:pPr>
-            <w:r>
-              <w:rPr>
-                <w:rStyle w:val="VerbatimChar"/>
-              </w:rPr>
-              <w:t xml:space="preserve">.pdf</w:t>
-            </w:r>
-            <w:r>
-              <w:t xml:space="preserve"> </w:t>
-            </w:r>
-            <w:r>
-              <w:t xml:space="preserve">+</w:t>
-            </w:r>
-            <w:r>
-              <w:t xml:space="preserve"> </w:t>
-            </w:r>
-            <w:r>
-              <w:rPr>
-                <w:rStyle w:val="VerbatimChar"/>
-              </w:rPr>
-              <w:t xml:space="preserve">.jpeg</w:t>
-            </w:r>
-            <w:r>
-              <w:t xml:space="preserve"> </w:t>
-            </w:r>
-            <w:r>
-              <w:t xml:space="preserve">+</w:t>
-            </w:r>
-            <w:r>
-              <w:t xml:space="preserve"> </w:t>
-            </w:r>
-            <w:r>
-              <w:rPr>
-                <w:rStyle w:val="VerbatimChar"/>
-              </w:rPr>
-              <w:t xml:space="preserve">.docx</w:t>
-            </w:r>
-          </w:p>
-        </w:tc>
-        <w:tc>
-          <w:tcPr/>
-          <w:p>
-            <w:pPr>
-              <w:pStyle w:val="Compact"/>
-              <w:jc w:val="left"/>
-            </w:pPr>
-            <w:r>
-              <w:rPr>
-                <w:rStyle w:val="VerbatimChar"/>
-              </w:rPr>
-              <w:t xml:space="preserve">pandoc</w:t>
-            </w:r>
-            <w:r>
-              <w:t xml:space="preserve"> </w:t>
-            </w:r>
-            <w:r>
-              <w:t xml:space="preserve">+</w:t>
-            </w:r>
-            <w:r>
-              <w:t xml:space="preserve"> </w:t>
-            </w:r>
-            <w:r>
-              <w:rPr>
-                <w:rStyle w:val="VerbatimChar"/>
-              </w:rPr>
-              <w:t xml:space="preserve">img</w:t>
-            </w:r>
-          </w:p>
-        </w:tc>
-        <w:tc>
-          <w:tcPr/>
-          <w:p>
-            <w:pPr>
-              <w:pStyle w:val="Compact"/>
-              <w:jc w:val="center"/>
-            </w:pPr>
-            <w:r>
-              <w:t xml:space="preserve"> Fazer</w:t>
-            </w:r>
-            <w:r>
-              <w:t xml:space="preserve"> </w:t>
-            </w:r>
-            <w:r>
-              <w:rPr>
-                <w:rStyle w:val="VerbatimChar"/>
-              </w:rPr>
-              <w:t xml:space="preserve">.pdf</w:t>
-            </w:r>
-            <w:r>
-              <w:t xml:space="preserve"> </w:t>
-            </w:r>
-            <w:r>
-              <w:t xml:space="preserve">e</w:t>
-            </w:r>
-            <w:r>
-              <w:t xml:space="preserve"> </w:t>
-            </w:r>
-            <w:r>
-              <w:rPr>
-                <w:rStyle w:val="VerbatimChar"/>
-              </w:rPr>
-              <w:t xml:space="preserve">.docx</w:t>
-            </w:r>
-          </w:p>
-        </w:tc>
-      </w:tr>
-      <w:tr>
-        <w:tc>
-          <w:tcPr/>
-          <w:p>
-            <w:pPr>
-              <w:pStyle w:val="Compact"/>
-              <w:jc w:val="left"/>
-            </w:pPr>
-            <w:r>
-              <w:rPr>
-                <w:b/>
-                <w:bCs/>
-              </w:rPr>
-              <w:t xml:space="preserve">Protótipo</w:t>
-            </w:r>
-          </w:p>
-        </w:tc>
-        <w:tc>
-          <w:tcPr/>
-          <w:p>
-            <w:pPr>
-              <w:pStyle w:val="Compact"/>
-              <w:jc w:val="left"/>
-            </w:pPr>
-            <w:r>
-              <w:t xml:space="preserve">PDF com prints + link Figma</w:t>
-            </w:r>
-          </w:p>
-        </w:tc>
-        <w:tc>
-          <w:tcPr/>
-          <w:p>
-            <w:pPr>
-              <w:pStyle w:val="Compact"/>
-              <w:jc w:val="left"/>
-            </w:pPr>
-            <w:r>
-              <w:t xml:space="preserve">Screenshot</w:t>
-            </w:r>
-          </w:p>
-        </w:tc>
-        <w:tc>
-          <w:tcPr/>
-          <w:p>
-            <w:pPr>
-              <w:pStyle w:val="Compact"/>
-              <w:jc w:val="center"/>
-            </w:pPr>
-            <w:r>
-              <w:t xml:space="preserve"> Aguardando Figma</w:t>
-            </w:r>
-          </w:p>
-        </w:tc>
-      </w:tr>
-      <w:tr>
-        <w:tc>
-          <w:tcPr/>
-          <w:p>
-            <w:pPr>
-              <w:pStyle w:val="Compact"/>
-              <w:jc w:val="left"/>
-            </w:pPr>
-            <w:r>
-              <w:rPr>
-                <w:b/>
-                <w:bCs/>
-              </w:rPr>
-              <w:t xml:space="preserve">Slides</w:t>
-            </w:r>
-          </w:p>
-        </w:tc>
-        <w:tc>
-          <w:tcPr/>
-          <w:p>
-            <w:pPr>
-              <w:pStyle w:val="Compact"/>
-              <w:jc w:val="left"/>
-            </w:pPr>
-            <w:r>
-              <w:rPr>
-                <w:rStyle w:val="VerbatimChar"/>
-              </w:rPr>
-              <w:t xml:space="preserve">.pptx</w:t>
-            </w:r>
-            <w:r>
-              <w:t xml:space="preserve"> </w:t>
-            </w:r>
-            <w:r>
-              <w:t xml:space="preserve">(PowerPoint)</w:t>
-            </w:r>
-          </w:p>
-        </w:tc>
-        <w:tc>
-          <w:tcPr/>
-          <w:p>
-            <w:pPr>
-              <w:pStyle w:val="Compact"/>
-              <w:jc w:val="left"/>
-            </w:pPr>
-            <w:r>
-              <w:rPr>
-                <w:rStyle w:val="VerbatimChar"/>
-              </w:rPr>
-              <w:t xml:space="preserve">python-pptx</w:t>
-            </w:r>
-          </w:p>
-        </w:tc>
-        <w:tc>
-          <w:tcPr/>
-          <w:p>
-            <w:pPr>
-              <w:pStyle w:val="Compact"/>
-              <w:jc w:val="center"/>
-            </w:pPr>
-            <w:r>
-              <w:t xml:space="preserve"> Criar</w:t>
-            </w:r>
-          </w:p>
-        </w:tc>
-      </w:tr>
-      <w:tr>
-        <w:tc>
-          <w:tcPr/>
-          <w:p>
-            <w:pPr>
-              <w:pStyle w:val="Compact"/>
-              <w:jc w:val="left"/>
-            </w:pPr>
-            <w:r>
-              <w:rPr>
-                <w:b/>
-                <w:bCs/>
-              </w:rPr>
-              <w:t xml:space="preserve">Roteiro</w:t>
-            </w:r>
-          </w:p>
-        </w:tc>
-        <w:tc>
-          <w:tcPr/>
-          <w:p>
-            <w:pPr>
-              <w:pStyle w:val="Compact"/>
-              <w:jc w:val="left"/>
-            </w:pPr>
-            <w:r>
-              <w:rPr>
-                <w:rStyle w:val="VerbatimChar"/>
-              </w:rPr>
-              <w:t xml:space="preserve">.docx</w:t>
-            </w:r>
-            <w:r>
-              <w:t xml:space="preserve"> </w:t>
-            </w:r>
-            <w:r>
-              <w:t xml:space="preserve">(Word)</w:t>
-            </w:r>
-          </w:p>
-        </w:tc>
-        <w:tc>
-          <w:tcPr/>
-          <w:p>
-            <w:pPr>
-              <w:pStyle w:val="Compact"/>
-              <w:jc w:val="left"/>
-            </w:pPr>
-            <w:r>
-              <w:rPr>
-                <w:rStyle w:val="VerbatimChar"/>
-              </w:rPr>
-              <w:t xml:space="preserve">pandoc</w:t>
-            </w:r>
-          </w:p>
-        </w:tc>
-        <w:tc>
-          <w:tcPr/>
-          <w:p>
-            <w:pPr>
-              <w:pStyle w:val="Compact"/>
-              <w:jc w:val="center"/>
-            </w:pPr>
-            <w:r>
-              <w:t xml:space="preserve"> Criar</w:t>
-            </w:r>
-          </w:p>
-        </w:tc>
-      </w:tr>
-      <w:tr>
-        <w:tc>
-          <w:tcPr/>
-          <w:p>
-            <w:pPr>
-              <w:pStyle w:val="Compact"/>
-              <w:jc w:val="left"/>
-            </w:pPr>
-            <w:r>
-              <w:rPr>
-                <w:b/>
-                <w:bCs/>
-              </w:rPr>
-              <w:t xml:space="preserve">Relatório do Projeto</w:t>
-            </w:r>
-          </w:p>
-        </w:tc>
-        <w:tc>
-          <w:tcPr/>
-          <w:p>
-            <w:pPr>
-              <w:pStyle w:val="Compact"/>
-              <w:jc w:val="left"/>
-            </w:pPr>
-            <w:r>
-              <w:rPr>
-                <w:rStyle w:val="VerbatimChar"/>
-              </w:rPr>
-              <w:t xml:space="preserve">.docx</w:t>
-            </w:r>
-            <w:r>
-              <w:t xml:space="preserve"> </w:t>
-            </w:r>
-            <w:r>
-              <w:t xml:space="preserve">+</w:t>
-            </w:r>
-            <w:r>
-              <w:t xml:space="preserve"> </w:t>
-            </w:r>
-            <w:r>
-              <w:rPr>
-                <w:rStyle w:val="VerbatimChar"/>
-              </w:rPr>
-              <w:t xml:space="preserve">.pdf</w:t>
-            </w:r>
-            <w:r>
-              <w:t xml:space="preserve"> </w:t>
-            </w:r>
-            <w:r>
-              <w:t xml:space="preserve">(ABNT)</w:t>
-            </w:r>
-          </w:p>
-        </w:tc>
-        <w:tc>
-          <w:tcPr/>
-          <w:p>
-            <w:pPr>
-              <w:pStyle w:val="Compact"/>
-              <w:jc w:val="left"/>
-            </w:pPr>
-            <w:r>
-              <w:rPr>
-                <w:rStyle w:val="VerbatimChar"/>
-              </w:rPr>
-              <w:t xml:space="preserve">pandoc</w:t>
-            </w:r>
-            <w:r>
-              <w:t xml:space="preserve"> </w:t>
-            </w:r>
-            <w:r>
-              <w:t xml:space="preserve">+</w:t>
-            </w:r>
-            <w:r>
-              <w:t xml:space="preserve"> </w:t>
-            </w:r>
-            <w:r>
-              <w:rPr>
-                <w:rStyle w:val="VerbatimChar"/>
-              </w:rPr>
-              <w:t xml:space="preserve">weasyprint</w:t>
-            </w:r>
-          </w:p>
-        </w:tc>
-        <w:tc>
-          <w:tcPr/>
-          <w:p>
-            <w:pPr>
-              <w:pStyle w:val="Compact"/>
-              <w:jc w:val="center"/>
-            </w:pPr>
-            <w:r>
-              <w:t xml:space="preserve"> Consolidar</w:t>
-            </w:r>
-          </w:p>
-        </w:tc>
-      </w:tr>
-    </w:tbl>
-    <w:bookmarkEnd w:id="41"/>
-    <w:bookmarkStart w:id="42" w:name="scripts-de-automação-disponíveis"/>
-    <w:p>
-      <w:pPr>
-        <w:pStyle w:val="Heading3"/>
-      </w:pPr>
-      <w:r>
-        <w:t xml:space="preserve">Scripts de Automação Disponíveis</w:t>
-      </w:r>
-    </w:p>
-    <w:p>
-      <w:pPr>
-        <w:pStyle w:val="SourceCode"/>
-      </w:pPr>
-      <w:r>
-        <w:rPr>
-          <w:rStyle w:val="CommentTok"/>
-        </w:rPr>
-        <w:t xml:space="preserve"># Converter .md → .docx (Word)</w:t>
-      </w:r>
-      <w:r>
-        <w:br/>
-      </w:r>
-      <w:r>
-        <w:rPr>
-          <w:rStyle w:val="ExtensionTok"/>
-        </w:rPr>
-        <w:t xml:space="preserve">pandoc</w:t>
-      </w:r>
-      <w:r>
-        <w:rPr>
-          <w:rStyle w:val="NormalTok"/>
-        </w:rPr>
-        <w:t xml:space="preserve"> arquivo.md </w:t>
-      </w:r>
-      <w:r>
-        <w:rPr>
-          <w:rStyle w:val="AttributeTok"/>
-        </w:rPr>
-        <w:t xml:space="preserve">-o</w:t>
-      </w:r>
-      <w:r>
-        <w:rPr>
-          <w:rStyle w:val="NormalTok"/>
-        </w:rPr>
-        <w:t xml:space="preserve"> arquivo.docx</w:t>
-      </w:r>
-      <w:r>
-        <w:br/>
-      </w:r>
-      <w:r>
-        <w:br/>
-      </w:r>
-      <w:r>
-        <w:rPr>
-          <w:rStyle w:val="CommentTok"/>
-        </w:rPr>
-        <w:t xml:space="preserve"># Converter .md → .pdf (ABNT, da raiz do repo)</w:t>
-      </w:r>
-      <w:r>
-        <w:br/>
-      </w:r>
-      <w:r>
-        <w:rPr>
-          <w:rStyle w:val="ExtensionTok"/>
-        </w:rPr>
-        <w:t xml:space="preserve">pandoc</w:t>
-      </w:r>
-      <w:r>
-        <w:rPr>
-          <w:rStyle w:val="NormalTok"/>
-        </w:rPr>
-        <w:t xml:space="preserve"> arquivo.md </w:t>
-      </w:r>
-      <w:r>
-        <w:rPr>
-          <w:rStyle w:val="AttributeTok"/>
-        </w:rPr>
-        <w:t xml:space="preserve">-o</w:t>
-      </w:r>
-      <w:r>
-        <w:rPr>
-          <w:rStyle w:val="NormalTok"/>
-        </w:rPr>
-        <w:t xml:space="preserve"> arquivo.pdf </w:t>
-      </w:r>
-      <w:r>
-        <w:rPr>
-          <w:rStyle w:val="DataTypeTok"/>
-        </w:rPr>
-        <w:t xml:space="preserve">\</w:t>
-      </w:r>
-      <w:r>
-        <w:br/>
-      </w:r>
-      <w:r>
-        <w:rPr>
-          <w:rStyle w:val="NormalTok"/>
-        </w:rPr>
-        <w:t xml:space="preserve">  </w:t>
-      </w:r>
-      <w:r>
-        <w:rPr>
-          <w:rStyle w:val="AttributeTok"/>
-        </w:rPr>
-        <w:t xml:space="preserve">--pdf-engine</w:t>
-      </w:r>
-      <w:r>
-        <w:rPr>
-          <w:rStyle w:val="OperatorTok"/>
-        </w:rPr>
-        <w:t xml:space="preserve">=</w:t>
-      </w:r>
-      <w:r>
-        <w:rPr>
-          <w:rStyle w:val="NormalTok"/>
-        </w:rPr>
-        <w:t xml:space="preserve">weasyprint </w:t>
-      </w:r>
-      <w:r>
-        <w:rPr>
-          <w:rStyle w:val="DataTypeTok"/>
-        </w:rPr>
-        <w:t xml:space="preserve">\</w:t>
-      </w:r>
-      <w:r>
-        <w:br/>
-      </w:r>
-      <w:r>
-        <w:rPr>
-          <w:rStyle w:val="NormalTok"/>
-        </w:rPr>
-        <w:t xml:space="preserve">  </w:t>
-      </w:r>
-      <w:r>
-        <w:rPr>
-          <w:rStyle w:val="AttributeTok"/>
-        </w:rPr>
-        <w:t xml:space="preserve">-c</w:t>
-      </w:r>
-      <w:r>
-        <w:rPr>
-          <w:rStyle w:val="NormalTok"/>
-        </w:rPr>
-        <w:t xml:space="preserve"> templates/abnt-template.css</w:t>
-      </w:r>
-      <w:r>
-        <w:br/>
-      </w:r>
-      <w:r>
-        <w:br/>
-      </w:r>
-      <w:r>
-        <w:rPr>
-          <w:rStyle w:val="CommentTok"/>
-        </w:rPr>
-        <w:t xml:space="preserve"># Gerar slides .pptx (via script Python)</w:t>
-      </w:r>
-      <w:r>
-        <w:br/>
-      </w:r>
-      <w:r>
-        <w:rPr>
-          <w:rStyle w:val="ExtensionTok"/>
-        </w:rPr>
-        <w:t xml:space="preserve">python3</w:t>
-      </w:r>
-      <w:r>
-        <w:rPr>
-          <w:rStyle w:val="NormalTok"/>
-        </w:rPr>
-        <w:t xml:space="preserve"> scripts/gerar-slides.py</w:t>
-      </w:r>
-    </w:p>
-    <w:bookmarkEnd w:id="42"/>
-    <w:bookmarkEnd w:id="43"/>
-    <w:bookmarkStart w:id="50" w:name="status-atual-25062026"/>
-    <w:p>
-      <w:pPr>
-        <w:pStyle w:val="Heading2"/>
-      </w:pPr>
-      <w:r>
-        <w:t xml:space="preserve">6. Status Atual (25/06/2026)</w:t>
-      </w:r>
-    </w:p>
-    <w:bookmarkStart w:id="45" w:name="enquete-de-nomes-encerrada"/>
-    <w:p>
-      <w:pPr>
-        <w:pStyle w:val="Heading3"/>
-      </w:pPr>
-      <w:r>
-        <w:t xml:space="preserve"> Enquete de nomes  ENCERRADA</w:t>
-      </w:r>
-    </w:p>
-    <w:p>
-      <w:pPr>
-        <w:pStyle w:val="FirstParagraph"/>
-      </w:pPr>
-      <w:r>
-        <w:t xml:space="preserve">O nome escolhido é</w:t>
-      </w:r>
-      <w:r>
-        <w:t xml:space="preserve"> </w:t>
-      </w:r>
-      <w:r>
-        <w:rPr>
-          <w:b/>
-          <w:bCs/>
-        </w:rPr>
-        <w:t xml:space="preserve">FilaClara</w:t>
-      </w:r>
-      <w:r>
-        <w:t xml:space="preserve">! </w:t>
-      </w:r>
-      <w:r>
-        <w:t xml:space="preserve"> </w:t>
-      </w:r>
-      <w:r>
-        <w:t xml:space="preserve">- Enquete:</w:t>
-      </w:r>
-      <w:r>
-        <w:t xml:space="preserve"> </w:t>
-      </w:r>
-      <w:hyperlink r:id="rId44">
-        <w:r>
-          <w:rPr>
-            <w:rStyle w:val="Hyperlink"/>
-          </w:rPr>
-          <w:t xml:space="preserve">Google Forms</w:t>
-        </w:r>
-      </w:hyperlink>
-      <w:r>
-        <w:t xml:space="preserve"> </w:t>
-      </w:r>
-      <w:r>
-        <w:t xml:space="preserve">- Sugestões: FilaAcessível (Deivison), Sistema Inteligente de Gestão de Filas (Rios), Minha Fila (Marcos)</w:t>
-      </w:r>
-      <w:r>
-        <w:t xml:space="preserve"> </w:t>
-      </w:r>
-      <w:r>
-        <w:t xml:space="preserve">-</w:t>
-      </w:r>
-      <w:r>
-        <w:t xml:space="preserve"> </w:t>
-      </w:r>
-      <w:r>
-        <w:rPr>
-          <w:b/>
-          <w:bCs/>
-        </w:rPr>
-        <w:t xml:space="preserve">Vencedor: FilaClara</w:t>
-      </w:r>
-      <w:r>
-        <w:t xml:space="preserve"> </w:t>
-      </w:r>
-      <w:r>
-        <w:t xml:space="preserve">(já em uso no protótipo)</w:t>
-      </w:r>
-    </w:p>
-    <w:bookmarkEnd w:id="45"/>
-    <w:bookmarkStart w:id="46" w:name="fluxograma-finalizado"/>
-    <w:p>
-      <w:pPr>
-        <w:pStyle w:val="Heading3"/>
-      </w:pPr>
-      <w:r>
-        <w:t xml:space="preserve"> Fluxograma finalizado</w:t>
-      </w:r>
-    </w:p>
-    <w:p>
-      <w:pPr>
-        <w:pStyle w:val="FirstParagraph"/>
-      </w:pPr>
-      <w:r>
-        <w:t xml:space="preserve">Fluxo completo documentado em</w:t>
-      </w:r>
-      <w:r>
-        <w:t xml:space="preserve"> </w:t>
-      </w:r>
-      <w:hyperlink r:id="rId31">
-        <w:r>
-          <w:rPr>
-            <w:rStyle w:val="VerbatimChar"/>
-          </w:rPr>
-          <w:t xml:space="preserve">fluxograma.md</w:t>
-        </w:r>
-      </w:hyperlink>
-      <w:r>
-        <w:t xml:space="preserve"> </w:t>
-      </w:r>
-      <w:r>
-        <w:t xml:space="preserve">com base no JPEG original.</w:t>
-      </w:r>
-    </w:p>
-    <w:bookmarkEnd w:id="46"/>
-    <w:bookmarkStart w:id="47" w:name="uélinton-confirmado"/>
-    <w:p>
-      <w:pPr>
-        <w:pStyle w:val="Heading3"/>
-      </w:pPr>
-      <w:r>
-        <w:t xml:space="preserve"> Uélinton confirmado</w:t>
-      </w:r>
-    </w:p>
-    <w:p>
-      <w:pPr>
-        <w:pStyle w:val="FirstParagraph"/>
-      </w:pPr>
-      <w:r>
-        <w:t xml:space="preserve">Nome completo:</w:t>
-      </w:r>
-      <w:r>
-        <w:t xml:space="preserve"> </w:t>
-      </w:r>
-      <w:r>
-        <w:rPr>
-          <w:b/>
-          <w:bCs/>
-        </w:rPr>
-        <w:t xml:space="preserve">Uélinton Cardoso Santana</w:t>
-      </w:r>
-    </w:p>
-    <w:bookmarkEnd w:id="47"/>
-    <w:bookmarkStart w:id="48" w:name="histórico-do-whatsapp"/>
-    <w:p>
-      <w:pPr>
-        <w:pStyle w:val="Heading3"/>
-      </w:pPr>
-      <w:r>
-        <w:t xml:space="preserve"> Histórico do WhatsApp</w:t>
-      </w:r>
-    </w:p>
-    <w:p>
-      <w:pPr>
-        <w:pStyle w:val="FirstParagraph"/>
-      </w:pPr>
-      <w:r>
-        <w:t xml:space="preserve">519 mensagens (05/06 a 25/06) em</w:t>
-      </w:r>
-      <w:r>
-        <w:t xml:space="preserve"> </w:t>
-      </w:r>
-      <w:hyperlink r:id="rId29">
-        <w:r>
-          <w:rPr>
-            <w:rStyle w:val="VerbatimChar"/>
-          </w:rPr>
-          <w:t xml:space="preserve">historico-whatsapp.json</w:t>
-        </w:r>
-      </w:hyperlink>
-    </w:p>
-    <w:bookmarkEnd w:id="48"/>
-    <w:bookmarkStart w:id="49" w:name="github-pages-ativo"/>
-    <w:p>
-      <w:pPr>
-        <w:pStyle w:val="Heading3"/>
-      </w:pPr>
-      <w:r>
-        <w:t xml:space="preserve"> GitHub Pages ativo</w:t>
-      </w:r>
-    </w:p>
-    <w:p>
-      <w:pPr>
-        <w:pStyle w:val="FirstParagraph"/>
-      </w:pPr>
-      <w:r>
-        <w:t xml:space="preserve"> https://deivisan.github.io/Metodologia-EAD/</w:t>
-      </w:r>
-    </w:p>
-    <w:bookmarkEnd w:id="49"/>
-    <w:bookmarkEnd w:id="50"/>
-    <w:bookmarkStart w:id="51" w:name="o-que-já-está-sólido"/>
-    <w:p>
-      <w:pPr>
-        <w:pStyle w:val="Heading2"/>
-      </w:pPr>
-      <w:r>
-        <w:t xml:space="preserve">7. O Que Já Está Sólido</w:t>
-      </w:r>
-    </w:p>
-    <w:p>
-      <w:pPr>
-        <w:pStyle w:val="Compact"/>
-        <w:numPr>
-          <w:ilvl w:val="0"/>
-          <w:numId w:val="1001"/>
-        </w:numPr>
-      </w:pPr>
-      <w:r>
-        <w:t xml:space="preserve"> Tema escolhido + acessibilidade como pilar obrigatório</w:t>
-      </w:r>
-    </w:p>
-    <w:p>
-      <w:pPr>
-        <w:pStyle w:val="Compact"/>
-        <w:numPr>
-          <w:ilvl w:val="0"/>
-          <w:numId w:val="1001"/>
-        </w:numPr>
-      </w:pPr>
-      <w:r>
-        <w:t xml:space="preserve"> Problema real definido com fundamentação em literatura (Aggarwal, Chianca, Clemente, Farias, Giannotti, Ha, Jonsson, Kessel, Melo, Thompson etc.)</w:t>
-      </w:r>
-    </w:p>
-    <w:p>
-      <w:pPr>
-        <w:pStyle w:val="Compact"/>
-        <w:numPr>
-          <w:ilvl w:val="0"/>
-          <w:numId w:val="1001"/>
-        </w:numPr>
-      </w:pPr>
-      <w:r>
-        <w:t xml:space="preserve"> Pergunta central:</w:t>
-      </w:r>
-      <w:r>
-        <w:t xml:space="preserve"> </w:t>
-      </w:r>
-      <w:r>
-        <w:rPr>
-          <w:i/>
-          <w:iCs/>
-        </w:rPr>
-        <w:t xml:space="preserve">“Como reduzir o tempo de permanência física dos usuários nas unidades de saúde e aumentar a previsibilidade do atendimento por meio de uma solução digital acessível e inclusiva?”</w:t>
-      </w:r>
-    </w:p>
-    <w:p>
-      <w:pPr>
-        <w:pStyle w:val="Compact"/>
-        <w:numPr>
-          <w:ilvl w:val="0"/>
-          <w:numId w:val="1001"/>
-        </w:numPr>
-      </w:pPr>
-      <w:r>
-        <w:t xml:space="preserve"> Código em C cancelado oficialmente (decisão do grupo em 12/06)</w:t>
-      </w:r>
-    </w:p>
-    <w:p>
-      <w:pPr>
-        <w:pStyle w:val="Compact"/>
-        <w:numPr>
-          <w:ilvl w:val="0"/>
-          <w:numId w:val="1001"/>
-        </w:numPr>
-      </w:pPr>
-      <w:r>
-        <w:t xml:space="preserve"> Divisão de tarefas equilibrada (8 integrantes)</w:t>
-      </w:r>
-    </w:p>
-    <w:p>
-      <w:pPr>
-        <w:pStyle w:val="Compact"/>
-        <w:numPr>
-          <w:ilvl w:val="0"/>
-          <w:numId w:val="1001"/>
-        </w:numPr>
-      </w:pPr>
-      <w:r>
-        <w:t xml:space="preserve"> Esclarecimento da tutora Lorena sobre</w:t>
-      </w:r>
-      <w:r>
-        <w:t xml:space="preserve"> </w:t>
-      </w:r>
-      <w:r>
-        <w:t xml:space="preserve">“casos existentes”</w:t>
-      </w:r>
-      <w:r>
-        <w:t xml:space="preserve">: analisar soluções já existentes no mercado e propor melhorias</w:t>
-      </w:r>
-    </w:p>
-    <w:bookmarkEnd w:id="51"/>
-    <w:bookmarkStart w:id="55" w:name="links-rápidos"/>
-    <w:p>
-      <w:pPr>
-        <w:pStyle w:val="Heading2"/>
-      </w:pPr>
-      <w:r>
-        <w:t xml:space="preserve">8. Links Rápidos</w:t>
-      </w:r>
-    </w:p>
-    <w:tbl>
-      <w:tblPr>
-        <w:tblStyle w:val="Table"/>
-        <w:tblW w:type="pct" w:w="5000"/>
-        <w:tblLayout w:type="fixed"/>
-        <w:tblLook w:firstRow="1" w:lastRow="0" w:firstColumn="0" w:lastColumn="0" w:noHBand="0" w:noVBand="0" w:val="0020"/>
-      </w:tblPr>
-      <w:tblGrid>
-        <w:gridCol w:w="5760"/>
-        <w:gridCol w:w="2160"/>
-      </w:tblGrid>
-      <w:tr>
-        <w:trPr>
-          <w:tblHeader w:val="on"/>
-        </w:trPr>
-        <w:tc>
-          <w:tcPr/>
-          <w:p>
-            <w:pPr>
-              <w:pStyle w:val="Compact"/>
-              <w:jc w:val="left"/>
-            </w:pPr>
-            <w:r>
-              <w:t xml:space="preserve">O que procura?</w:t>
+              <w:t xml:space="preserve">O quê</w:t>
             </w:r>
           </w:p>
         </w:tc>
@@ -3263,7 +2685,7 @@
               <w:jc w:val="left"/>
             </w:pPr>
             <w:r>
-              <w:t xml:space="preserve"> Site do projeto (GitHub Pages)</w:t>
+              <w:t xml:space="preserve">Site do projeto (GitHub Pages)</w:t>
             </w:r>
           </w:p>
         </w:tc>
@@ -3289,23 +2711,23 @@
               <w:jc w:val="left"/>
             </w:pPr>
             <w:r>
-              <w:t xml:space="preserve"> Protótipo FilaClara</w:t>
-            </w:r>
-          </w:p>
-        </w:tc>
-        <w:tc>
-          <w:tcPr/>
-          <w:p>
-            <w:pPr>
-              <w:pStyle w:val="Compact"/>
-              <w:jc w:val="left"/>
-            </w:pPr>
-            <w:hyperlink r:id="rId33">
+              <w:t xml:space="preserve">Protótipo MinhaFila</w:t>
+            </w:r>
+          </w:p>
+        </w:tc>
+        <w:tc>
+          <w:tcPr/>
+          <w:p>
+            <w:pPr>
+              <w:pStyle w:val="Compact"/>
+              <w:jc w:val="left"/>
+            </w:pPr>
+            <w:hyperlink r:id="rId23">
               <w:r>
                 <w:rPr>
                   <w:rStyle w:val="VerbatimChar"/>
                 </w:rPr>
-                <w:t xml:space="preserve">prototipo-filaclara-opendesigner/index.html</w:t>
+                <w:t xml:space="preserve">prototipo-minhafila/index.html</w:t>
               </w:r>
             </w:hyperlink>
           </w:p>
@@ -3320,49 +2742,18 @@
               <w:jc w:val="left"/>
             </w:pPr>
             <w:r>
-              <w:t xml:space="preserve"> Painel da clínica</w:t>
-            </w:r>
-          </w:p>
-        </w:tc>
-        <w:tc>
-          <w:tcPr/>
-          <w:p>
-            <w:pPr>
-              <w:pStyle w:val="Compact"/>
-              <w:jc w:val="left"/>
-            </w:pPr>
-            <w:hyperlink r:id="rId34">
-              <w:r>
-                <w:rPr>
-                  <w:rStyle w:val="VerbatimChar"/>
-                </w:rPr>
-                <w:t xml:space="preserve">prototipo-filaclara-opendesigner/admin.html</w:t>
-              </w:r>
-            </w:hyperlink>
-          </w:p>
-        </w:tc>
-      </w:tr>
-      <w:tr>
-        <w:tc>
-          <w:tcPr/>
-          <w:p>
-            <w:pPr>
-              <w:pStyle w:val="Compact"/>
-              <w:jc w:val="left"/>
-            </w:pPr>
-            <w:r>
-              <w:t xml:space="preserve"> Tema completo</w:t>
-            </w:r>
-          </w:p>
-        </w:tc>
-        <w:tc>
-          <w:tcPr/>
-          <w:p>
-            <w:pPr>
-              <w:pStyle w:val="Compact"/>
-              <w:jc w:val="left"/>
-            </w:pPr>
-            <w:hyperlink r:id="rId26">
+              <w:t xml:space="preserve">Tema completo</w:t>
+            </w:r>
+          </w:p>
+        </w:tc>
+        <w:tc>
+          <w:tcPr/>
+          <w:p>
+            <w:pPr>
+              <w:pStyle w:val="Compact"/>
+              <w:jc w:val="left"/>
+            </w:pPr>
+            <w:hyperlink r:id="rId20">
               <w:r>
                 <w:rPr>
                   <w:rStyle w:val="VerbatimChar"/>
@@ -3382,18 +2773,18 @@
               <w:jc w:val="left"/>
             </w:pPr>
             <w:r>
-              <w:t xml:space="preserve"> Divisão de tarefas</w:t>
-            </w:r>
-          </w:p>
-        </w:tc>
-        <w:tc>
-          <w:tcPr/>
-          <w:p>
-            <w:pPr>
-              <w:pStyle w:val="Compact"/>
-              <w:jc w:val="left"/>
-            </w:pPr>
-            <w:hyperlink r:id="rId27">
+              <w:t xml:space="preserve">Divisão de tarefas</w:t>
+            </w:r>
+          </w:p>
+        </w:tc>
+        <w:tc>
+          <w:tcPr/>
+          <w:p>
+            <w:pPr>
+              <w:pStyle w:val="Compact"/>
+              <w:jc w:val="left"/>
+            </w:pPr>
+            <w:hyperlink r:id="rId21">
               <w:r>
                 <w:rPr>
                   <w:rStyle w:val="VerbatimChar"/>
@@ -3413,18 +2804,18 @@
               <w:jc w:val="left"/>
             </w:pPr>
             <w:r>
-              <w:t xml:space="preserve"> Decisões do projeto</w:t>
-            </w:r>
-          </w:p>
-        </w:tc>
-        <w:tc>
-          <w:tcPr/>
-          <w:p>
-            <w:pPr>
-              <w:pStyle w:val="Compact"/>
-              <w:jc w:val="left"/>
-            </w:pPr>
-            <w:hyperlink r:id="rId28">
+              <w:t xml:space="preserve">Decisões do projeto</w:t>
+            </w:r>
+          </w:p>
+        </w:tc>
+        <w:tc>
+          <w:tcPr/>
+          <w:p>
+            <w:pPr>
+              <w:pStyle w:val="Compact"/>
+              <w:jc w:val="left"/>
+            </w:pPr>
+            <w:hyperlink r:id="rId22">
               <w:r>
                 <w:rPr>
                   <w:rStyle w:val="VerbatimChar"/>
@@ -3444,18 +2835,18 @@
               <w:jc w:val="left"/>
             </w:pPr>
             <w:r>
-              <w:t xml:space="preserve"> Fluxograma</w:t>
-            </w:r>
-          </w:p>
-        </w:tc>
-        <w:tc>
-          <w:tcPr/>
-          <w:p>
-            <w:pPr>
-              <w:pStyle w:val="Compact"/>
-              <w:jc w:val="left"/>
-            </w:pPr>
-            <w:hyperlink r:id="rId31">
+              <w:t xml:space="preserve">Fluxograma</w:t>
+            </w:r>
+          </w:p>
+        </w:tc>
+        <w:tc>
+          <w:tcPr/>
+          <w:p>
+            <w:pPr>
+              <w:pStyle w:val="Compact"/>
+              <w:jc w:val="left"/>
+            </w:pPr>
+            <w:hyperlink r:id="rId29">
               <w:r>
                 <w:rPr>
                   <w:rStyle w:val="VerbatimChar"/>
@@ -3475,18 +2866,18 @@
               <w:jc w:val="left"/>
             </w:pPr>
             <w:r>
-              <w:t xml:space="preserve"> Proposta</w:t>
-            </w:r>
-          </w:p>
-        </w:tc>
-        <w:tc>
-          <w:tcPr/>
-          <w:p>
-            <w:pPr>
-              <w:pStyle w:val="Compact"/>
-              <w:jc w:val="left"/>
-            </w:pPr>
-            <w:hyperlink r:id="rId37">
+              <w:t xml:space="preserve">Proposta</w:t>
+            </w:r>
+          </w:p>
+        </w:tc>
+        <w:tc>
+          <w:tcPr/>
+          <w:p>
+            <w:pPr>
+              <w:pStyle w:val="Compact"/>
+              <w:jc w:val="left"/>
+            </w:pPr>
+            <w:hyperlink r:id="rId33">
               <w:r>
                 <w:rPr>
                   <w:rStyle w:val="VerbatimChar"/>
@@ -3506,18 +2897,18 @@
               <w:jc w:val="left"/>
             </w:pPr>
             <w:r>
-              <w:t xml:space="preserve"> Problema real (Rios)</w:t>
-            </w:r>
-          </w:p>
-        </w:tc>
-        <w:tc>
-          <w:tcPr/>
-          <w:p>
-            <w:pPr>
-              <w:pStyle w:val="Compact"/>
-              <w:jc w:val="left"/>
-            </w:pPr>
-            <w:hyperlink r:id="rId30">
+              <w:t xml:space="preserve">Problema real</w:t>
+            </w:r>
+          </w:p>
+        </w:tc>
+        <w:tc>
+          <w:tcPr/>
+          <w:p>
+            <w:pPr>
+              <w:pStyle w:val="Compact"/>
+              <w:jc w:val="left"/>
+            </w:pPr>
+            <w:hyperlink r:id="rId28">
               <w:r>
                 <w:rPr>
                   <w:rStyle w:val="VerbatimChar"/>
@@ -3537,18 +2928,18 @@
               <w:jc w:val="left"/>
             </w:pPr>
             <w:r>
-              <w:t xml:space="preserve"> Identidade visual</w:t>
-            </w:r>
-          </w:p>
-        </w:tc>
-        <w:tc>
-          <w:tcPr/>
-          <w:p>
-            <w:pPr>
-              <w:pStyle w:val="Compact"/>
-              <w:jc w:val="left"/>
-            </w:pPr>
-            <w:hyperlink r:id="rId52">
+              <w:t xml:space="preserve">Identidade visual</w:t>
+            </w:r>
+          </w:p>
+        </w:tc>
+        <w:tc>
+          <w:tcPr/>
+          <w:p>
+            <w:pPr>
+              <w:pStyle w:val="Compact"/>
+              <w:jc w:val="left"/>
+            </w:pPr>
+            <w:hyperlink r:id="rId41">
               <w:r>
                 <w:rPr>
                   <w:rStyle w:val="VerbatimChar"/>
@@ -3568,18 +2959,18 @@
               <w:jc w:val="left"/>
             </w:pPr>
             <w:r>
-              <w:t xml:space="preserve"> Histórico WhatsApp</w:t>
-            </w:r>
-          </w:p>
-        </w:tc>
-        <w:tc>
-          <w:tcPr/>
-          <w:p>
-            <w:pPr>
-              <w:pStyle w:val="Compact"/>
-              <w:jc w:val="left"/>
-            </w:pPr>
-            <w:hyperlink r:id="rId29">
+              <w:t xml:space="preserve">Histórico WhatsApp</w:t>
+            </w:r>
+          </w:p>
+        </w:tc>
+        <w:tc>
+          <w:tcPr/>
+          <w:p>
+            <w:pPr>
+              <w:pStyle w:val="Compact"/>
+              <w:jc w:val="left"/>
+            </w:pPr>
+            <w:hyperlink r:id="rId27">
               <w:r>
                 <w:rPr>
                   <w:rStyle w:val="VerbatimChar"/>
@@ -3599,18 +2990,18 @@
               <w:jc w:val="left"/>
             </w:pPr>
             <w:r>
-              <w:t xml:space="preserve"> Documentação geral</w:t>
-            </w:r>
-          </w:p>
-        </w:tc>
-        <w:tc>
-          <w:tcPr/>
-          <w:p>
-            <w:pPr>
-              <w:pStyle w:val="Compact"/>
-              <w:jc w:val="left"/>
-            </w:pPr>
-            <w:hyperlink r:id="rId53">
+              <w:t xml:space="preserve">Documentação geral</w:t>
+            </w:r>
+          </w:p>
+        </w:tc>
+        <w:tc>
+          <w:tcPr/>
+          <w:p>
+            <w:pPr>
+              <w:pStyle w:val="Compact"/>
+              <w:jc w:val="left"/>
+            </w:pPr>
+            <w:hyperlink r:id="rId42">
               <w:r>
                 <w:rPr>
                   <w:rStyle w:val="VerbatimChar"/>
@@ -3630,18 +3021,18 @@
               <w:jc w:val="left"/>
             </w:pPr>
             <w:r>
-              <w:t xml:space="preserve"> Imagens do grupo</w:t>
-            </w:r>
-          </w:p>
-        </w:tc>
-        <w:tc>
-          <w:tcPr/>
-          <w:p>
-            <w:pPr>
-              <w:pStyle w:val="Compact"/>
-              <w:jc w:val="left"/>
-            </w:pPr>
-            <w:hyperlink r:id="rId54">
+              <w:t xml:space="preserve">Imagens do grupo</w:t>
+            </w:r>
+          </w:p>
+        </w:tc>
+        <w:tc>
+          <w:tcPr/>
+          <w:p>
+            <w:pPr>
+              <w:pStyle w:val="Compact"/>
+              <w:jc w:val="left"/>
+            </w:pPr>
+            <w:hyperlink r:id="rId43">
               <w:r>
                 <w:rPr>
                   <w:rStyle w:val="VerbatimChar"/>
@@ -3653,104 +3044,11 @@
         </w:tc>
       </w:tr>
     </w:tbl>
-    <w:bookmarkEnd w:id="55"/>
-    <w:bookmarkStart w:id="56" w:name="regras-do-repositório"/>
     <w:p>
-      <w:pPr>
-        <w:pStyle w:val="Heading2"/>
-      </w:pPr>
-      <w:r>
-        <w:t xml:space="preserve">9. Regras do Repositório</w:t>
-      </w:r>
-    </w:p>
-    <w:p>
-      <w:pPr>
-        <w:pStyle w:val="Compact"/>
-        <w:numPr>
-          <w:ilvl w:val="0"/>
-          <w:numId w:val="1002"/>
-        </w:numPr>
-      </w:pPr>
-      <w:r>
-        <w:t xml:space="preserve"> Este link está fixado no grupo do WhatsApp</w:t>
-      </w:r>
-    </w:p>
-    <w:p>
-      <w:pPr>
-        <w:pStyle w:val="Compact"/>
-        <w:numPr>
-          <w:ilvl w:val="0"/>
-          <w:numId w:val="1002"/>
-        </w:numPr>
-      </w:pPr>
-      <w:r>
-        <w:t xml:space="preserve"> Todo novo documento deve ser linkado aqui</w:t>
-      </w:r>
-    </w:p>
-    <w:p>
-      <w:pPr>
-        <w:pStyle w:val="Compact"/>
-        <w:numPr>
-          <w:ilvl w:val="0"/>
-          <w:numId w:val="1002"/>
-        </w:numPr>
-      </w:pPr>
-      <w:r>
-        <w:t xml:space="preserve"> Não publique telefones, senhas ou dados pessoais</w:t>
-      </w:r>
-    </w:p>
-    <w:p>
-      <w:pPr>
-        <w:pStyle w:val="Compact"/>
-        <w:numPr>
-          <w:ilvl w:val="0"/>
-          <w:numId w:val="1002"/>
-        </w:numPr>
-      </w:pPr>
-      <w:r>
-        <w:t xml:space="preserve"> Dúvidas? Pergunte no grupo do WhatsApp</w:t>
-      </w:r>
-    </w:p>
-    <w:p>
-      <w:pPr>
-        <w:pStyle w:val="Compact"/>
-        <w:numPr>
-          <w:ilvl w:val="0"/>
-          <w:numId w:val="1002"/>
-        </w:numPr>
-      </w:pPr>
-      <w:r>
-        <w:t xml:space="preserve"> Todo material final deve ser convertido para</w:t>
-      </w:r>
-      <w:r>
-        <w:t xml:space="preserve"> </w:t>
-      </w:r>
-      <w:r>
-        <w:rPr>
-          <w:rStyle w:val="VerbatimChar"/>
-        </w:rPr>
-        <w:t xml:space="preserve">.docx</w:t>
-      </w:r>
-      <w:r>
-        <w:t xml:space="preserve"> </w:t>
-      </w:r>
-      <w:r>
-        <w:t xml:space="preserve">ou</w:t>
-      </w:r>
-      <w:r>
-        <w:t xml:space="preserve"> </w:t>
-      </w:r>
-      <w:r>
-        <w:rPr>
-          <w:rStyle w:val="VerbatimChar"/>
-        </w:rPr>
-        <w:t xml:space="preserve">.pdf</w:t>
-      </w:r>
-      <w:r>
-        <w:t xml:space="preserve"> </w:t>
-      </w:r>
-      <w:r>
-        <w:t xml:space="preserve">antes da entrega</w:t>
+      <w:r>
+        <w:pict>
+          <v:rect style="width:0;height:1.5pt" o:hralign="center" o:hrstd="t" o:hr="t"/>
+        </w:pict>
       </w:r>
     </w:p>
     <w:p>
@@ -3762,11 +3060,11 @@
           <w:i/>
           <w:iCs/>
         </w:rPr>
-        <w:t xml:space="preserve">Última atualização: 25/06/2026  nome oficial definido (FilaClara), enquete encerrada, fluxograma finalizado, prioridade em materiais acadêmicos.</w:t>
+        <w:t xml:space="preserve">Última atualização: 25/06/2026 — rebranding para MinhaFila, escopo multissetorial, acessibilidade como recurso importante, preparação para apresentação final em 29/06.</w:t>
       </w:r>
     </w:p>
-    <w:bookmarkEnd w:id="56"/>
-    <w:bookmarkEnd w:id="57"/>
+    <w:bookmarkEnd w:id="44"/>
+    <w:bookmarkEnd w:id="45"/>
     <w:sectPr/>
   </w:body>
 </w:document>
@@ -3980,9 +3278,6 @@
     <w:abstractNumId w:val="990"/>
   </w:num>
   <w:num w:numId="1001">
-    <w:abstractNumId w:val="991"/>
-  </w:num>
-  <w:num w:numId="1002">
     <w:abstractNumId w:val="991"/>
   </w:num>
 </w:numbering>

</xml_diff>

<commit_message>
feat: molde ufrb aplicado a todos os docx (logo, cores, times new roman)
</commit_message>
<xml_diff>
--- a/disciplinas/gcetens843-projeto-algoritmo-i/atividades/trabalhos/projeto-algoritmos/Index-Geral.docx
+++ b/disciplinas/gcetens843-projeto-algoritmo-i/atividades/trabalhos/projeto-algoritmos/Index-Geral.docx
@@ -3065,7 +3065,11 @@
     </w:p>
     <w:bookmarkEnd w:id="44"/>
     <w:bookmarkEnd w:id="45"/>
-    <w:sectPr/>
+    <w:sectPr>
+      <w:headerReference w:type="default" r:id="rId9"/>
+      <w:footerReference w:type="default" r:id="rId10"/>
+      <w:pgMar w:top="1728" w:bottom="1440" w:left="1440" w:right="1440"/>
+    </w:sectPr>
   </w:body>
 </w:document>
 </file>
@@ -3074,6 +3078,26 @@
 <w:comments xmlns:w="http://schemas.openxmlformats.org/wordprocessingml/2006/main" xmlns:m="http://schemas.openxmlformats.org/officeDocument/2006/math" xmlns:r="http://schemas.openxmlformats.org/officeDocument/2006/relationships" xmlns:o="urn:schemas-microsoft-com:office:office" xmlns:v="urn:schemas-microsoft-com:vml" xmlns:w10="urn:schemas-microsoft-com:office:word" xmlns:a="http://schemas.openxmlformats.org/drawingml/2006/main" xmlns:pic="http://schemas.openxmlformats.org/drawingml/2006/picture" xmlns:wp="http://schemas.openxmlformats.org/drawingml/2006/wordprocessingDrawing"/>
 </file>
 
+<file path=word/footer1.xml><?xml version="1.0" encoding="utf-8"?>
+<w:ftr xmlns:m="http://schemas.openxmlformats.org/officeDocument/2006/math" xmlns:mc="http://schemas.openxmlformats.org/markup-compatibility/2006" xmlns:mo="http://schemas.microsoft.com/office/mac/office/2008/main" xmlns:mv="urn:schemas-microsoft-com:mac:vml" xmlns:o="urn:schemas-microsoft-com:office:office" xmlns:r="http://schemas.openxmlformats.org/officeDocument/2006/relationships" xmlns:v="urn:schemas-microsoft-com:vml" xmlns:w10="urn:schemas-microsoft-com:office:word" xmlns:w14="http://schemas.microsoft.com/office/word/2010/wordml" xmlns:w="http://schemas.openxmlformats.org/wordprocessingml/2006/main" xmlns:wne="http://schemas.microsoft.com/office/word/2006/wordml" xmlns:wp14="http://schemas.microsoft.com/office/word/2010/wordprocessingDrawing" xmlns:wp="http://schemas.openxmlformats.org/drawingml/2006/wordprocessingDrawing" xmlns:wpc="http://schemas.microsoft.com/office/word/2010/wordprocessingCanvas" xmlns:wpg="http://schemas.microsoft.com/office/word/2010/wordprocessingGroup" xmlns:wpi="http://schemas.microsoft.com/office/word/2010/wordprocessingInk" xmlns:wps="http://schemas.microsoft.com/office/word/2010/wordprocessingShape" mc:Ignorable="w14 wp14">
+  <w:p>
+    <w:pPr>
+      <w:pStyle w:val="Footer"/>
+      <w:jc w:val="center"/>
+    </w:pPr>
+    <w:r>
+      <w:rPr>
+        <w:rFonts w:ascii="Times New Roman" w:hAnsi="Times New Roman"/>
+        <w:i/>
+        <w:color w:val="505050"/>
+        <w:sz w:val="14"/>
+      </w:rPr>
+      <w:t>MinhaFila — GCETENS843 — 2026.1</w:t>
+    </w:r>
+  </w:p>
+</w:ftr>
+</file>
+
 <file path=word/footnotes.xml><?xml version="1.0" encoding="utf-8"?>
 <w:footnotes xmlns:w="http://schemas.openxmlformats.org/wordprocessingml/2006/main" xmlns:m="http://schemas.openxmlformats.org/officeDocument/2006/math" xmlns:r="http://schemas.openxmlformats.org/officeDocument/2006/relationships" xmlns:o="urn:schemas-microsoft-com:office:office" xmlns:v="urn:schemas-microsoft-com:vml" xmlns:w10="urn:schemas-microsoft-com:office:word" xmlns:a="http://schemas.openxmlformats.org/drawingml/2006/main" xmlns:pic="http://schemas.openxmlformats.org/drawingml/2006/picture" xmlns:wp="http://schemas.openxmlformats.org/drawingml/2006/wordprocessingDrawing">
   <w:footnote w:type="continuationSeparator" w:id="0">
@@ -3091,6 +3115,142 @@
     </w:p>
   </w:footnote>
 </w:footnotes>
+</file>
+
+<file path=word/header1.xml><?xml version="1.0" encoding="utf-8"?>
+<w:hdr xmlns:m="http://schemas.openxmlformats.org/officeDocument/2006/math" xmlns:mc="http://schemas.openxmlformats.org/markup-compatibility/2006" xmlns:mo="http://schemas.microsoft.com/office/mac/office/2008/main" xmlns:mv="urn:schemas-microsoft-com:mac:vml" xmlns:o="urn:schemas-microsoft-com:office:office" xmlns:r="http://schemas.openxmlformats.org/officeDocument/2006/relationships" xmlns:v="urn:schemas-microsoft-com:vml" xmlns:w10="urn:schemas-microsoft-com:office:word" xmlns:w14="http://schemas.microsoft.com/office/word/2010/wordml" xmlns:w="http://schemas.openxmlformats.org/wordprocessingml/2006/main" xmlns:wne="http://schemas.microsoft.com/office/word/2006/wordml" xmlns:wp14="http://schemas.microsoft.com/office/word/2010/wordprocessingDrawing" xmlns:wp="http://schemas.openxmlformats.org/drawingml/2006/wordprocessingDrawing" xmlns:wpc="http://schemas.microsoft.com/office/word/2010/wordprocessingCanvas" xmlns:wpg="http://schemas.microsoft.com/office/word/2010/wordprocessingGroup" xmlns:wpi="http://schemas.microsoft.com/office/word/2010/wordprocessingInk" xmlns:wps="http://schemas.microsoft.com/office/word/2010/wordprocessingShape" mc:Ignorable="w14 wp14">
+  <w:p>
+    <w:pPr>
+      <w:pStyle w:val="Header"/>
+    </w:pPr>
+  </w:p>
+  <w:tbl>
+    <w:tblPr>
+      <w:tblW w:type="auto" w:w="0"/>
+      <w:tblLook w:firstColumn="1" w:firstRow="1" w:lastColumn="0" w:lastRow="0" w:noHBand="0" w:noVBand="1" w:val="04A0"/>
+    </w:tblPr>
+    <w:tblGrid>
+      <w:gridCol w:w="4680"/>
+      <w:gridCol w:w="4680"/>
+    </w:tblGrid>
+    <w:tr>
+      <w:tc>
+        <w:tcPr>
+          <w:tcW w:type="dxa" w:w="2016"/>
+          <w:tcBorders>
+            <w:top w:val="none" w:sz="0" w:space="0" w:color="auto"/>
+            <w:left w:val="none" w:sz="0" w:space="0" w:color="auto"/>
+            <w:bottom w:val="none" w:sz="0" w:space="0" w:color="auto"/>
+            <w:right w:val="none" w:sz="0" w:space="0" w:color="auto"/>
+          </w:tcBorders>
+        </w:tcPr>
+        <w:p>
+          <w:pPr>
+            <w:jc w:val="left"/>
+          </w:pPr>
+          <w:r>
+            <w:drawing>
+              <wp:inline xmlns:a="http://schemas.openxmlformats.org/drawingml/2006/main" xmlns:pic="http://schemas.openxmlformats.org/drawingml/2006/picture">
+                <wp:extent cx="1188720" cy="468220"/>
+                <wp:docPr id="1" name="Picture 1"/>
+                <wp:cNvGraphicFramePr>
+                  <a:graphicFrameLocks noChangeAspect="1"/>
+                </wp:cNvGraphicFramePr>
+                <a:graphic>
+                  <a:graphicData uri="http://schemas.openxmlformats.org/drawingml/2006/picture">
+                    <pic:pic>
+                      <pic:nvPicPr>
+                        <pic:cNvPr id="0" name="logo-ufrb-20-anos.png"/>
+                        <pic:cNvPicPr/>
+                      </pic:nvPicPr>
+                      <pic:blipFill>
+                        <a:blip r:embed="rId1"/>
+                        <a:stretch>
+                          <a:fillRect/>
+                        </a:stretch>
+                      </pic:blipFill>
+                      <pic:spPr>
+                        <a:xfrm>
+                          <a:off x="0" y="0"/>
+                          <a:ext cx="1188720" cy="468220"/>
+                        </a:xfrm>
+                        <a:prstGeom prst="rect"/>
+                      </pic:spPr>
+                    </pic:pic>
+                  </a:graphicData>
+                </a:graphic>
+              </wp:inline>
+            </w:drawing>
+          </w:r>
+        </w:p>
+      </w:tc>
+      <w:tc>
+        <w:tcPr>
+          <w:tcW w:type="dxa" w:w="7200"/>
+          <w:tcBorders>
+            <w:top w:val="none" w:sz="0" w:space="0" w:color="auto"/>
+            <w:left w:val="none" w:sz="0" w:space="0" w:color="auto"/>
+            <w:bottom w:val="none" w:sz="0" w:space="0" w:color="auto"/>
+            <w:right w:val="none" w:sz="0" w:space="0" w:color="auto"/>
+          </w:tcBorders>
+        </w:tcPr>
+        <w:p>
+          <w:pPr>
+            <w:jc w:val="left"/>
+          </w:pPr>
+          <w:r>
+            <w:rPr>
+              <w:rFonts w:ascii="Times New Roman" w:hAnsi="Times New Roman"/>
+              <w:b/>
+              <w:color w:val="003D6B"/>
+              <w:sz w:val="16"/>
+            </w:rPr>
+            <w:t>UNIVERSIDADE FEDERAL DO RECÔNCAVO DA BAHIA — UFRB</w:t>
+          </w:r>
+        </w:p>
+        <w:p>
+          <w:pPr>
+            <w:jc w:val="left"/>
+          </w:pPr>
+          <w:r>
+            <w:rPr>
+              <w:rFonts w:ascii="Times New Roman" w:hAnsi="Times New Roman"/>
+              <w:b/>
+              <w:color w:val="006DAA"/>
+              <w:sz w:val="15"/>
+            </w:rPr>
+            <w:t>CENTRO DE CIÊNCIA E TECNOLOGIA — CETENS</w:t>
+          </w:r>
+        </w:p>
+        <w:p>
+          <w:pPr>
+            <w:jc w:val="left"/>
+          </w:pPr>
+          <w:r>
+            <w:rPr>
+              <w:rFonts w:ascii="Times New Roman" w:hAnsi="Times New Roman"/>
+              <w:color w:val="505050"/>
+              <w:sz w:val="14"/>
+            </w:rPr>
+            <w:t>BACHARELADO EM SISTEMAS DE INFORMAÇÃO (EAD)</w:t>
+          </w:r>
+        </w:p>
+        <w:p>
+          <w:pPr>
+            <w:jc w:val="left"/>
+          </w:pPr>
+          <w:r>
+            <w:rPr>
+              <w:color w:val="C89B3C"/>
+              <w:sz w:val="8"/>
+            </w:rPr>
+            <w:t>────────────────────────────────────────────────────────────────────────────────</w:t>
+          </w:r>
+        </w:p>
+      </w:tc>
+    </w:tr>
+  </w:tbl>
+</w:hdr>
 </file>
 
 <file path=word/numbering.xml><?xml version="1.0" encoding="utf-8"?>
@@ -3304,6 +3464,14 @@
   <w:style w:default="1" w:styleId="Normal" w:type="paragraph">
     <w:name w:val="Normal"/>
     <w:qFormat/>
+    <w:pPr>
+      <w:spacing w:line="360" w:lineRule="auto" w:after="120"/>
+    </w:pPr>
+    <w:rPr>
+      <w:rFonts w:ascii="Times New Roman" w:hAnsi="Times New Roman"/>
+      <w:color w:val="000000"/>
+      <w:sz w:val="24"/>
+    </w:rPr>
   </w:style>
   <w:style w:styleId="BodyText" w:type="paragraph">
     <w:name w:val="Body Text"/>
@@ -3468,13 +3636,14 @@
     <w:pPr>
       <w:keepNext/>
       <w:keepLines/>
-      <w:spacing w:after="80" w:before="360"/>
+      <w:spacing w:after="80" w:before="360" w:line="360" w:lineRule="auto"/>
       <w:outlineLvl w:val="0"/>
     </w:pPr>
     <w:rPr>
-      <w:rFonts w:asciiTheme="majorHAnsi" w:cstheme="majorBidi" w:eastAsiaTheme="majorEastAsia" w:hAnsiTheme="majorHAnsi"/>
-      <w:color w:themeColor="accent1" w:themeShade="BF" w:val="0F4761"/>
-      <w:sz w:val="40"/>
+      <w:rFonts w:asciiTheme="majorHAnsi" w:cstheme="majorBidi" w:eastAsiaTheme="majorEastAsia" w:hAnsiTheme="majorHAnsi" w:ascii="Times New Roman" w:hAnsi="Times New Roman"/>
+      <w:b/>
+      <w:color w:val="003D6B"/>
+      <w:sz w:val="28"/>
       <w:szCs w:val="40"/>
     </w:rPr>
   </w:style>
@@ -3491,13 +3660,14 @@
     <w:pPr>
       <w:keepNext/>
       <w:keepLines/>
-      <w:spacing w:after="80" w:before="160"/>
+      <w:spacing w:after="80" w:before="160" w:line="360" w:lineRule="auto"/>
       <w:outlineLvl w:val="1"/>
     </w:pPr>
     <w:rPr>
-      <w:rFonts w:asciiTheme="majorHAnsi" w:cstheme="majorBidi" w:eastAsiaTheme="majorEastAsia" w:hAnsiTheme="majorHAnsi"/>
-      <w:color w:themeColor="accent1" w:themeShade="BF" w:val="0F4761"/>
-      <w:sz w:val="32"/>
+      <w:rFonts w:asciiTheme="majorHAnsi" w:cstheme="majorBidi" w:eastAsiaTheme="majorEastAsia" w:hAnsiTheme="majorHAnsi" w:ascii="Times New Roman" w:hAnsi="Times New Roman"/>
+      <w:b/>
+      <w:color w:val="006DAA"/>
+      <w:sz w:val="26"/>
       <w:szCs w:val="32"/>
     </w:rPr>
   </w:style>
@@ -3514,13 +3684,14 @@
     <w:pPr>
       <w:keepNext/>
       <w:keepLines/>
-      <w:spacing w:after="80" w:before="160"/>
+      <w:spacing w:after="80" w:before="160" w:line="360" w:lineRule="auto"/>
       <w:outlineLvl w:val="2"/>
     </w:pPr>
     <w:rPr>
-      <w:rFonts w:cstheme="majorBidi" w:eastAsiaTheme="majorEastAsia"/>
-      <w:color w:themeColor="accent1" w:themeShade="BF" w:val="0F4761"/>
-      <w:sz w:val="28"/>
+      <w:rFonts w:cstheme="majorBidi" w:eastAsiaTheme="majorEastAsia" w:ascii="Times New Roman" w:hAnsi="Times New Roman"/>
+      <w:b/>
+      <w:color w:val="003D6B"/>
+      <w:sz w:val="24"/>
       <w:szCs w:val="28"/>
     </w:rPr>
   </w:style>

</xml_diff>

<commit_message>
fix: regenera Index-Geral.docx com molde UFRB (capa, logo, Times New Roman, rodapé) - documento agora com 2.2MB, 2 imagens embutidas, capa institucional
O docx anterior estava sem capa UFRB e sem a foto do grupo embutida, o que fazia o GitHub Office Online mostrar aparentemente vazio. Agora tem capa com logo UFRB, foto do grupo, Times New Roman 12pt, cabeçalhos estilizados, rodapé e espacamento 1.5. Script de geracao adicionado em scripts/gerar-index-geral.py
</commit_message>
<xml_diff>
--- a/disciplinas/gcetens843-projeto-algoritmo-i/atividades/trabalhos/projeto-algoritmos/Index-Geral.docx
+++ b/disciplinas/gcetens843-projeto-algoritmo-i/atividades/trabalhos/projeto-algoritmos/Index-Geral.docx
@@ -2,7 +2,132 @@
 <file path=word/document.xml><?xml version="1.0" encoding="utf-8"?>
 <w:document xmlns:w="http://schemas.openxmlformats.org/wordprocessingml/2006/main" xmlns:m="http://schemas.openxmlformats.org/officeDocument/2006/math" xmlns:r="http://schemas.openxmlformats.org/officeDocument/2006/relationships" xmlns:o="urn:schemas-microsoft-com:office:office" xmlns:v="urn:schemas-microsoft-com:vml" xmlns:w10="urn:schemas-microsoft-com:office:word" xmlns:a="http://schemas.openxmlformats.org/drawingml/2006/main" xmlns:pic="http://schemas.openxmlformats.org/drawingml/2006/picture" xmlns:wp="http://schemas.openxmlformats.org/drawingml/2006/wordprocessingDrawing">
   <w:body>
-    <w:bookmarkStart w:id="45" w:name="index-geral-minhafila"/>
+    <w:bookmarkStart w:id="48" w:name="index-geral-minhafila"/>
+    <w:tbl>
+      <w:tblPr>
+        <w:tblW w:type="auto" w:w="0"/>
+        <w:jc w:val="left"/>
+        <w:tblLayout w:type="fixed"/>
+        <w:tblLook w:firstColumn="1" w:firstRow="1" w:lastColumn="0" w:lastRow="0" w:noHBand="0" w:noVBand="1" w:val="04A0"/>
+        <w:tblBorders>
+          <w:top w:val="none" w:sz="0" w:space="0" w:color="auto"/>
+          <w:left w:val="none" w:sz="0" w:space="0" w:color="auto"/>
+          <w:bottom w:val="none" w:sz="0" w:space="0" w:color="auto"/>
+          <w:right w:val="none" w:sz="0" w:space="0" w:color="auto"/>
+        </w:tblBorders>
+      </w:tblPr>
+      <w:tblGrid>
+        <w:gridCol w:w="4680"/>
+        <w:gridCol w:w="4680"/>
+      </w:tblGrid>
+      <w:tr>
+        <w:tc>
+          <w:tcPr>
+            <w:tcW w:type="dxa" w:w="2016"/>
+          </w:tcPr>
+          <w:p>
+            <w:pPr>
+              <w:jc w:val="left"/>
+            </w:pPr>
+            <w:r>
+              <w:drawing>
+                <wp:inline>
+                  <wp:extent cx="1143000" cy="450211"/>
+                  <wp:docPr id="23" name="Picture 23"/>
+                  <wp:cNvGraphicFramePr>
+                    <a:graphicFrameLocks noChangeAspect="1"/>
+                  </wp:cNvGraphicFramePr>
+                  <a:graphic>
+                    <a:graphicData uri="http://schemas.openxmlformats.org/drawingml/2006/picture">
+                      <pic:pic>
+                        <pic:nvPicPr>
+                          <pic:cNvPr id="0" name="logo-ufrb-20-anos.png"/>
+                          <pic:cNvPicPr/>
+                        </pic:nvPicPr>
+                        <pic:blipFill>
+                          <a:blip r:embed="rId9"/>
+                          <a:stretch>
+                            <a:fillRect/>
+                          </a:stretch>
+                        </pic:blipFill>
+                        <pic:spPr>
+                          <a:xfrm>
+                            <a:off x="0" y="0"/>
+                            <a:ext cx="1143000" cy="450211"/>
+                          </a:xfrm>
+                          <a:prstGeom prst="rect"/>
+                        </pic:spPr>
+                      </pic:pic>
+                    </a:graphicData>
+                  </a:graphic>
+                </wp:inline>
+              </w:drawing>
+            </w:r>
+          </w:p>
+        </w:tc>
+        <w:tc>
+          <w:tcPr>
+            <w:tcW w:type="dxa" w:w="7200"/>
+          </w:tcPr>
+          <w:p>
+            <w:pPr>
+              <w:jc w:val="left"/>
+            </w:pPr>
+            <w:r>
+              <w:rPr>
+                <w:rFonts w:ascii="Times New Roman" w:hAnsi="Times New Roman"/>
+                <w:b/>
+                <w:color w:val="003D6B"/>
+                <w:sz w:val="16"/>
+              </w:rPr>
+              <w:t>UNIVERSIDADE FEDERAL DO RECÔNCAVO DA BAHIA — UFRB</w:t>
+            </w:r>
+          </w:p>
+          <w:p>
+            <w:pPr>
+              <w:jc w:val="left"/>
+            </w:pPr>
+            <w:r>
+              <w:rPr>
+                <w:rFonts w:ascii="Times New Roman" w:hAnsi="Times New Roman"/>
+                <w:b/>
+                <w:color w:val="006DAA"/>
+                <w:sz w:val="15"/>
+              </w:rPr>
+              <w:t>CENTRO DE CIÊNCIA E TECNOLOGIA — CETENS</w:t>
+            </w:r>
+          </w:p>
+          <w:p>
+            <w:pPr>
+              <w:jc w:val="left"/>
+            </w:pPr>
+            <w:r>
+              <w:rPr>
+                <w:rFonts w:ascii="Times New Roman" w:hAnsi="Times New Roman"/>
+                <w:b w:val="0"/>
+                <w:color w:val="505050"/>
+                <w:sz w:val="14"/>
+              </w:rPr>
+              <w:t>BACHARELADO EM SISTEMAS DE INFORMAÇÃO (EAD)</w:t>
+            </w:r>
+          </w:p>
+          <w:p>
+            <w:pPr>
+              <w:jc w:val="left"/>
+            </w:pPr>
+            <w:r>
+              <w:rPr>
+                <w:rFonts w:ascii="Times New Roman" w:hAnsi="Times New Roman"/>
+                <w:b w:val="0"/>
+                <w:color w:val="C89B3C"/>
+                <w:sz w:val="8"/>
+              </w:rPr>
+              <w:t>────────────────────────────────────────────────────────────────────────────────</w:t>
+            </w:r>
+          </w:p>
+        </w:tc>
+      </w:tr>
+    </w:tbl>
     <w:p>
       <w:pPr>
         <w:pStyle w:val="Heading1"/>
@@ -26,31 +151,53 @@
         </w:pict>
       </w:r>
     </w:p>
-    <w:tbl>
-      <w:tblPr>
-        <w:tblStyle w:val="FigureTable"/>
-        <w:tblW w:type="auto" w:w="0"/>
-        <w:jc w:val="center"/>
-        <w:tblLook w:firstRow="0" w:lastRow="0" w:firstColumn="0" w:lastColumn="0"/>
-      </w:tblPr>
-      <w:tblGrid>
-        <w:gridCol w:w="7920"/>
-      </w:tblGrid>
-      <w:tr>
-        <w:tc>
-          <w:tcPr/>
-          <w:p>
-            <w:pPr>
-              <w:pStyle w:val="Compact"/>
-              <w:jc w:val="center"/>
-            </w:pPr>
-            <w:r>
-              <w:t xml:space="preserve">Foto do grupo</w:t>
-            </w:r>
-          </w:p>
-        </w:tc>
-      </w:tr>
-    </w:tbl>
+    <w:p>
+      <w:pPr>
+        <w:pStyle w:val="CaptionedFigure"/>
+      </w:pPr>
+      <w:r>
+        <w:drawing>
+          <wp:inline>
+            <wp:extent cx="5334000" cy="3001970"/>
+            <wp:effectExtent b="0" l="0" r="0" t="0"/>
+            <wp:docPr descr="Foto do grupo" title="" id="21" name="Picture"/>
+            <a:graphic>
+              <a:graphicData uri="http://schemas.openxmlformats.org/drawingml/2006/picture">
+                <pic:pic>
+                  <pic:nvPicPr>
+                    <pic:cNvPr descr="imagens-grupo/nova-foto-grupo.png" id="22" name="Picture"/>
+                    <pic:cNvPicPr>
+                      <a:picLocks noChangeArrowheads="1" noChangeAspect="1"/>
+                    </pic:cNvPicPr>
+                  </pic:nvPicPr>
+                  <pic:blipFill>
+                    <a:blip r:embed="rId20"/>
+                    <a:stretch>
+                      <a:fillRect/>
+                    </a:stretch>
+                  </pic:blipFill>
+                  <pic:spPr bwMode="auto">
+                    <a:xfrm>
+                      <a:off x="0" y="0"/>
+                      <a:ext cx="5334000" cy="3001970"/>
+                    </a:xfrm>
+                    <a:prstGeom prst="rect">
+                      <a:avLst/>
+                    </a:prstGeom>
+                    <a:noFill/>
+                    <a:ln w="9525">
+                      <a:noFill/>
+                      <a:headEnd/>
+                      <a:tailEnd/>
+                    </a:ln>
+                  </pic:spPr>
+                </pic:pic>
+              </a:graphicData>
+            </a:graphic>
+          </wp:inline>
+        </w:drawing>
+      </w:r>
+    </w:p>
     <w:p>
       <w:pPr>
         <w:pStyle w:val="ImageCaption"/>
@@ -68,7 +215,7 @@
           <w:i/>
           <w:iCs/>
         </w:rPr>
-        <w:t xml:space="preserve">Grupo: Deivison, Ausiane, Rios, Artur, Uélinton, Nubia, Marcos Vinicius e Wallace.</w:t>
+        <w:t xml:space="preserve">Grupo: Deivison, Ausiane de Oliveira Costa, Raimon Rios da Silva, Artur Campos, Uélinton Cardoso Santana, Núbia Rosália de Souza Ramos, Marcos Vinícius dos Santos Sena e Wallace Ribeiro Lima.</w:t>
       </w:r>
     </w:p>
     <w:p>
@@ -78,7 +225,7 @@
         </w:pict>
       </w:r>
     </w:p>
-    <w:bookmarkStart w:id="24" w:name="resumo-do-projeto"/>
+    <w:bookmarkStart w:id="27" w:name="resumo-do-projeto"/>
     <w:p>
       <w:pPr>
         <w:pStyle w:val="Heading2"/>
@@ -350,7 +497,7 @@
       <w:pPr>
         <w:pStyle w:val="BlockText"/>
       </w:pPr>
-      <w:hyperlink r:id="rId20">
+      <w:hyperlink r:id="rId23">
         <w:r>
           <w:rPr>
             <w:rStyle w:val="Hyperlink"/>
@@ -367,7 +514,7 @@
       <w:r>
         <w:t xml:space="preserve"> </w:t>
       </w:r>
-      <w:hyperlink r:id="rId21">
+      <w:hyperlink r:id="rId24">
         <w:r>
           <w:rPr>
             <w:rStyle w:val="Hyperlink"/>
@@ -384,7 +531,7 @@
       <w:r>
         <w:t xml:space="preserve"> </w:t>
       </w:r>
-      <w:hyperlink r:id="rId22">
+      <w:hyperlink r:id="rId25">
         <w:r>
           <w:rPr>
             <w:rStyle w:val="Hyperlink"/>
@@ -401,7 +548,7 @@
       <w:r>
         <w:t xml:space="preserve"> </w:t>
       </w:r>
-      <w:hyperlink r:id="rId23">
+      <w:hyperlink r:id="rId26">
         <w:r>
           <w:rPr>
             <w:rStyle w:val="Hyperlink"/>
@@ -417,8 +564,8 @@
         </w:pict>
       </w:r>
     </w:p>
-    <w:bookmarkEnd w:id="24"/>
-    <w:bookmarkStart w:id="25" w:name="integrantes-e-atribuições"/>
+    <w:bookmarkEnd w:id="27"/>
+    <w:bookmarkStart w:id="28" w:name="integrantes-e-atribuições"/>
     <w:p>
       <w:pPr>
         <w:pStyle w:val="Heading2"/>
@@ -572,7 +719,7 @@
                 <w:b/>
                 <w:bCs/>
               </w:rPr>
-              <w:t xml:space="preserve">Rios</w:t>
+              <w:t xml:space="preserve">Raimon Rios da Silva</w:t>
             </w:r>
           </w:p>
         </w:tc>
@@ -626,19 +773,19 @@
                 <w:b/>
                 <w:bCs/>
               </w:rPr>
-              <w:t xml:space="preserve">Ausiane</w:t>
-            </w:r>
-          </w:p>
-        </w:tc>
-        <w:tc>
-          <w:tcPr/>
-          <w:p>
-            <w:pPr>
-              <w:pStyle w:val="Compact"/>
-              <w:jc w:val="left"/>
-            </w:pPr>
-            <w:r>
-              <w:t xml:space="preserve">Casos existentes, protótipo (design e acessibilidade), documentação de acessibilidade</w:t>
+              <w:t xml:space="preserve">Ausiane de Oliveira Costa</w:t>
+            </w:r>
+          </w:p>
+        </w:tc>
+        <w:tc>
+          <w:tcPr/>
+          <w:p>
+            <w:pPr>
+              <w:pStyle w:val="Compact"/>
+              <w:jc w:val="left"/>
+            </w:pPr>
+            <w:r>
+              <w:t xml:space="preserve">Casos existentes, protótipo (acessibilidade), documentação de acessibilidade</w:t>
             </w:r>
           </w:p>
         </w:tc>
@@ -680,7 +827,7 @@
                 <w:b/>
                 <w:bCs/>
               </w:rPr>
-              <w:t xml:space="preserve">Nubia</w:t>
+              <w:t xml:space="preserve">Núbia Rosália de Souza Ramos</w:t>
             </w:r>
           </w:p>
         </w:tc>
@@ -734,7 +881,7 @@
                 <w:b/>
                 <w:bCs/>
               </w:rPr>
-              <w:t xml:space="preserve">Artur</w:t>
+              <w:t xml:space="preserve">Artur Campos</w:t>
             </w:r>
           </w:p>
         </w:tc>
@@ -788,7 +935,7 @@
                 <w:b/>
                 <w:bCs/>
               </w:rPr>
-              <w:t xml:space="preserve">Marcos Vinicius</w:t>
+              <w:t xml:space="preserve">Marcos Vinícius dos Santos Sena</w:t>
             </w:r>
           </w:p>
         </w:tc>
@@ -842,7 +989,7 @@
                 <w:b/>
                 <w:bCs/>
               </w:rPr>
-              <w:t xml:space="preserve">Uélinton</w:t>
+              <w:t xml:space="preserve">Uélinton Cardoso Santana</w:t>
             </w:r>
           </w:p>
         </w:tc>
@@ -896,7 +1043,7 @@
                 <w:b/>
                 <w:bCs/>
               </w:rPr>
-              <w:t xml:space="preserve">Wallace</w:t>
+              <w:t xml:space="preserve">Wallace Ribeiro Lima</w:t>
             </w:r>
           </w:p>
         </w:tc>
@@ -920,7 +1067,7 @@
               <w:jc w:val="center"/>
             </w:pPr>
             <w:r>
-              <w:t xml:space="preserve">A definir</w:t>
+              <w:t xml:space="preserve">Ativo</w:t>
             </w:r>
           </w:p>
         </w:tc>
@@ -930,7 +1077,7 @@
       <w:pPr>
         <w:pStyle w:val="BlockText"/>
       </w:pPr>
-      <w:hyperlink r:id="rId21">
+      <w:hyperlink r:id="rId24">
         <w:r>
           <w:rPr>
             <w:rStyle w:val="Hyperlink"/>
@@ -946,8 +1093,8 @@
         </w:pict>
       </w:r>
     </w:p>
-    <w:bookmarkEnd w:id="25"/>
-    <w:bookmarkStart w:id="26" w:name="requisitos-da-disciplina"/>
+    <w:bookmarkEnd w:id="28"/>
+    <w:bookmarkStart w:id="29" w:name="requisitos-da-disciplina"/>
     <w:p>
       <w:pPr>
         <w:pStyle w:val="Heading2"/>
@@ -1041,7 +1188,7 @@
               <w:jc w:val="center"/>
             </w:pPr>
             <w:r>
-              <w:t xml:space="preserve">Concluído</w:t>
+              <w:t xml:space="preserve">✅ Concluído (.docx)</w:t>
             </w:r>
           </w:p>
         </w:tc>
@@ -1079,7 +1226,7 @@
               <w:jc w:val="center"/>
             </w:pPr>
             <w:r>
-              <w:t xml:space="preserve">Em andamento</w:t>
+              <w:t xml:space="preserve">✅ Concluído</w:t>
             </w:r>
           </w:p>
         </w:tc>
@@ -1117,7 +1264,7 @@
               <w:jc w:val="center"/>
             </w:pPr>
             <w:r>
-              <w:t xml:space="preserve">Em andamento</w:t>
+              <w:t xml:space="preserve">✅ Concluído (.docx)</w:t>
             </w:r>
           </w:p>
         </w:tc>
@@ -1155,7 +1302,7 @@
               <w:jc w:val="center"/>
             </w:pPr>
             <w:r>
-              <w:t xml:space="preserve">Concluído</w:t>
+              <w:t xml:space="preserve">✅ Concluído (.docx + JPEG)</w:t>
             </w:r>
           </w:p>
         </w:tc>
@@ -1193,7 +1340,7 @@
               <w:jc w:val="center"/>
             </w:pPr>
             <w:r>
-              <w:t xml:space="preserve">Em andamento</w:t>
+              <w:t xml:space="preserve">✅ Concluído (HTML funcional)</w:t>
             </w:r>
           </w:p>
         </w:tc>
@@ -1230,6 +1377,12 @@
               <w:pStyle w:val="Compact"/>
               <w:jc w:val="center"/>
             </w:pPr>
+            <w:r>
+              <w:t xml:space="preserve">🔴</w:t>
+            </w:r>
+            <w:r>
+              <w:t xml:space="preserve"> </w:t>
+            </w:r>
             <w:r>
               <w:rPr>
                 <w:b/>
@@ -1248,17 +1401,17 @@
         </w:pict>
       </w:r>
     </w:p>
-    <w:bookmarkEnd w:id="26"/>
-    <w:bookmarkStart w:id="36" w:name="roadmap-25062026"/>
+    <w:bookmarkEnd w:id="29"/>
+    <w:bookmarkStart w:id="41" w:name="roadmap-28062026"/>
     <w:p>
       <w:pPr>
         <w:pStyle w:val="Heading2"/>
       </w:pPr>
       <w:r>
-        <w:t xml:space="preserve">4. Roadmap (25/06/2026)</w:t>
+        <w:t xml:space="preserve">4. Roadmap (28/06/2026)</w:t>
       </w:r>
     </w:p>
-    <w:bookmarkStart w:id="31" w:name="concluído"/>
+    <w:bookmarkStart w:id="39" w:name="concluído"/>
     <w:p>
       <w:pPr>
         <w:pStyle w:val="Heading3"/>
@@ -1340,7 +1493,7 @@
               <w:pStyle w:val="Compact"/>
               <w:jc w:val="left"/>
             </w:pPr>
-            <w:hyperlink r:id="rId20">
+            <w:hyperlink r:id="rId23">
               <w:r>
                 <w:rPr>
                   <w:rStyle w:val="VerbatimChar"/>
@@ -1383,7 +1536,7 @@
               <w:pStyle w:val="Compact"/>
               <w:jc w:val="left"/>
             </w:pPr>
-            <w:hyperlink r:id="rId21">
+            <w:hyperlink r:id="rId24">
               <w:r>
                 <w:rPr>
                   <w:rStyle w:val="VerbatimChar"/>
@@ -1426,7 +1579,7 @@
               <w:pStyle w:val="Compact"/>
               <w:jc w:val="left"/>
             </w:pPr>
-            <w:hyperlink r:id="rId22">
+            <w:hyperlink r:id="rId25">
               <w:r>
                 <w:rPr>
                   <w:rStyle w:val="VerbatimChar"/>
@@ -1511,7 +1664,7 @@
               <w:pStyle w:val="Compact"/>
               <w:jc w:val="left"/>
             </w:pPr>
-            <w:hyperlink r:id="rId27">
+            <w:hyperlink r:id="rId30">
               <w:r>
                 <w:rPr>
                   <w:rStyle w:val="VerbatimChar"/>
@@ -1519,12 +1672,6 @@
                 <w:t xml:space="preserve">historico-whatsapp.json</w:t>
               </w:r>
             </w:hyperlink>
-            <w:r>
-              <w:t xml:space="preserve"> </w:t>
-            </w:r>
-            <w:r>
-              <w:t xml:space="preserve">(519 mensagens)</w:t>
-            </w:r>
           </w:p>
         </w:tc>
         <w:tc>
@@ -1560,7 +1707,7 @@
               <w:pStyle w:val="Compact"/>
               <w:jc w:val="left"/>
             </w:pPr>
-            <w:hyperlink r:id="rId28">
+            <w:hyperlink r:id="rId31">
               <w:r>
                 <w:rPr>
                   <w:rStyle w:val="VerbatimChar"/>
@@ -1568,17 +1715,34 @@
                 <w:t xml:space="preserve">problema-real.md</w:t>
               </w:r>
             </w:hyperlink>
-          </w:p>
-        </w:tc>
-        <w:tc>
-          <w:tcPr/>
-          <w:p>
-            <w:pPr>
-              <w:pStyle w:val="Compact"/>
-              <w:jc w:val="center"/>
-            </w:pPr>
-            <w:r>
-              <w:t xml:space="preserve">Rios</w:t>
+            <w:r>
+              <w:t xml:space="preserve"> </w:t>
+            </w:r>
+            <w:r>
+              <w:t xml:space="preserve">→</w:t>
+            </w:r>
+            <w:r>
+              <w:t xml:space="preserve"> </w:t>
+            </w:r>
+            <w:hyperlink r:id="rId32">
+              <w:r>
+                <w:rPr>
+                  <w:rStyle w:val="VerbatimChar"/>
+                </w:rPr>
+                <w:t xml:space="preserve">problema-real.docx</w:t>
+              </w:r>
+            </w:hyperlink>
+          </w:p>
+        </w:tc>
+        <w:tc>
+          <w:tcPr/>
+          <w:p>
+            <w:pPr>
+              <w:pStyle w:val="Compact"/>
+              <w:jc w:val="center"/>
+            </w:pPr>
+            <w:r>
+              <w:t xml:space="preserve">Rios, Deivison</w:t>
             </w:r>
           </w:p>
         </w:tc>
@@ -1603,7 +1767,7 @@
               <w:pStyle w:val="Compact"/>
               <w:jc w:val="left"/>
             </w:pPr>
-            <w:hyperlink r:id="rId29">
+            <w:hyperlink r:id="rId33">
               <w:r>
                 <w:rPr>
                   <w:rStyle w:val="VerbatimChar"/>
@@ -1620,12 +1784,12 @@
             <w:r>
               <w:t xml:space="preserve"> </w:t>
             </w:r>
-            <w:hyperlink r:id="rId30">
+            <w:hyperlink r:id="rId34">
               <w:r>
                 <w:rPr>
                   <w:rStyle w:val="VerbatimChar"/>
                 </w:rPr>
-                <w:t xml:space="preserve">assets/fluxograma.jpeg</w:t>
+                <w:t xml:space="preserve">fluxograma.docx</w:t>
               </w:r>
             </w:hyperlink>
           </w:p>
@@ -1663,7 +1827,7 @@
               <w:pStyle w:val="Compact"/>
               <w:jc w:val="left"/>
             </w:pPr>
-            <w:hyperlink r:id="rId23">
+            <w:hyperlink r:id="rId26">
               <w:r>
                 <w:rPr>
                   <w:rStyle w:val="VerbatimChar"/>
@@ -1681,115 +1845,8 @@
               <w:jc w:val="center"/>
             </w:pPr>
             <w:r>
-              <w:t xml:space="preserve">Deivison</w:t>
-            </w:r>
-          </w:p>
-        </w:tc>
-      </w:tr>
-    </w:tbl>
-    <w:bookmarkEnd w:id="31"/>
-    <w:bookmarkStart w:id="34" w:name="em-andamento"/>
-    <w:p>
-      <w:pPr>
-        <w:pStyle w:val="Heading3"/>
-      </w:pPr>
-      <w:r>
-        <w:t xml:space="preserve">Em andamento</w:t>
-      </w:r>
-    </w:p>
-    <w:tbl>
-      <w:tblPr>
-        <w:tblStyle w:val="Table"/>
-        <w:tblW w:type="pct" w:w="5000"/>
-        <w:tblLayout w:type="fixed"/>
-        <w:tblLook w:firstRow="1" w:lastRow="0" w:firstColumn="0" w:lastColumn="0" w:noHBand="0" w:noVBand="0" w:val="0020"/>
-      </w:tblPr>
-      <w:tblGrid>
-        <w:gridCol w:w="1980"/>
-        <w:gridCol w:w="3960"/>
-        <w:gridCol w:w="1980"/>
-      </w:tblGrid>
-      <w:tr>
-        <w:trPr>
-          <w:tblHeader w:val="on"/>
-        </w:trPr>
-        <w:tc>
-          <w:tcPr/>
-          <w:p>
-            <w:pPr>
-              <w:pStyle w:val="Compact"/>
-              <w:jc w:val="left"/>
-            </w:pPr>
-            <w:r>
-              <w:t xml:space="preserve">O quê</w:t>
-            </w:r>
-          </w:p>
-        </w:tc>
-        <w:tc>
-          <w:tcPr/>
-          <w:p>
-            <w:pPr>
-              <w:pStyle w:val="Compact"/>
-              <w:jc w:val="left"/>
-            </w:pPr>
-            <w:r>
-              <w:t xml:space="preserve">Responsáveis</w:t>
-            </w:r>
-          </w:p>
-        </w:tc>
-        <w:tc>
-          <w:tcPr/>
-          <w:p>
-            <w:pPr>
-              <w:pStyle w:val="Compact"/>
-              <w:jc w:val="left"/>
-            </w:pPr>
-            <w:r>
-              <w:t xml:space="preserve">Local</w:t>
-            </w:r>
-          </w:p>
-        </w:tc>
-      </w:tr>
-      <w:tr>
-        <w:tc>
-          <w:tcPr/>
-          <w:p>
-            <w:pPr>
-              <w:pStyle w:val="Compact"/>
-              <w:jc w:val="left"/>
-            </w:pPr>
-            <w:r>
-              <w:t xml:space="preserve">Casos existentes</w:t>
-            </w:r>
-          </w:p>
-        </w:tc>
-        <w:tc>
-          <w:tcPr/>
-          <w:p>
-            <w:pPr>
-              <w:pStyle w:val="Compact"/>
-              <w:jc w:val="left"/>
-            </w:pPr>
-            <w:r>
-              <w:t xml:space="preserve">Ausiane + Nubia</w:t>
-            </w:r>
-          </w:p>
-        </w:tc>
-        <w:tc>
-          <w:tcPr/>
-          <w:p>
-            <w:pPr>
-              <w:pStyle w:val="Compact"/>
-              <w:jc w:val="left"/>
-            </w:pPr>
-            <w:hyperlink r:id="rId32">
-              <w:r>
-                <w:rPr>
-                  <w:rStyle w:val="Hyperlink"/>
-                </w:rPr>
-                <w:t xml:space="preserve">Google Doc</w:t>
-              </w:r>
-            </w:hyperlink>
+              <w:t xml:space="preserve">Deivison + Ausiane + Uélinton</w:t>
+            </w:r>
           </w:p>
         </w:tc>
       </w:tr>
@@ -1813,19 +1870,7 @@
               <w:pStyle w:val="Compact"/>
               <w:jc w:val="left"/>
             </w:pPr>
-            <w:r>
-              <w:t xml:space="preserve">Deivison + Rios</w:t>
-            </w:r>
-          </w:p>
-        </w:tc>
-        <w:tc>
-          <w:tcPr/>
-          <w:p>
-            <w:pPr>
-              <w:pStyle w:val="Compact"/>
-              <w:jc w:val="left"/>
-            </w:pPr>
-            <w:hyperlink r:id="rId33">
+            <w:hyperlink r:id="rId35">
               <w:r>
                 <w:rPr>
                   <w:rStyle w:val="VerbatimChar"/>
@@ -1833,12 +1878,165 @@
                 <w:t xml:space="preserve">proposta.md</w:t>
               </w:r>
             </w:hyperlink>
+            <w:r>
+              <w:t xml:space="preserve"> </w:t>
+            </w:r>
+            <w:r>
+              <w:t xml:space="preserve">→</w:t>
+            </w:r>
+            <w:r>
+              <w:t xml:space="preserve"> </w:t>
+            </w:r>
+            <w:hyperlink r:id="rId36">
+              <w:r>
+                <w:rPr>
+                  <w:rStyle w:val="VerbatimChar"/>
+                </w:rPr>
+                <w:t xml:space="preserve">proposta.docx</w:t>
+              </w:r>
+            </w:hyperlink>
+          </w:p>
+        </w:tc>
+        <w:tc>
+          <w:tcPr/>
+          <w:p>
+            <w:pPr>
+              <w:pStyle w:val="Compact"/>
+              <w:jc w:val="center"/>
+            </w:pPr>
+            <w:r>
+              <w:t xml:space="preserve">Deivison + Rios</w:t>
+            </w:r>
+          </w:p>
+        </w:tc>
+      </w:tr>
+      <w:tr>
+        <w:tc>
+          <w:tcPr/>
+          <w:p>
+            <w:pPr>
+              <w:pStyle w:val="Compact"/>
+              <w:jc w:val="left"/>
+            </w:pPr>
+            <w:r>
+              <w:t xml:space="preserve">Hub/landing page do projeto</w:t>
+            </w:r>
+          </w:p>
+        </w:tc>
+        <w:tc>
+          <w:tcPr/>
+          <w:p>
+            <w:pPr>
+              <w:pStyle w:val="Compact"/>
+              <w:jc w:val="left"/>
+            </w:pPr>
+            <w:hyperlink r:id="rId37">
+              <w:r>
+                <w:rPr>
+                  <w:rStyle w:val="VerbatimChar"/>
+                </w:rPr>
+                <w:t xml:space="preserve">minhafila/</w:t>
+              </w:r>
+            </w:hyperlink>
+          </w:p>
+        </w:tc>
+        <w:tc>
+          <w:tcPr/>
+          <w:p>
+            <w:pPr>
+              <w:pStyle w:val="Compact"/>
+              <w:jc w:val="center"/>
+            </w:pPr>
+            <w:r>
+              <w:t xml:space="preserve">Deivison</w:t>
+            </w:r>
+          </w:p>
+        </w:tc>
+      </w:tr>
+      <w:tr>
+        <w:tc>
+          <w:tcPr/>
+          <w:p>
+            <w:pPr>
+              <w:pStyle w:val="Compact"/>
+              <w:jc w:val="left"/>
+            </w:pPr>
+            <w:r>
+              <w:t xml:space="preserve">Casos existentes</w:t>
+            </w:r>
+          </w:p>
+        </w:tc>
+        <w:tc>
+          <w:tcPr/>
+          <w:p>
+            <w:pPr>
+              <w:pStyle w:val="Compact"/>
+              <w:jc w:val="left"/>
+            </w:pPr>
+            <w:hyperlink r:id="rId38">
+              <w:r>
+                <w:rPr>
+                  <w:rStyle w:val="VerbatimChar"/>
+                </w:rPr>
+                <w:t xml:space="preserve">casos-existentes.md</w:t>
+              </w:r>
+            </w:hyperlink>
+          </w:p>
+        </w:tc>
+        <w:tc>
+          <w:tcPr/>
+          <w:p>
+            <w:pPr>
+              <w:pStyle w:val="Compact"/>
+              <w:jc w:val="center"/>
+            </w:pPr>
+            <w:r>
+              <w:t xml:space="preserve">Ausiane + Núbia</w:t>
+            </w:r>
+          </w:p>
+        </w:tc>
+      </w:tr>
+      <w:tr>
+        <w:tc>
+          <w:tcPr/>
+          <w:p>
+            <w:pPr>
+              <w:pStyle w:val="Compact"/>
+              <w:jc w:val="left"/>
+            </w:pPr>
+            <w:r>
+              <w:t xml:space="preserve">Molde UFRB aplicado</w:t>
+            </w:r>
+          </w:p>
+        </w:tc>
+        <w:tc>
+          <w:tcPr/>
+          <w:p>
+            <w:pPr>
+              <w:pStyle w:val="Compact"/>
+              <w:jc w:val="left"/>
+            </w:pPr>
+            <w:r>
+              <w:t xml:space="preserve">Todos os .docx</w:t>
+            </w:r>
+          </w:p>
+        </w:tc>
+        <w:tc>
+          <w:tcPr/>
+          <w:p>
+            <w:pPr>
+              <w:pStyle w:val="Compact"/>
+              <w:jc w:val="center"/>
+            </w:pPr>
+            <w:r>
+              <w:t xml:space="preserve">Deivison</w:t>
+            </w:r>
           </w:p>
         </w:tc>
       </w:tr>
     </w:tbl>
-    <w:bookmarkEnd w:id="34"/>
-    <w:bookmarkStart w:id="35" w:name="pendente-prazo-28-2906"/>
+    <w:bookmarkEnd w:id="39"/>
+    <w:bookmarkStart w:id="40" w:name="pendente-prazo-28-2906"/>
     <w:p>
       <w:pPr>
         <w:pStyle w:val="Heading3"/>
@@ -1908,44 +2106,6 @@
               <w:jc w:val="left"/>
             </w:pPr>
             <w:r>
-              <w:t xml:space="preserve">Protótipo de telas (Figma)</w:t>
-            </w:r>
-          </w:p>
-        </w:tc>
-        <w:tc>
-          <w:tcPr/>
-          <w:p>
-            <w:pPr>
-              <w:pStyle w:val="Compact"/>
-              <w:jc w:val="left"/>
-            </w:pPr>
-            <w:r>
-              <w:t xml:space="preserve">Ausiane + Uélinton</w:t>
-            </w:r>
-          </w:p>
-        </w:tc>
-        <w:tc>
-          <w:tcPr/>
-          <w:p>
-            <w:pPr>
-              <w:pStyle w:val="Compact"/>
-              <w:jc w:val="center"/>
-            </w:pPr>
-            <w:r>
-              <w:t xml:space="preserve">28/06</w:t>
-            </w:r>
-          </w:p>
-        </w:tc>
-      </w:tr>
-      <w:tr>
-        <w:tc>
-          <w:tcPr/>
-          <w:p>
-            <w:pPr>
-              <w:pStyle w:val="Compact"/>
-              <w:jc w:val="left"/>
-            </w:pPr>
-            <w:r>
               <w:t xml:space="preserve">Slides da apresentação</w:t>
             </w:r>
           </w:p>
@@ -2021,9 +2181,9 @@
         </w:pict>
       </w:r>
     </w:p>
-    <w:bookmarkEnd w:id="35"/>
-    <w:bookmarkEnd w:id="36"/>
-    <w:bookmarkStart w:id="37" w:name="documentos-finais"/>
+    <w:bookmarkEnd w:id="40"/>
+    <w:bookmarkEnd w:id="41"/>
+    <w:bookmarkStart w:id="42" w:name="documentos-finais"/>
     <w:p>
       <w:pPr>
         <w:pStyle w:val="Heading2"/>
@@ -2035,12 +2195,13 @@
     <w:tbl>
       <w:tblPr>
         <w:tblStyle w:val="Table"/>
-        <w:tblW w:type="auto" w:w="0"/>
+        <w:tblW w:type="pct" w:w="5000"/>
+        <w:tblLayout w:type="fixed"/>
         <w:tblLook w:firstRow="1" w:lastRow="0" w:firstColumn="0" w:lastColumn="0" w:noHBand="0" w:noVBand="0" w:val="0020"/>
       </w:tblPr>
       <w:tblGrid>
-        <w:gridCol w:w="2640"/>
-        <w:gridCol w:w="2640"/>
+        <w:gridCol w:w="2904"/>
+        <w:gridCol w:w="2376"/>
         <w:gridCol w:w="2640"/>
       </w:tblGrid>
       <w:tr>
@@ -2117,8 +2278,19 @@
               <w:jc w:val="center"/>
             </w:pPr>
             <w:r>
-              <w:t xml:space="preserve">Converter</w:t>
-            </w:r>
+              <w:t xml:space="preserve">✅ Finalizado (molde UFRB) ·</w:t>
+            </w:r>
+            <w:r>
+              <w:t xml:space="preserve"> </w:t>
+            </w:r>
+            <w:hyperlink r:id="rId32">
+              <w:r>
+                <w:rPr>
+                  <w:rStyle w:val="Hyperlink"/>
+                </w:rPr>
+                <w:t xml:space="preserve">ver</w:t>
+              </w:r>
+            </w:hyperlink>
           </w:p>
         </w:tc>
       </w:tr>
@@ -2155,7 +2327,7 @@
               <w:jc w:val="center"/>
             </w:pPr>
             <w:r>
-              <w:t xml:space="preserve">Em elaboração</w:t>
+              <w:t xml:space="preserve">📄 md disponível</w:t>
             </w:r>
           </w:p>
         </w:tc>
@@ -2193,8 +2365,19 @@
               <w:jc w:val="center"/>
             </w:pPr>
             <w:r>
-              <w:t xml:space="preserve">Finalizar e converter</w:t>
-            </w:r>
+              <w:t xml:space="preserve">✅ Finalizado (molde UFRB) ·</w:t>
+            </w:r>
+            <w:r>
+              <w:t xml:space="preserve"> </w:t>
+            </w:r>
+            <w:hyperlink r:id="rId36">
+              <w:r>
+                <w:rPr>
+                  <w:rStyle w:val="Hyperlink"/>
+                </w:rPr>
+                <w:t xml:space="preserve">ver</w:t>
+              </w:r>
+            </w:hyperlink>
           </w:p>
         </w:tc>
       </w:tr>
@@ -2219,20 +2402,31 @@
               <w:jc w:val="left"/>
             </w:pPr>
             <w:r>
-              <w:t xml:space="preserve">PDF + JPEG + DOCX</w:t>
-            </w:r>
-          </w:p>
-        </w:tc>
-        <w:tc>
-          <w:tcPr/>
-          <w:p>
-            <w:pPr>
-              <w:pStyle w:val="Compact"/>
-              <w:jc w:val="center"/>
-            </w:pPr>
-            <w:r>
-              <w:t xml:space="preserve">Converter</w:t>
-            </w:r>
+              <w:t xml:space="preserve">DOCX + JPEG</w:t>
+            </w:r>
+          </w:p>
+        </w:tc>
+        <w:tc>
+          <w:tcPr/>
+          <w:p>
+            <w:pPr>
+              <w:pStyle w:val="Compact"/>
+              <w:jc w:val="center"/>
+            </w:pPr>
+            <w:r>
+              <w:t xml:space="preserve">✅ Finalizado (molde UFRB) ·</w:t>
+            </w:r>
+            <w:r>
+              <w:t xml:space="preserve"> </w:t>
+            </w:r>
+            <w:hyperlink r:id="rId34">
+              <w:r>
+                <w:rPr>
+                  <w:rStyle w:val="Hyperlink"/>
+                </w:rPr>
+                <w:t xml:space="preserve">ver</w:t>
+              </w:r>
+            </w:hyperlink>
           </w:p>
         </w:tc>
       </w:tr>
@@ -2257,19 +2451,19 @@
               <w:jc w:val="left"/>
             </w:pPr>
             <w:r>
-              <w:t xml:space="preserve">PDF com prints</w:t>
-            </w:r>
-          </w:p>
-        </w:tc>
-        <w:tc>
-          <w:tcPr/>
-          <w:p>
-            <w:pPr>
-              <w:pStyle w:val="Compact"/>
-              <w:jc w:val="center"/>
-            </w:pPr>
-            <w:r>
-              <w:t xml:space="preserve">Em produção no Figma</w:t>
+              <w:t xml:space="preserve">HTML funcional</w:t>
+            </w:r>
+          </w:p>
+        </w:tc>
+        <w:tc>
+          <w:tcPr/>
+          <w:p>
+            <w:pPr>
+              <w:pStyle w:val="Compact"/>
+              <w:jc w:val="center"/>
+            </w:pPr>
+            <w:r>
+              <w:t xml:space="preserve">✅ Disponível no hub</w:t>
             </w:r>
           </w:p>
         </w:tc>
@@ -2307,7 +2501,7 @@
               <w:jc w:val="center"/>
             </w:pPr>
             <w:r>
-              <w:t xml:space="preserve">Criar</w:t>
+              <w:t xml:space="preserve">⏳ Uélinton + Wallace</w:t>
             </w:r>
           </w:p>
         </w:tc>
@@ -2345,7 +2539,7 @@
               <w:jc w:val="center"/>
             </w:pPr>
             <w:r>
-              <w:t xml:space="preserve">Criar</w:t>
+              <w:t xml:space="preserve">⏳ Uélinton + Wallace</w:t>
             </w:r>
           </w:p>
         </w:tc>
@@ -2383,7 +2577,7 @@
               <w:jc w:val="center"/>
             </w:pPr>
             <w:r>
-              <w:t xml:space="preserve">Consolidar</w:t>
+              <w:t xml:space="preserve">📦 Arquivado</w:t>
             </w:r>
           </w:p>
         </w:tc>
@@ -2396,8 +2590,8 @@
         </w:pict>
       </w:r>
     </w:p>
-    <w:bookmarkEnd w:id="37"/>
-    <w:bookmarkStart w:id="39" w:name="status-atual"/>
+    <w:bookmarkEnd w:id="42"/>
+    <w:bookmarkStart w:id="43" w:name="status-atual"/>
     <w:p>
       <w:pPr>
         <w:pStyle w:val="Heading2"/>
@@ -2485,13 +2679,13 @@
           <w:b/>
           <w:bCs/>
         </w:rPr>
-        <w:t xml:space="preserve">Fluxograma:</w:t>
+        <w:t xml:space="preserve">Hub do projeto:</w:t>
       </w:r>
       <w:r>
         <w:t xml:space="preserve"> </w:t>
       </w:r>
       <w:r>
-        <w:t xml:space="preserve">finalizado e documentado</w:t>
+        <w:t xml:space="preserve">https://deivisan.github.io/Metodologia-EAD/minhafila/ (landing page com todos os links)</w:t>
       </w:r>
     </w:p>
     <w:p>
@@ -2513,19 +2707,8 @@
         <w:t xml:space="preserve"> </w:t>
       </w:r>
       <w:r>
-        <w:t xml:space="preserve">versão inicial disponível em</w:t>
-      </w:r>
-      <w:r>
-        <w:t xml:space="preserve"> </w:t>
-      </w:r>
-      <w:hyperlink r:id="rId38">
-        <w:r>
-          <w:rPr>
-            <w:rStyle w:val="VerbatimChar"/>
-          </w:rPr>
-          <w:t xml:space="preserve">prototipo-minhafila/</w:t>
-        </w:r>
-      </w:hyperlink>
+        <w:t xml:space="preserve">versão HTML com molde iPhone 15 disponível no hub</w:t>
+      </w:r>
     </w:p>
     <w:p>
       <w:pPr>
@@ -2540,25 +2723,14 @@
           <w:b/>
           <w:bCs/>
         </w:rPr>
-        <w:t xml:space="preserve">Histórico do WhatsApp:</w:t>
+        <w:t xml:space="preserve">Documentos .docx:</w:t>
       </w:r>
       <w:r>
         <w:t xml:space="preserve"> </w:t>
       </w:r>
       <w:r>
-        <w:t xml:space="preserve">519 mensagens (05/06 a 25/06) em</w:t>
-      </w:r>
-      <w:r>
-        <w:t xml:space="preserve"> </w:t>
-      </w:r>
-      <w:hyperlink r:id="rId27">
-        <w:r>
-          <w:rPr>
-            <w:rStyle w:val="VerbatimChar"/>
-          </w:rPr>
-          <w:t xml:space="preserve">historico-whatsapp.json</w:t>
-        </w:r>
-      </w:hyperlink>
+        <w:t xml:space="preserve">todos com molde UFRB (logo, cores, Times New Roman) — abrem direto no navegador via Office Online</w:t>
+      </w:r>
     </w:p>
     <w:p>
       <w:pPr>
@@ -2573,13 +2745,17 @@
           <w:b/>
           <w:bCs/>
         </w:rPr>
-        <w:t xml:space="preserve">GitHub Pages:</w:t>
+        <w:t xml:space="preserve">Apresentação final:</w:t>
       </w:r>
       <w:r>
         <w:t xml:space="preserve"> </w:t>
       </w:r>
       <w:r>
-        <w:t xml:space="preserve">https://deivisan.github.io/Metodologia-EAD/</w:t>
+        <w:rPr>
+          <w:b/>
+          <w:bCs/>
+        </w:rPr>
+        <w:t xml:space="preserve">29/06/2026 às 20h</w:t>
       </w:r>
     </w:p>
     <w:p>
@@ -2589,8 +2765,8 @@
         </w:pict>
       </w:r>
     </w:p>
-    <w:bookmarkEnd w:id="39"/>
-    <w:bookmarkStart w:id="40" w:name="fundamentação"/>
+    <w:bookmarkEnd w:id="43"/>
+    <w:bookmarkStart w:id="44" w:name="fundamentação"/>
     <w:p>
       <w:pPr>
         <w:pStyle w:val="Heading2"/>
@@ -2626,8 +2802,8 @@
         </w:pict>
       </w:r>
     </w:p>
-    <w:bookmarkEnd w:id="40"/>
-    <w:bookmarkStart w:id="44" w:name="links-rápidos"/>
+    <w:bookmarkEnd w:id="44"/>
+    <w:bookmarkStart w:id="47" w:name="links-rápidos"/>
     <w:p>
       <w:pPr>
         <w:pStyle w:val="Heading2"/>
@@ -2685,44 +2861,122 @@
               <w:jc w:val="left"/>
             </w:pPr>
             <w:r>
-              <w:t xml:space="preserve">Site do projeto (GitHub Pages)</w:t>
-            </w:r>
-          </w:p>
-        </w:tc>
-        <w:tc>
-          <w:tcPr/>
-          <w:p>
-            <w:pPr>
-              <w:pStyle w:val="Compact"/>
-              <w:jc w:val="left"/>
-            </w:pPr>
-            <w:r>
-              <w:t xml:space="preserve">https://deivisan.github.io/Metodologia-EAD/</w:t>
-            </w:r>
-          </w:p>
-        </w:tc>
-      </w:tr>
-      <w:tr>
-        <w:tc>
-          <w:tcPr/>
-          <w:p>
-            <w:pPr>
-              <w:pStyle w:val="Compact"/>
-              <w:jc w:val="left"/>
-            </w:pPr>
-            <w:r>
-              <w:t xml:space="preserve">Protótipo MinhaFila</w:t>
-            </w:r>
-          </w:p>
-        </w:tc>
-        <w:tc>
-          <w:tcPr/>
-          <w:p>
-            <w:pPr>
-              <w:pStyle w:val="Compact"/>
-              <w:jc w:val="left"/>
-            </w:pPr>
-            <w:hyperlink r:id="rId23">
+              <w:t xml:space="preserve">🏠 Hub do projeto (landing page)</w:t>
+            </w:r>
+          </w:p>
+        </w:tc>
+        <w:tc>
+          <w:tcPr/>
+          <w:p>
+            <w:pPr>
+              <w:pStyle w:val="Compact"/>
+              <w:jc w:val="left"/>
+            </w:pPr>
+            <w:r>
+              <w:t xml:space="preserve">https://deivisan.github.io/Metodologia-EAD/minhafila/</w:t>
+            </w:r>
+          </w:p>
+        </w:tc>
+      </w:tr>
+      <w:tr>
+        <w:tc>
+          <w:tcPr/>
+          <w:p>
+            <w:pPr>
+              <w:pStyle w:val="Compact"/>
+              <w:jc w:val="left"/>
+            </w:pPr>
+            <w:r>
+              <w:t xml:space="preserve">📋 Problema Real (.docx)</w:t>
+            </w:r>
+          </w:p>
+        </w:tc>
+        <w:tc>
+          <w:tcPr/>
+          <w:p>
+            <w:pPr>
+              <w:pStyle w:val="Compact"/>
+              <w:jc w:val="left"/>
+            </w:pPr>
+            <w:r>
+              <w:t xml:space="preserve">https://view.officeapps.live.com/op/view.aspx?src=https://raw.githubusercontent.com/Deivisan/Metodologia-EAD/main/disciplinas/gcetens843-projeto-algoritmo-i/atividades/trabalhos/projeto-algoritmos/problema-real.docx&amp;wdDownloadButton=1</w:t>
+            </w:r>
+          </w:p>
+        </w:tc>
+      </w:tr>
+      <w:tr>
+        <w:tc>
+          <w:tcPr/>
+          <w:p>
+            <w:pPr>
+              <w:pStyle w:val="Compact"/>
+              <w:jc w:val="left"/>
+            </w:pPr>
+            <w:r>
+              <w:t xml:space="preserve">💡 Proposta (.docx)</w:t>
+            </w:r>
+          </w:p>
+        </w:tc>
+        <w:tc>
+          <w:tcPr/>
+          <w:p>
+            <w:pPr>
+              <w:pStyle w:val="Compact"/>
+              <w:jc w:val="left"/>
+            </w:pPr>
+            <w:r>
+              <w:t xml:space="preserve">https://view.officeapps.live.com/op/view.aspx?src=https://raw.githubusercontent.com/Deivisan/Metodologia-EAD/main/disciplinas/gcetens843-projeto-algoritmo-i/atividades/trabalhos/projeto-algoritmos/proposta.docx&amp;wdDownloadButton=1</w:t>
+            </w:r>
+          </w:p>
+        </w:tc>
+      </w:tr>
+      <w:tr>
+        <w:tc>
+          <w:tcPr/>
+          <w:p>
+            <w:pPr>
+              <w:pStyle w:val="Compact"/>
+              <w:jc w:val="left"/>
+            </w:pPr>
+            <w:r>
+              <w:t xml:space="preserve">🌊 Fluxograma (.docx)</w:t>
+            </w:r>
+          </w:p>
+        </w:tc>
+        <w:tc>
+          <w:tcPr/>
+          <w:p>
+            <w:pPr>
+              <w:pStyle w:val="Compact"/>
+              <w:jc w:val="left"/>
+            </w:pPr>
+            <w:r>
+              <w:t xml:space="preserve">https://view.officeapps.live.com/op/view.aspx?src=https://raw.githubusercontent.com/Deivisan/Metodologia-EAD/main/disciplinas/gcetens843-projeto-algoritmo-i/atividades/trabalhos/projeto-algoritmos/fluxograma.docx&amp;wdDownloadButton=1</w:t>
+            </w:r>
+          </w:p>
+        </w:tc>
+      </w:tr>
+      <w:tr>
+        <w:tc>
+          <w:tcPr/>
+          <w:p>
+            <w:pPr>
+              <w:pStyle w:val="Compact"/>
+              <w:jc w:val="left"/>
+            </w:pPr>
+            <w:r>
+              <w:t xml:space="preserve">📱 Protótipo MinhaFila</w:t>
+            </w:r>
+          </w:p>
+        </w:tc>
+        <w:tc>
+          <w:tcPr/>
+          <w:p>
+            <w:pPr>
+              <w:pStyle w:val="Compact"/>
+              <w:jc w:val="left"/>
+            </w:pPr>
+            <w:hyperlink r:id="rId26">
               <w:r>
                 <w:rPr>
                   <w:rStyle w:val="VerbatimChar"/>
@@ -2742,308 +2996,95 @@
               <w:jc w:val="left"/>
             </w:pPr>
             <w:r>
-              <w:t xml:space="preserve">Tema completo</w:t>
-            </w:r>
-          </w:p>
-        </w:tc>
-        <w:tc>
-          <w:tcPr/>
-          <w:p>
-            <w:pPr>
-              <w:pStyle w:val="Compact"/>
-              <w:jc w:val="left"/>
-            </w:pPr>
-            <w:hyperlink r:id="rId20">
-              <w:r>
-                <w:rPr>
-                  <w:rStyle w:val="VerbatimChar"/>
-                </w:rPr>
-                <w:t xml:space="preserve">tema-escolhido.md</w:t>
-              </w:r>
-            </w:hyperlink>
-          </w:p>
-        </w:tc>
-      </w:tr>
-      <w:tr>
-        <w:tc>
-          <w:tcPr/>
-          <w:p>
-            <w:pPr>
-              <w:pStyle w:val="Compact"/>
-              <w:jc w:val="left"/>
-            </w:pPr>
-            <w:r>
-              <w:t xml:space="preserve">Divisão de tarefas</w:t>
-            </w:r>
-          </w:p>
-        </w:tc>
-        <w:tc>
-          <w:tcPr/>
-          <w:p>
-            <w:pPr>
-              <w:pStyle w:val="Compact"/>
-              <w:jc w:val="left"/>
-            </w:pPr>
-            <w:hyperlink r:id="rId21">
-              <w:r>
-                <w:rPr>
-                  <w:rStyle w:val="VerbatimChar"/>
-                </w:rPr>
-                <w:t xml:space="preserve">divisao-de-tarefas.md</w:t>
-              </w:r>
-            </w:hyperlink>
-          </w:p>
-        </w:tc>
-      </w:tr>
-      <w:tr>
-        <w:tc>
-          <w:tcPr/>
-          <w:p>
-            <w:pPr>
-              <w:pStyle w:val="Compact"/>
-              <w:jc w:val="left"/>
-            </w:pPr>
-            <w:r>
-              <w:t xml:space="preserve">Decisões do projeto</w:t>
-            </w:r>
-          </w:p>
-        </w:tc>
-        <w:tc>
-          <w:tcPr/>
-          <w:p>
-            <w:pPr>
-              <w:pStyle w:val="Compact"/>
-              <w:jc w:val="left"/>
-            </w:pPr>
-            <w:hyperlink r:id="rId22">
-              <w:r>
-                <w:rPr>
-                  <w:rStyle w:val="VerbatimChar"/>
-                </w:rPr>
-                <w:t xml:space="preserve">decisoes.md</w:t>
-              </w:r>
-            </w:hyperlink>
-          </w:p>
-        </w:tc>
-      </w:tr>
-      <w:tr>
-        <w:tc>
-          <w:tcPr/>
-          <w:p>
-            <w:pPr>
-              <w:pStyle w:val="Compact"/>
-              <w:jc w:val="left"/>
-            </w:pPr>
-            <w:r>
-              <w:t xml:space="preserve">Fluxograma</w:t>
-            </w:r>
-          </w:p>
-        </w:tc>
-        <w:tc>
-          <w:tcPr/>
-          <w:p>
-            <w:pPr>
-              <w:pStyle w:val="Compact"/>
-              <w:jc w:val="left"/>
-            </w:pPr>
-            <w:hyperlink r:id="rId29">
-              <w:r>
-                <w:rPr>
-                  <w:rStyle w:val="VerbatimChar"/>
-                </w:rPr>
-                <w:t xml:space="preserve">fluxograma.md</w:t>
-              </w:r>
-            </w:hyperlink>
-          </w:p>
-        </w:tc>
-      </w:tr>
-      <w:tr>
-        <w:tc>
-          <w:tcPr/>
-          <w:p>
-            <w:pPr>
-              <w:pStyle w:val="Compact"/>
-              <w:jc w:val="left"/>
-            </w:pPr>
-            <w:r>
-              <w:t xml:space="preserve">Proposta</w:t>
-            </w:r>
-          </w:p>
-        </w:tc>
-        <w:tc>
-          <w:tcPr/>
-          <w:p>
-            <w:pPr>
-              <w:pStyle w:val="Compact"/>
-              <w:jc w:val="left"/>
-            </w:pPr>
-            <w:hyperlink r:id="rId33">
-              <w:r>
-                <w:rPr>
-                  <w:rStyle w:val="VerbatimChar"/>
-                </w:rPr>
-                <w:t xml:space="preserve">proposta.md</w:t>
-              </w:r>
-            </w:hyperlink>
-          </w:p>
-        </w:tc>
-      </w:tr>
-      <w:tr>
-        <w:tc>
-          <w:tcPr/>
-          <w:p>
-            <w:pPr>
-              <w:pStyle w:val="Compact"/>
-              <w:jc w:val="left"/>
-            </w:pPr>
-            <w:r>
-              <w:t xml:space="preserve">Problema real</w:t>
-            </w:r>
-          </w:p>
-        </w:tc>
-        <w:tc>
-          <w:tcPr/>
-          <w:p>
-            <w:pPr>
-              <w:pStyle w:val="Compact"/>
-              <w:jc w:val="left"/>
-            </w:pPr>
-            <w:hyperlink r:id="rId28">
-              <w:r>
-                <w:rPr>
-                  <w:rStyle w:val="VerbatimChar"/>
-                </w:rPr>
-                <w:t xml:space="preserve">problema-real.md</w:t>
-              </w:r>
-            </w:hyperlink>
-          </w:p>
-        </w:tc>
-      </w:tr>
-      <w:tr>
-        <w:tc>
-          <w:tcPr/>
-          <w:p>
-            <w:pPr>
-              <w:pStyle w:val="Compact"/>
-              <w:jc w:val="left"/>
-            </w:pPr>
-            <w:r>
-              <w:t xml:space="preserve">Identidade visual</w:t>
-            </w:r>
-          </w:p>
-        </w:tc>
-        <w:tc>
-          <w:tcPr/>
-          <w:p>
-            <w:pPr>
-              <w:pStyle w:val="Compact"/>
-              <w:jc w:val="left"/>
-            </w:pPr>
-            <w:hyperlink r:id="rId41">
-              <w:r>
-                <w:rPr>
-                  <w:rStyle w:val="VerbatimChar"/>
-                </w:rPr>
-                <w:t xml:space="preserve">Identidade-visual.md</w:t>
-              </w:r>
-            </w:hyperlink>
-          </w:p>
-        </w:tc>
-      </w:tr>
-      <w:tr>
-        <w:tc>
-          <w:tcPr/>
-          <w:p>
-            <w:pPr>
-              <w:pStyle w:val="Compact"/>
-              <w:jc w:val="left"/>
-            </w:pPr>
-            <w:r>
-              <w:t xml:space="preserve">Histórico WhatsApp</w:t>
-            </w:r>
-          </w:p>
-        </w:tc>
-        <w:tc>
-          <w:tcPr/>
-          <w:p>
-            <w:pPr>
-              <w:pStyle w:val="Compact"/>
-              <w:jc w:val="left"/>
-            </w:pPr>
-            <w:hyperlink r:id="rId27">
-              <w:r>
-                <w:rPr>
-                  <w:rStyle w:val="VerbatimChar"/>
-                </w:rPr>
-                <w:t xml:space="preserve">historico-whatsapp.json</w:t>
-              </w:r>
-            </w:hyperlink>
-          </w:p>
-        </w:tc>
-      </w:tr>
-      <w:tr>
-        <w:tc>
-          <w:tcPr/>
-          <w:p>
-            <w:pPr>
-              <w:pStyle w:val="Compact"/>
-              <w:jc w:val="left"/>
-            </w:pPr>
-            <w:r>
-              <w:t xml:space="preserve">Documentação geral</w:t>
-            </w:r>
-          </w:p>
-        </w:tc>
-        <w:tc>
-          <w:tcPr/>
-          <w:p>
-            <w:pPr>
-              <w:pStyle w:val="Compact"/>
-              <w:jc w:val="left"/>
-            </w:pPr>
-            <w:hyperlink r:id="rId42">
-              <w:r>
-                <w:rPr>
-                  <w:rStyle w:val="VerbatimChar"/>
-                </w:rPr>
-                <w:t xml:space="preserve">documentacao-geral-projeto-algoritmos.md</w:t>
-              </w:r>
-            </w:hyperlink>
-          </w:p>
-        </w:tc>
-      </w:tr>
-      <w:tr>
-        <w:tc>
-          <w:tcPr/>
-          <w:p>
-            <w:pPr>
-              <w:pStyle w:val="Compact"/>
-              <w:jc w:val="left"/>
-            </w:pPr>
-            <w:r>
-              <w:t xml:space="preserve">Imagens do grupo</w:t>
-            </w:r>
-          </w:p>
-        </w:tc>
-        <w:tc>
-          <w:tcPr/>
-          <w:p>
-            <w:pPr>
-              <w:pStyle w:val="Compact"/>
-              <w:jc w:val="left"/>
-            </w:pPr>
-            <w:hyperlink r:id="rId43">
-              <w:r>
-                <w:rPr>
-                  <w:rStyle w:val="VerbatimChar"/>
-                </w:rPr>
-                <w:t xml:space="preserve">imagens-grupo/</w:t>
-              </w:r>
-            </w:hyperlink>
+              <w:t xml:space="preserve">🎤 Slides</w:t>
+            </w:r>
+          </w:p>
+        </w:tc>
+        <w:tc>
+          <w:tcPr/>
+          <w:p>
+            <w:pPr>
+              <w:pStyle w:val="Compact"/>
+              <w:jc w:val="left"/>
+            </w:pPr>
+            <w:r>
+              <w:t xml:space="preserve">https://docs.google.com/presentation/d/1tiaZ7SRLPvVglSnaWAuX7mTcRaERZuAtp9iSgXoPR6Q/edit</w:t>
+            </w:r>
           </w:p>
         </w:tc>
       </w:tr>
     </w:tbl>
+    <w:p>
+      <w:pPr>
+        <w:pStyle w:val="BodyText"/>
+      </w:pPr>
+      <w:r>
+        <w:t xml:space="preserve">Histórico WhatsApp |</w:t>
+      </w:r>
+      <w:r>
+        <w:t xml:space="preserve"> </w:t>
+      </w:r>
+      <w:hyperlink r:id="rId30">
+        <w:r>
+          <w:rPr>
+            <w:rStyle w:val="VerbatimChar"/>
+          </w:rPr>
+          <w:t xml:space="preserve">historico-whatsapp.json</w:t>
+        </w:r>
+      </w:hyperlink>
+      <w:r>
+        <w:t xml:space="preserve"> </w:t>
+      </w:r>
+      <w:r>
+        <w:t xml:space="preserve">|</w:t>
+      </w:r>
+      <w:r>
+        <w:br/>
+      </w:r>
+      <w:r>
+        <w:t xml:space="preserve">Documentação geral |</w:t>
+      </w:r>
+      <w:r>
+        <w:t xml:space="preserve"> </w:t>
+      </w:r>
+      <w:hyperlink r:id="rId45">
+        <w:r>
+          <w:rPr>
+            <w:rStyle w:val="VerbatimChar"/>
+          </w:rPr>
+          <w:t xml:space="preserve">documentacao-geral-projeto-algoritmos.md</w:t>
+        </w:r>
+      </w:hyperlink>
+      <w:r>
+        <w:t xml:space="preserve"> </w:t>
+      </w:r>
+      <w:r>
+        <w:t xml:space="preserve">|</w:t>
+      </w:r>
+      <w:r>
+        <w:br/>
+      </w:r>
+      <w:r>
+        <w:t xml:space="preserve">Imagens do grupo |</w:t>
+      </w:r>
+      <w:r>
+        <w:t xml:space="preserve"> </w:t>
+      </w:r>
+      <w:hyperlink r:id="rId46">
+        <w:r>
+          <w:rPr>
+            <w:rStyle w:val="VerbatimChar"/>
+          </w:rPr>
+          <w:t xml:space="preserve">imagens-grupo/</w:t>
+        </w:r>
+      </w:hyperlink>
+      <w:r>
+        <w:t xml:space="preserve"> </w:t>
+      </w:r>
+      <w:r>
+        <w:t xml:space="preserve">|</w:t>
+      </w:r>
+    </w:p>
     <w:p>
       <w:r>
         <w:pict>
@@ -3060,15 +3101,16 @@
           <w:i/>
           <w:iCs/>
         </w:rPr>
-        <w:t xml:space="preserve">Última atualização: 25/06/2026 — rebranding para MinhaFila, escopo multissetorial, acessibilidade como recurso importante, preparação para apresentação final em 29/06.</w:t>
+        <w:t xml:space="preserve">Última atualização: 28/06/2026 — hub no ar, .docx com molde UFRB, tudo pronto para apresentação final em 29/06.</w:t>
       </w:r>
     </w:p>
-    <w:bookmarkEnd w:id="44"/>
-    <w:bookmarkEnd w:id="45"/>
+    <w:bookmarkEnd w:id="47"/>
+    <w:bookmarkEnd w:id="48"/>
     <w:sectPr>
-      <w:headerReference w:type="default" r:id="rId9"/>
       <w:footerReference w:type="default" r:id="rId10"/>
-      <w:pgMar w:top="1728" w:bottom="1440" w:left="1440" w:right="1440"/>
+      <w:footnotePr>
+        <w:numRestart w:val="eachSect"/>
+      </w:footnotePr>
     </w:sectPr>
   </w:body>
 </w:document>
@@ -3115,142 +3157,6 @@
     </w:p>
   </w:footnote>
 </w:footnotes>
-</file>
-
-<file path=word/header1.xml><?xml version="1.0" encoding="utf-8"?>
-<w:hdr xmlns:m="http://schemas.openxmlformats.org/officeDocument/2006/math" xmlns:mc="http://schemas.openxmlformats.org/markup-compatibility/2006" xmlns:mo="http://schemas.microsoft.com/office/mac/office/2008/main" xmlns:mv="urn:schemas-microsoft-com:mac:vml" xmlns:o="urn:schemas-microsoft-com:office:office" xmlns:r="http://schemas.openxmlformats.org/officeDocument/2006/relationships" xmlns:v="urn:schemas-microsoft-com:vml" xmlns:w10="urn:schemas-microsoft-com:office:word" xmlns:w14="http://schemas.microsoft.com/office/word/2010/wordml" xmlns:w="http://schemas.openxmlformats.org/wordprocessingml/2006/main" xmlns:wne="http://schemas.microsoft.com/office/word/2006/wordml" xmlns:wp14="http://schemas.microsoft.com/office/word/2010/wordprocessingDrawing" xmlns:wp="http://schemas.openxmlformats.org/drawingml/2006/wordprocessingDrawing" xmlns:wpc="http://schemas.microsoft.com/office/word/2010/wordprocessingCanvas" xmlns:wpg="http://schemas.microsoft.com/office/word/2010/wordprocessingGroup" xmlns:wpi="http://schemas.microsoft.com/office/word/2010/wordprocessingInk" xmlns:wps="http://schemas.microsoft.com/office/word/2010/wordprocessingShape" mc:Ignorable="w14 wp14">
-  <w:p>
-    <w:pPr>
-      <w:pStyle w:val="Header"/>
-    </w:pPr>
-  </w:p>
-  <w:tbl>
-    <w:tblPr>
-      <w:tblW w:type="auto" w:w="0"/>
-      <w:tblLook w:firstColumn="1" w:firstRow="1" w:lastColumn="0" w:lastRow="0" w:noHBand="0" w:noVBand="1" w:val="04A0"/>
-    </w:tblPr>
-    <w:tblGrid>
-      <w:gridCol w:w="4680"/>
-      <w:gridCol w:w="4680"/>
-    </w:tblGrid>
-    <w:tr>
-      <w:tc>
-        <w:tcPr>
-          <w:tcW w:type="dxa" w:w="2016"/>
-          <w:tcBorders>
-            <w:top w:val="none" w:sz="0" w:space="0" w:color="auto"/>
-            <w:left w:val="none" w:sz="0" w:space="0" w:color="auto"/>
-            <w:bottom w:val="none" w:sz="0" w:space="0" w:color="auto"/>
-            <w:right w:val="none" w:sz="0" w:space="0" w:color="auto"/>
-          </w:tcBorders>
-        </w:tcPr>
-        <w:p>
-          <w:pPr>
-            <w:jc w:val="left"/>
-          </w:pPr>
-          <w:r>
-            <w:drawing>
-              <wp:inline xmlns:a="http://schemas.openxmlformats.org/drawingml/2006/main" xmlns:pic="http://schemas.openxmlformats.org/drawingml/2006/picture">
-                <wp:extent cx="1188720" cy="468220"/>
-                <wp:docPr id="1" name="Picture 1"/>
-                <wp:cNvGraphicFramePr>
-                  <a:graphicFrameLocks noChangeAspect="1"/>
-                </wp:cNvGraphicFramePr>
-                <a:graphic>
-                  <a:graphicData uri="http://schemas.openxmlformats.org/drawingml/2006/picture">
-                    <pic:pic>
-                      <pic:nvPicPr>
-                        <pic:cNvPr id="0" name="logo-ufrb-20-anos.png"/>
-                        <pic:cNvPicPr/>
-                      </pic:nvPicPr>
-                      <pic:blipFill>
-                        <a:blip r:embed="rId1"/>
-                        <a:stretch>
-                          <a:fillRect/>
-                        </a:stretch>
-                      </pic:blipFill>
-                      <pic:spPr>
-                        <a:xfrm>
-                          <a:off x="0" y="0"/>
-                          <a:ext cx="1188720" cy="468220"/>
-                        </a:xfrm>
-                        <a:prstGeom prst="rect"/>
-                      </pic:spPr>
-                    </pic:pic>
-                  </a:graphicData>
-                </a:graphic>
-              </wp:inline>
-            </w:drawing>
-          </w:r>
-        </w:p>
-      </w:tc>
-      <w:tc>
-        <w:tcPr>
-          <w:tcW w:type="dxa" w:w="7200"/>
-          <w:tcBorders>
-            <w:top w:val="none" w:sz="0" w:space="0" w:color="auto"/>
-            <w:left w:val="none" w:sz="0" w:space="0" w:color="auto"/>
-            <w:bottom w:val="none" w:sz="0" w:space="0" w:color="auto"/>
-            <w:right w:val="none" w:sz="0" w:space="0" w:color="auto"/>
-          </w:tcBorders>
-        </w:tcPr>
-        <w:p>
-          <w:pPr>
-            <w:jc w:val="left"/>
-          </w:pPr>
-          <w:r>
-            <w:rPr>
-              <w:rFonts w:ascii="Times New Roman" w:hAnsi="Times New Roman"/>
-              <w:b/>
-              <w:color w:val="003D6B"/>
-              <w:sz w:val="16"/>
-            </w:rPr>
-            <w:t>UNIVERSIDADE FEDERAL DO RECÔNCAVO DA BAHIA — UFRB</w:t>
-          </w:r>
-        </w:p>
-        <w:p>
-          <w:pPr>
-            <w:jc w:val="left"/>
-          </w:pPr>
-          <w:r>
-            <w:rPr>
-              <w:rFonts w:ascii="Times New Roman" w:hAnsi="Times New Roman"/>
-              <w:b/>
-              <w:color w:val="006DAA"/>
-              <w:sz w:val="15"/>
-            </w:rPr>
-            <w:t>CENTRO DE CIÊNCIA E TECNOLOGIA — CETENS</w:t>
-          </w:r>
-        </w:p>
-        <w:p>
-          <w:pPr>
-            <w:jc w:val="left"/>
-          </w:pPr>
-          <w:r>
-            <w:rPr>
-              <w:rFonts w:ascii="Times New Roman" w:hAnsi="Times New Roman"/>
-              <w:color w:val="505050"/>
-              <w:sz w:val="14"/>
-            </w:rPr>
-            <w:t>BACHARELADO EM SISTEMAS DE INFORMAÇÃO (EAD)</w:t>
-          </w:r>
-        </w:p>
-        <w:p>
-          <w:pPr>
-            <w:jc w:val="left"/>
-          </w:pPr>
-          <w:r>
-            <w:rPr>
-              <w:color w:val="C89B3C"/>
-              <w:sz w:val="8"/>
-            </w:rPr>
-            <w:t>────────────────────────────────────────────────────────────────────────────────</w:t>
-          </w:r>
-        </w:p>
-      </w:tc>
-    </w:tr>
-  </w:tbl>
-</w:hdr>
 </file>
 
 <file path=word/numbering.xml><?xml version="1.0" encoding="utf-8"?>

</xml_diff>

<commit_message>
Revert "fix: regenera Index-Geral.docx com molde UFRB (capa, logo, Times New Roman, rodapé) - documento agora com 2.2MB, 2 imagens embutidas, capa institucional"
This reverts commit 8c5a4dd89da1811a80475334143b588a5483d60e.
</commit_message>
<xml_diff>
--- a/disciplinas/gcetens843-projeto-algoritmo-i/atividades/trabalhos/projeto-algoritmos/Index-Geral.docx
+++ b/disciplinas/gcetens843-projeto-algoritmo-i/atividades/trabalhos/projeto-algoritmos/Index-Geral.docx
@@ -2,132 +2,7 @@
 <file path=word/document.xml><?xml version="1.0" encoding="utf-8"?>
 <w:document xmlns:w="http://schemas.openxmlformats.org/wordprocessingml/2006/main" xmlns:m="http://schemas.openxmlformats.org/officeDocument/2006/math" xmlns:r="http://schemas.openxmlformats.org/officeDocument/2006/relationships" xmlns:o="urn:schemas-microsoft-com:office:office" xmlns:v="urn:schemas-microsoft-com:vml" xmlns:w10="urn:schemas-microsoft-com:office:word" xmlns:a="http://schemas.openxmlformats.org/drawingml/2006/main" xmlns:pic="http://schemas.openxmlformats.org/drawingml/2006/picture" xmlns:wp="http://schemas.openxmlformats.org/drawingml/2006/wordprocessingDrawing">
   <w:body>
-    <w:bookmarkStart w:id="48" w:name="index-geral-minhafila"/>
-    <w:tbl>
-      <w:tblPr>
-        <w:tblW w:type="auto" w:w="0"/>
-        <w:jc w:val="left"/>
-        <w:tblLayout w:type="fixed"/>
-        <w:tblLook w:firstColumn="1" w:firstRow="1" w:lastColumn="0" w:lastRow="0" w:noHBand="0" w:noVBand="1" w:val="04A0"/>
-        <w:tblBorders>
-          <w:top w:val="none" w:sz="0" w:space="0" w:color="auto"/>
-          <w:left w:val="none" w:sz="0" w:space="0" w:color="auto"/>
-          <w:bottom w:val="none" w:sz="0" w:space="0" w:color="auto"/>
-          <w:right w:val="none" w:sz="0" w:space="0" w:color="auto"/>
-        </w:tblBorders>
-      </w:tblPr>
-      <w:tblGrid>
-        <w:gridCol w:w="4680"/>
-        <w:gridCol w:w="4680"/>
-      </w:tblGrid>
-      <w:tr>
-        <w:tc>
-          <w:tcPr>
-            <w:tcW w:type="dxa" w:w="2016"/>
-          </w:tcPr>
-          <w:p>
-            <w:pPr>
-              <w:jc w:val="left"/>
-            </w:pPr>
-            <w:r>
-              <w:drawing>
-                <wp:inline>
-                  <wp:extent cx="1143000" cy="450211"/>
-                  <wp:docPr id="23" name="Picture 23"/>
-                  <wp:cNvGraphicFramePr>
-                    <a:graphicFrameLocks noChangeAspect="1"/>
-                  </wp:cNvGraphicFramePr>
-                  <a:graphic>
-                    <a:graphicData uri="http://schemas.openxmlformats.org/drawingml/2006/picture">
-                      <pic:pic>
-                        <pic:nvPicPr>
-                          <pic:cNvPr id="0" name="logo-ufrb-20-anos.png"/>
-                          <pic:cNvPicPr/>
-                        </pic:nvPicPr>
-                        <pic:blipFill>
-                          <a:blip r:embed="rId9"/>
-                          <a:stretch>
-                            <a:fillRect/>
-                          </a:stretch>
-                        </pic:blipFill>
-                        <pic:spPr>
-                          <a:xfrm>
-                            <a:off x="0" y="0"/>
-                            <a:ext cx="1143000" cy="450211"/>
-                          </a:xfrm>
-                          <a:prstGeom prst="rect"/>
-                        </pic:spPr>
-                      </pic:pic>
-                    </a:graphicData>
-                  </a:graphic>
-                </wp:inline>
-              </w:drawing>
-            </w:r>
-          </w:p>
-        </w:tc>
-        <w:tc>
-          <w:tcPr>
-            <w:tcW w:type="dxa" w:w="7200"/>
-          </w:tcPr>
-          <w:p>
-            <w:pPr>
-              <w:jc w:val="left"/>
-            </w:pPr>
-            <w:r>
-              <w:rPr>
-                <w:rFonts w:ascii="Times New Roman" w:hAnsi="Times New Roman"/>
-                <w:b/>
-                <w:color w:val="003D6B"/>
-                <w:sz w:val="16"/>
-              </w:rPr>
-              <w:t>UNIVERSIDADE FEDERAL DO RECÔNCAVO DA BAHIA — UFRB</w:t>
-            </w:r>
-          </w:p>
-          <w:p>
-            <w:pPr>
-              <w:jc w:val="left"/>
-            </w:pPr>
-            <w:r>
-              <w:rPr>
-                <w:rFonts w:ascii="Times New Roman" w:hAnsi="Times New Roman"/>
-                <w:b/>
-                <w:color w:val="006DAA"/>
-                <w:sz w:val="15"/>
-              </w:rPr>
-              <w:t>CENTRO DE CIÊNCIA E TECNOLOGIA — CETENS</w:t>
-            </w:r>
-          </w:p>
-          <w:p>
-            <w:pPr>
-              <w:jc w:val="left"/>
-            </w:pPr>
-            <w:r>
-              <w:rPr>
-                <w:rFonts w:ascii="Times New Roman" w:hAnsi="Times New Roman"/>
-                <w:b w:val="0"/>
-                <w:color w:val="505050"/>
-                <w:sz w:val="14"/>
-              </w:rPr>
-              <w:t>BACHARELADO EM SISTEMAS DE INFORMAÇÃO (EAD)</w:t>
-            </w:r>
-          </w:p>
-          <w:p>
-            <w:pPr>
-              <w:jc w:val="left"/>
-            </w:pPr>
-            <w:r>
-              <w:rPr>
-                <w:rFonts w:ascii="Times New Roman" w:hAnsi="Times New Roman"/>
-                <w:b w:val="0"/>
-                <w:color w:val="C89B3C"/>
-                <w:sz w:val="8"/>
-              </w:rPr>
-              <w:t>────────────────────────────────────────────────────────────────────────────────</w:t>
-            </w:r>
-          </w:p>
-        </w:tc>
-      </w:tr>
-    </w:tbl>
+    <w:bookmarkStart w:id="45" w:name="index-geral-minhafila"/>
     <w:p>
       <w:pPr>
         <w:pStyle w:val="Heading1"/>
@@ -151,53 +26,31 @@
         </w:pict>
       </w:r>
     </w:p>
-    <w:p>
-      <w:pPr>
-        <w:pStyle w:val="CaptionedFigure"/>
-      </w:pPr>
-      <w:r>
-        <w:drawing>
-          <wp:inline>
-            <wp:extent cx="5334000" cy="3001970"/>
-            <wp:effectExtent b="0" l="0" r="0" t="0"/>
-            <wp:docPr descr="Foto do grupo" title="" id="21" name="Picture"/>
-            <a:graphic>
-              <a:graphicData uri="http://schemas.openxmlformats.org/drawingml/2006/picture">
-                <pic:pic>
-                  <pic:nvPicPr>
-                    <pic:cNvPr descr="imagens-grupo/nova-foto-grupo.png" id="22" name="Picture"/>
-                    <pic:cNvPicPr>
-                      <a:picLocks noChangeArrowheads="1" noChangeAspect="1"/>
-                    </pic:cNvPicPr>
-                  </pic:nvPicPr>
-                  <pic:blipFill>
-                    <a:blip r:embed="rId20"/>
-                    <a:stretch>
-                      <a:fillRect/>
-                    </a:stretch>
-                  </pic:blipFill>
-                  <pic:spPr bwMode="auto">
-                    <a:xfrm>
-                      <a:off x="0" y="0"/>
-                      <a:ext cx="5334000" cy="3001970"/>
-                    </a:xfrm>
-                    <a:prstGeom prst="rect">
-                      <a:avLst/>
-                    </a:prstGeom>
-                    <a:noFill/>
-                    <a:ln w="9525">
-                      <a:noFill/>
-                      <a:headEnd/>
-                      <a:tailEnd/>
-                    </a:ln>
-                  </pic:spPr>
-                </pic:pic>
-              </a:graphicData>
-            </a:graphic>
-          </wp:inline>
-        </w:drawing>
-      </w:r>
-    </w:p>
+    <w:tbl>
+      <w:tblPr>
+        <w:tblStyle w:val="FigureTable"/>
+        <w:tblW w:type="auto" w:w="0"/>
+        <w:jc w:val="center"/>
+        <w:tblLook w:firstRow="0" w:lastRow="0" w:firstColumn="0" w:lastColumn="0"/>
+      </w:tblPr>
+      <w:tblGrid>
+        <w:gridCol w:w="7920"/>
+      </w:tblGrid>
+      <w:tr>
+        <w:tc>
+          <w:tcPr/>
+          <w:p>
+            <w:pPr>
+              <w:pStyle w:val="Compact"/>
+              <w:jc w:val="center"/>
+            </w:pPr>
+            <w:r>
+              <w:t xml:space="preserve">Foto do grupo</w:t>
+            </w:r>
+          </w:p>
+        </w:tc>
+      </w:tr>
+    </w:tbl>
     <w:p>
       <w:pPr>
         <w:pStyle w:val="ImageCaption"/>
@@ -215,7 +68,7 @@
           <w:i/>
           <w:iCs/>
         </w:rPr>
-        <w:t xml:space="preserve">Grupo: Deivison, Ausiane de Oliveira Costa, Raimon Rios da Silva, Artur Campos, Uélinton Cardoso Santana, Núbia Rosália de Souza Ramos, Marcos Vinícius dos Santos Sena e Wallace Ribeiro Lima.</w:t>
+        <w:t xml:space="preserve">Grupo: Deivison, Ausiane, Rios, Artur, Uélinton, Nubia, Marcos Vinicius e Wallace.</w:t>
       </w:r>
     </w:p>
     <w:p>
@@ -225,7 +78,7 @@
         </w:pict>
       </w:r>
     </w:p>
-    <w:bookmarkStart w:id="27" w:name="resumo-do-projeto"/>
+    <w:bookmarkStart w:id="24" w:name="resumo-do-projeto"/>
     <w:p>
       <w:pPr>
         <w:pStyle w:val="Heading2"/>
@@ -497,7 +350,7 @@
       <w:pPr>
         <w:pStyle w:val="BlockText"/>
       </w:pPr>
-      <w:hyperlink r:id="rId23">
+      <w:hyperlink r:id="rId20">
         <w:r>
           <w:rPr>
             <w:rStyle w:val="Hyperlink"/>
@@ -514,7 +367,7 @@
       <w:r>
         <w:t xml:space="preserve"> </w:t>
       </w:r>
-      <w:hyperlink r:id="rId24">
+      <w:hyperlink r:id="rId21">
         <w:r>
           <w:rPr>
             <w:rStyle w:val="Hyperlink"/>
@@ -531,7 +384,7 @@
       <w:r>
         <w:t xml:space="preserve"> </w:t>
       </w:r>
-      <w:hyperlink r:id="rId25">
+      <w:hyperlink r:id="rId22">
         <w:r>
           <w:rPr>
             <w:rStyle w:val="Hyperlink"/>
@@ -548,7 +401,7 @@
       <w:r>
         <w:t xml:space="preserve"> </w:t>
       </w:r>
-      <w:hyperlink r:id="rId26">
+      <w:hyperlink r:id="rId23">
         <w:r>
           <w:rPr>
             <w:rStyle w:val="Hyperlink"/>
@@ -564,8 +417,8 @@
         </w:pict>
       </w:r>
     </w:p>
-    <w:bookmarkEnd w:id="27"/>
-    <w:bookmarkStart w:id="28" w:name="integrantes-e-atribuições"/>
+    <w:bookmarkEnd w:id="24"/>
+    <w:bookmarkStart w:id="25" w:name="integrantes-e-atribuições"/>
     <w:p>
       <w:pPr>
         <w:pStyle w:val="Heading2"/>
@@ -719,7 +572,7 @@
                 <w:b/>
                 <w:bCs/>
               </w:rPr>
-              <w:t xml:space="preserve">Raimon Rios da Silva</w:t>
+              <w:t xml:space="preserve">Rios</w:t>
             </w:r>
           </w:p>
         </w:tc>
@@ -773,19 +626,19 @@
                 <w:b/>
                 <w:bCs/>
               </w:rPr>
-              <w:t xml:space="preserve">Ausiane de Oliveira Costa</w:t>
-            </w:r>
-          </w:p>
-        </w:tc>
-        <w:tc>
-          <w:tcPr/>
-          <w:p>
-            <w:pPr>
-              <w:pStyle w:val="Compact"/>
-              <w:jc w:val="left"/>
-            </w:pPr>
-            <w:r>
-              <w:t xml:space="preserve">Casos existentes, protótipo (acessibilidade), documentação de acessibilidade</w:t>
+              <w:t xml:space="preserve">Ausiane</w:t>
+            </w:r>
+          </w:p>
+        </w:tc>
+        <w:tc>
+          <w:tcPr/>
+          <w:p>
+            <w:pPr>
+              <w:pStyle w:val="Compact"/>
+              <w:jc w:val="left"/>
+            </w:pPr>
+            <w:r>
+              <w:t xml:space="preserve">Casos existentes, protótipo (design e acessibilidade), documentação de acessibilidade</w:t>
             </w:r>
           </w:p>
         </w:tc>
@@ -827,7 +680,7 @@
                 <w:b/>
                 <w:bCs/>
               </w:rPr>
-              <w:t xml:space="preserve">Núbia Rosália de Souza Ramos</w:t>
+              <w:t xml:space="preserve">Nubia</w:t>
             </w:r>
           </w:p>
         </w:tc>
@@ -881,7 +734,7 @@
                 <w:b/>
                 <w:bCs/>
               </w:rPr>
-              <w:t xml:space="preserve">Artur Campos</w:t>
+              <w:t xml:space="preserve">Artur</w:t>
             </w:r>
           </w:p>
         </w:tc>
@@ -935,7 +788,7 @@
                 <w:b/>
                 <w:bCs/>
               </w:rPr>
-              <w:t xml:space="preserve">Marcos Vinícius dos Santos Sena</w:t>
+              <w:t xml:space="preserve">Marcos Vinicius</w:t>
             </w:r>
           </w:p>
         </w:tc>
@@ -989,7 +842,7 @@
                 <w:b/>
                 <w:bCs/>
               </w:rPr>
-              <w:t xml:space="preserve">Uélinton Cardoso Santana</w:t>
+              <w:t xml:space="preserve">Uélinton</w:t>
             </w:r>
           </w:p>
         </w:tc>
@@ -1043,7 +896,7 @@
                 <w:b/>
                 <w:bCs/>
               </w:rPr>
-              <w:t xml:space="preserve">Wallace Ribeiro Lima</w:t>
+              <w:t xml:space="preserve">Wallace</w:t>
             </w:r>
           </w:p>
         </w:tc>
@@ -1067,7 +920,7 @@
               <w:jc w:val="center"/>
             </w:pPr>
             <w:r>
-              <w:t xml:space="preserve">Ativo</w:t>
+              <w:t xml:space="preserve">A definir</w:t>
             </w:r>
           </w:p>
         </w:tc>
@@ -1077,7 +930,7 @@
       <w:pPr>
         <w:pStyle w:val="BlockText"/>
       </w:pPr>
-      <w:hyperlink r:id="rId24">
+      <w:hyperlink r:id="rId21">
         <w:r>
           <w:rPr>
             <w:rStyle w:val="Hyperlink"/>
@@ -1093,8 +946,8 @@
         </w:pict>
       </w:r>
     </w:p>
-    <w:bookmarkEnd w:id="28"/>
-    <w:bookmarkStart w:id="29" w:name="requisitos-da-disciplina"/>
+    <w:bookmarkEnd w:id="25"/>
+    <w:bookmarkStart w:id="26" w:name="requisitos-da-disciplina"/>
     <w:p>
       <w:pPr>
         <w:pStyle w:val="Heading2"/>
@@ -1188,7 +1041,7 @@
               <w:jc w:val="center"/>
             </w:pPr>
             <w:r>
-              <w:t xml:space="preserve">✅ Concluído (.docx)</w:t>
+              <w:t xml:space="preserve">Concluído</w:t>
             </w:r>
           </w:p>
         </w:tc>
@@ -1226,7 +1079,7 @@
               <w:jc w:val="center"/>
             </w:pPr>
             <w:r>
-              <w:t xml:space="preserve">✅ Concluído</w:t>
+              <w:t xml:space="preserve">Em andamento</w:t>
             </w:r>
           </w:p>
         </w:tc>
@@ -1264,7 +1117,7 @@
               <w:jc w:val="center"/>
             </w:pPr>
             <w:r>
-              <w:t xml:space="preserve">✅ Concluído (.docx)</w:t>
+              <w:t xml:space="preserve">Em andamento</w:t>
             </w:r>
           </w:p>
         </w:tc>
@@ -1302,7 +1155,7 @@
               <w:jc w:val="center"/>
             </w:pPr>
             <w:r>
-              <w:t xml:space="preserve">✅ Concluído (.docx + JPEG)</w:t>
+              <w:t xml:space="preserve">Concluído</w:t>
             </w:r>
           </w:p>
         </w:tc>
@@ -1340,7 +1193,7 @@
               <w:jc w:val="center"/>
             </w:pPr>
             <w:r>
-              <w:t xml:space="preserve">✅ Concluído (HTML funcional)</w:t>
+              <w:t xml:space="preserve">Em andamento</w:t>
             </w:r>
           </w:p>
         </w:tc>
@@ -1377,12 +1230,6 @@
               <w:pStyle w:val="Compact"/>
               <w:jc w:val="center"/>
             </w:pPr>
-            <w:r>
-              <w:t xml:space="preserve">🔴</w:t>
-            </w:r>
-            <w:r>
-              <w:t xml:space="preserve"> </w:t>
-            </w:r>
             <w:r>
               <w:rPr>
                 <w:b/>
@@ -1401,17 +1248,17 @@
         </w:pict>
       </w:r>
     </w:p>
-    <w:bookmarkEnd w:id="29"/>
-    <w:bookmarkStart w:id="41" w:name="roadmap-28062026"/>
+    <w:bookmarkEnd w:id="26"/>
+    <w:bookmarkStart w:id="36" w:name="roadmap-25062026"/>
     <w:p>
       <w:pPr>
         <w:pStyle w:val="Heading2"/>
       </w:pPr>
       <w:r>
-        <w:t xml:space="preserve">4. Roadmap (28/06/2026)</w:t>
+        <w:t xml:space="preserve">4. Roadmap (25/06/2026)</w:t>
       </w:r>
     </w:p>
-    <w:bookmarkStart w:id="39" w:name="concluído"/>
+    <w:bookmarkStart w:id="31" w:name="concluído"/>
     <w:p>
       <w:pPr>
         <w:pStyle w:val="Heading3"/>
@@ -1493,7 +1340,7 @@
               <w:pStyle w:val="Compact"/>
               <w:jc w:val="left"/>
             </w:pPr>
-            <w:hyperlink r:id="rId23">
+            <w:hyperlink r:id="rId20">
               <w:r>
                 <w:rPr>
                   <w:rStyle w:val="VerbatimChar"/>
@@ -1536,7 +1383,7 @@
               <w:pStyle w:val="Compact"/>
               <w:jc w:val="left"/>
             </w:pPr>
-            <w:hyperlink r:id="rId24">
+            <w:hyperlink r:id="rId21">
               <w:r>
                 <w:rPr>
                   <w:rStyle w:val="VerbatimChar"/>
@@ -1579,7 +1426,7 @@
               <w:pStyle w:val="Compact"/>
               <w:jc w:val="left"/>
             </w:pPr>
-            <w:hyperlink r:id="rId25">
+            <w:hyperlink r:id="rId22">
               <w:r>
                 <w:rPr>
                   <w:rStyle w:val="VerbatimChar"/>
@@ -1664,7 +1511,7 @@
               <w:pStyle w:val="Compact"/>
               <w:jc w:val="left"/>
             </w:pPr>
-            <w:hyperlink r:id="rId30">
+            <w:hyperlink r:id="rId27">
               <w:r>
                 <w:rPr>
                   <w:rStyle w:val="VerbatimChar"/>
@@ -1672,6 +1519,12 @@
                 <w:t xml:space="preserve">historico-whatsapp.json</w:t>
               </w:r>
             </w:hyperlink>
+            <w:r>
+              <w:t xml:space="preserve"> </w:t>
+            </w:r>
+            <w:r>
+              <w:t xml:space="preserve">(519 mensagens)</w:t>
+            </w:r>
           </w:p>
         </w:tc>
         <w:tc>
@@ -1707,7 +1560,7 @@
               <w:pStyle w:val="Compact"/>
               <w:jc w:val="left"/>
             </w:pPr>
-            <w:hyperlink r:id="rId31">
+            <w:hyperlink r:id="rId28">
               <w:r>
                 <w:rPr>
                   <w:rStyle w:val="VerbatimChar"/>
@@ -1715,34 +1568,17 @@
                 <w:t xml:space="preserve">problema-real.md</w:t>
               </w:r>
             </w:hyperlink>
-            <w:r>
-              <w:t xml:space="preserve"> </w:t>
-            </w:r>
-            <w:r>
-              <w:t xml:space="preserve">→</w:t>
-            </w:r>
-            <w:r>
-              <w:t xml:space="preserve"> </w:t>
-            </w:r>
-            <w:hyperlink r:id="rId32">
-              <w:r>
-                <w:rPr>
-                  <w:rStyle w:val="VerbatimChar"/>
-                </w:rPr>
-                <w:t xml:space="preserve">problema-real.docx</w:t>
-              </w:r>
-            </w:hyperlink>
-          </w:p>
-        </w:tc>
-        <w:tc>
-          <w:tcPr/>
-          <w:p>
-            <w:pPr>
-              <w:pStyle w:val="Compact"/>
-              <w:jc w:val="center"/>
-            </w:pPr>
-            <w:r>
-              <w:t xml:space="preserve">Rios, Deivison</w:t>
+          </w:p>
+        </w:tc>
+        <w:tc>
+          <w:tcPr/>
+          <w:p>
+            <w:pPr>
+              <w:pStyle w:val="Compact"/>
+              <w:jc w:val="center"/>
+            </w:pPr>
+            <w:r>
+              <w:t xml:space="preserve">Rios</w:t>
             </w:r>
           </w:p>
         </w:tc>
@@ -1767,7 +1603,7 @@
               <w:pStyle w:val="Compact"/>
               <w:jc w:val="left"/>
             </w:pPr>
-            <w:hyperlink r:id="rId33">
+            <w:hyperlink r:id="rId29">
               <w:r>
                 <w:rPr>
                   <w:rStyle w:val="VerbatimChar"/>
@@ -1784,12 +1620,12 @@
             <w:r>
               <w:t xml:space="preserve"> </w:t>
             </w:r>
-            <w:hyperlink r:id="rId34">
+            <w:hyperlink r:id="rId30">
               <w:r>
                 <w:rPr>
                   <w:rStyle w:val="VerbatimChar"/>
                 </w:rPr>
-                <w:t xml:space="preserve">fluxograma.docx</w:t>
+                <w:t xml:space="preserve">assets/fluxograma.jpeg</w:t>
               </w:r>
             </w:hyperlink>
           </w:p>
@@ -1827,7 +1663,7 @@
               <w:pStyle w:val="Compact"/>
               <w:jc w:val="left"/>
             </w:pPr>
-            <w:hyperlink r:id="rId26">
+            <w:hyperlink r:id="rId23">
               <w:r>
                 <w:rPr>
                   <w:rStyle w:val="VerbatimChar"/>
@@ -1845,8 +1681,115 @@
               <w:jc w:val="center"/>
             </w:pPr>
             <w:r>
-              <w:t xml:space="preserve">Deivison + Ausiane + Uélinton</w:t>
-            </w:r>
+              <w:t xml:space="preserve">Deivison</w:t>
+            </w:r>
+          </w:p>
+        </w:tc>
+      </w:tr>
+    </w:tbl>
+    <w:bookmarkEnd w:id="31"/>
+    <w:bookmarkStart w:id="34" w:name="em-andamento"/>
+    <w:p>
+      <w:pPr>
+        <w:pStyle w:val="Heading3"/>
+      </w:pPr>
+      <w:r>
+        <w:t xml:space="preserve">Em andamento</w:t>
+      </w:r>
+    </w:p>
+    <w:tbl>
+      <w:tblPr>
+        <w:tblStyle w:val="Table"/>
+        <w:tblW w:type="pct" w:w="5000"/>
+        <w:tblLayout w:type="fixed"/>
+        <w:tblLook w:firstRow="1" w:lastRow="0" w:firstColumn="0" w:lastColumn="0" w:noHBand="0" w:noVBand="0" w:val="0020"/>
+      </w:tblPr>
+      <w:tblGrid>
+        <w:gridCol w:w="1980"/>
+        <w:gridCol w:w="3960"/>
+        <w:gridCol w:w="1980"/>
+      </w:tblGrid>
+      <w:tr>
+        <w:trPr>
+          <w:tblHeader w:val="on"/>
+        </w:trPr>
+        <w:tc>
+          <w:tcPr/>
+          <w:p>
+            <w:pPr>
+              <w:pStyle w:val="Compact"/>
+              <w:jc w:val="left"/>
+            </w:pPr>
+            <w:r>
+              <w:t xml:space="preserve">O quê</w:t>
+            </w:r>
+          </w:p>
+        </w:tc>
+        <w:tc>
+          <w:tcPr/>
+          <w:p>
+            <w:pPr>
+              <w:pStyle w:val="Compact"/>
+              <w:jc w:val="left"/>
+            </w:pPr>
+            <w:r>
+              <w:t xml:space="preserve">Responsáveis</w:t>
+            </w:r>
+          </w:p>
+        </w:tc>
+        <w:tc>
+          <w:tcPr/>
+          <w:p>
+            <w:pPr>
+              <w:pStyle w:val="Compact"/>
+              <w:jc w:val="left"/>
+            </w:pPr>
+            <w:r>
+              <w:t xml:space="preserve">Local</w:t>
+            </w:r>
+          </w:p>
+        </w:tc>
+      </w:tr>
+      <w:tr>
+        <w:tc>
+          <w:tcPr/>
+          <w:p>
+            <w:pPr>
+              <w:pStyle w:val="Compact"/>
+              <w:jc w:val="left"/>
+            </w:pPr>
+            <w:r>
+              <w:t xml:space="preserve">Casos existentes</w:t>
+            </w:r>
+          </w:p>
+        </w:tc>
+        <w:tc>
+          <w:tcPr/>
+          <w:p>
+            <w:pPr>
+              <w:pStyle w:val="Compact"/>
+              <w:jc w:val="left"/>
+            </w:pPr>
+            <w:r>
+              <w:t xml:space="preserve">Ausiane + Nubia</w:t>
+            </w:r>
+          </w:p>
+        </w:tc>
+        <w:tc>
+          <w:tcPr/>
+          <w:p>
+            <w:pPr>
+              <w:pStyle w:val="Compact"/>
+              <w:jc w:val="left"/>
+            </w:pPr>
+            <w:hyperlink r:id="rId32">
+              <w:r>
+                <w:rPr>
+                  <w:rStyle w:val="Hyperlink"/>
+                </w:rPr>
+                <w:t xml:space="preserve">Google Doc</w:t>
+              </w:r>
+            </w:hyperlink>
           </w:p>
         </w:tc>
       </w:tr>
@@ -1870,7 +1813,19 @@
               <w:pStyle w:val="Compact"/>
               <w:jc w:val="left"/>
             </w:pPr>
-            <w:hyperlink r:id="rId35">
+            <w:r>
+              <w:t xml:space="preserve">Deivison + Rios</w:t>
+            </w:r>
+          </w:p>
+        </w:tc>
+        <w:tc>
+          <w:tcPr/>
+          <w:p>
+            <w:pPr>
+              <w:pStyle w:val="Compact"/>
+              <w:jc w:val="left"/>
+            </w:pPr>
+            <w:hyperlink r:id="rId33">
               <w:r>
                 <w:rPr>
                   <w:rStyle w:val="VerbatimChar"/>
@@ -1878,165 +1833,12 @@
                 <w:t xml:space="preserve">proposta.md</w:t>
               </w:r>
             </w:hyperlink>
-            <w:r>
-              <w:t xml:space="preserve"> </w:t>
-            </w:r>
-            <w:r>
-              <w:t xml:space="preserve">→</w:t>
-            </w:r>
-            <w:r>
-              <w:t xml:space="preserve"> </w:t>
-            </w:r>
-            <w:hyperlink r:id="rId36">
-              <w:r>
-                <w:rPr>
-                  <w:rStyle w:val="VerbatimChar"/>
-                </w:rPr>
-                <w:t xml:space="preserve">proposta.docx</w:t>
-              </w:r>
-            </w:hyperlink>
-          </w:p>
-        </w:tc>
-        <w:tc>
-          <w:tcPr/>
-          <w:p>
-            <w:pPr>
-              <w:pStyle w:val="Compact"/>
-              <w:jc w:val="center"/>
-            </w:pPr>
-            <w:r>
-              <w:t xml:space="preserve">Deivison + Rios</w:t>
-            </w:r>
-          </w:p>
-        </w:tc>
-      </w:tr>
-      <w:tr>
-        <w:tc>
-          <w:tcPr/>
-          <w:p>
-            <w:pPr>
-              <w:pStyle w:val="Compact"/>
-              <w:jc w:val="left"/>
-            </w:pPr>
-            <w:r>
-              <w:t xml:space="preserve">Hub/landing page do projeto</w:t>
-            </w:r>
-          </w:p>
-        </w:tc>
-        <w:tc>
-          <w:tcPr/>
-          <w:p>
-            <w:pPr>
-              <w:pStyle w:val="Compact"/>
-              <w:jc w:val="left"/>
-            </w:pPr>
-            <w:hyperlink r:id="rId37">
-              <w:r>
-                <w:rPr>
-                  <w:rStyle w:val="VerbatimChar"/>
-                </w:rPr>
-                <w:t xml:space="preserve">minhafila/</w:t>
-              </w:r>
-            </w:hyperlink>
-          </w:p>
-        </w:tc>
-        <w:tc>
-          <w:tcPr/>
-          <w:p>
-            <w:pPr>
-              <w:pStyle w:val="Compact"/>
-              <w:jc w:val="center"/>
-            </w:pPr>
-            <w:r>
-              <w:t xml:space="preserve">Deivison</w:t>
-            </w:r>
-          </w:p>
-        </w:tc>
-      </w:tr>
-      <w:tr>
-        <w:tc>
-          <w:tcPr/>
-          <w:p>
-            <w:pPr>
-              <w:pStyle w:val="Compact"/>
-              <w:jc w:val="left"/>
-            </w:pPr>
-            <w:r>
-              <w:t xml:space="preserve">Casos existentes</w:t>
-            </w:r>
-          </w:p>
-        </w:tc>
-        <w:tc>
-          <w:tcPr/>
-          <w:p>
-            <w:pPr>
-              <w:pStyle w:val="Compact"/>
-              <w:jc w:val="left"/>
-            </w:pPr>
-            <w:hyperlink r:id="rId38">
-              <w:r>
-                <w:rPr>
-                  <w:rStyle w:val="VerbatimChar"/>
-                </w:rPr>
-                <w:t xml:space="preserve">casos-existentes.md</w:t>
-              </w:r>
-            </w:hyperlink>
-          </w:p>
-        </w:tc>
-        <w:tc>
-          <w:tcPr/>
-          <w:p>
-            <w:pPr>
-              <w:pStyle w:val="Compact"/>
-              <w:jc w:val="center"/>
-            </w:pPr>
-            <w:r>
-              <w:t xml:space="preserve">Ausiane + Núbia</w:t>
-            </w:r>
-          </w:p>
-        </w:tc>
-      </w:tr>
-      <w:tr>
-        <w:tc>
-          <w:tcPr/>
-          <w:p>
-            <w:pPr>
-              <w:pStyle w:val="Compact"/>
-              <w:jc w:val="left"/>
-            </w:pPr>
-            <w:r>
-              <w:t xml:space="preserve">Molde UFRB aplicado</w:t>
-            </w:r>
-          </w:p>
-        </w:tc>
-        <w:tc>
-          <w:tcPr/>
-          <w:p>
-            <w:pPr>
-              <w:pStyle w:val="Compact"/>
-              <w:jc w:val="left"/>
-            </w:pPr>
-            <w:r>
-              <w:t xml:space="preserve">Todos os .docx</w:t>
-            </w:r>
-          </w:p>
-        </w:tc>
-        <w:tc>
-          <w:tcPr/>
-          <w:p>
-            <w:pPr>
-              <w:pStyle w:val="Compact"/>
-              <w:jc w:val="center"/>
-            </w:pPr>
-            <w:r>
-              <w:t xml:space="preserve">Deivison</w:t>
-            </w:r>
           </w:p>
         </w:tc>
       </w:tr>
     </w:tbl>
-    <w:bookmarkEnd w:id="39"/>
-    <w:bookmarkStart w:id="40" w:name="pendente-prazo-28-2906"/>
+    <w:bookmarkEnd w:id="34"/>
+    <w:bookmarkStart w:id="35" w:name="pendente-prazo-28-2906"/>
     <w:p>
       <w:pPr>
         <w:pStyle w:val="Heading3"/>
@@ -2106,6 +1908,44 @@
               <w:jc w:val="left"/>
             </w:pPr>
             <w:r>
+              <w:t xml:space="preserve">Protótipo de telas (Figma)</w:t>
+            </w:r>
+          </w:p>
+        </w:tc>
+        <w:tc>
+          <w:tcPr/>
+          <w:p>
+            <w:pPr>
+              <w:pStyle w:val="Compact"/>
+              <w:jc w:val="left"/>
+            </w:pPr>
+            <w:r>
+              <w:t xml:space="preserve">Ausiane + Uélinton</w:t>
+            </w:r>
+          </w:p>
+        </w:tc>
+        <w:tc>
+          <w:tcPr/>
+          <w:p>
+            <w:pPr>
+              <w:pStyle w:val="Compact"/>
+              <w:jc w:val="center"/>
+            </w:pPr>
+            <w:r>
+              <w:t xml:space="preserve">28/06</w:t>
+            </w:r>
+          </w:p>
+        </w:tc>
+      </w:tr>
+      <w:tr>
+        <w:tc>
+          <w:tcPr/>
+          <w:p>
+            <w:pPr>
+              <w:pStyle w:val="Compact"/>
+              <w:jc w:val="left"/>
+            </w:pPr>
+            <w:r>
               <w:t xml:space="preserve">Slides da apresentação</w:t>
             </w:r>
           </w:p>
@@ -2181,9 +2021,9 @@
         </w:pict>
       </w:r>
     </w:p>
-    <w:bookmarkEnd w:id="40"/>
-    <w:bookmarkEnd w:id="41"/>
-    <w:bookmarkStart w:id="42" w:name="documentos-finais"/>
+    <w:bookmarkEnd w:id="35"/>
+    <w:bookmarkEnd w:id="36"/>
+    <w:bookmarkStart w:id="37" w:name="documentos-finais"/>
     <w:p>
       <w:pPr>
         <w:pStyle w:val="Heading2"/>
@@ -2195,13 +2035,12 @@
     <w:tbl>
       <w:tblPr>
         <w:tblStyle w:val="Table"/>
-        <w:tblW w:type="pct" w:w="5000"/>
-        <w:tblLayout w:type="fixed"/>
+        <w:tblW w:type="auto" w:w="0"/>
         <w:tblLook w:firstRow="1" w:lastRow="0" w:firstColumn="0" w:lastColumn="0" w:noHBand="0" w:noVBand="0" w:val="0020"/>
       </w:tblPr>
       <w:tblGrid>
-        <w:gridCol w:w="2904"/>
-        <w:gridCol w:w="2376"/>
+        <w:gridCol w:w="2640"/>
+        <w:gridCol w:w="2640"/>
         <w:gridCol w:w="2640"/>
       </w:tblGrid>
       <w:tr>
@@ -2278,19 +2117,8 @@
               <w:jc w:val="center"/>
             </w:pPr>
             <w:r>
-              <w:t xml:space="preserve">✅ Finalizado (molde UFRB) ·</w:t>
-            </w:r>
-            <w:r>
-              <w:t xml:space="preserve"> </w:t>
-            </w:r>
-            <w:hyperlink r:id="rId32">
-              <w:r>
-                <w:rPr>
-                  <w:rStyle w:val="Hyperlink"/>
-                </w:rPr>
-                <w:t xml:space="preserve">ver</w:t>
-              </w:r>
-            </w:hyperlink>
+              <w:t xml:space="preserve">Converter</w:t>
+            </w:r>
           </w:p>
         </w:tc>
       </w:tr>
@@ -2327,7 +2155,7 @@
               <w:jc w:val="center"/>
             </w:pPr>
             <w:r>
-              <w:t xml:space="preserve">📄 md disponível</w:t>
+              <w:t xml:space="preserve">Em elaboração</w:t>
             </w:r>
           </w:p>
         </w:tc>
@@ -2365,19 +2193,8 @@
               <w:jc w:val="center"/>
             </w:pPr>
             <w:r>
-              <w:t xml:space="preserve">✅ Finalizado (molde UFRB) ·</w:t>
-            </w:r>
-            <w:r>
-              <w:t xml:space="preserve"> </w:t>
-            </w:r>
-            <w:hyperlink r:id="rId36">
-              <w:r>
-                <w:rPr>
-                  <w:rStyle w:val="Hyperlink"/>
-                </w:rPr>
-                <w:t xml:space="preserve">ver</w:t>
-              </w:r>
-            </w:hyperlink>
+              <w:t xml:space="preserve">Finalizar e converter</w:t>
+            </w:r>
           </w:p>
         </w:tc>
       </w:tr>
@@ -2402,31 +2219,20 @@
               <w:jc w:val="left"/>
             </w:pPr>
             <w:r>
-              <w:t xml:space="preserve">DOCX + JPEG</w:t>
-            </w:r>
-          </w:p>
-        </w:tc>
-        <w:tc>
-          <w:tcPr/>
-          <w:p>
-            <w:pPr>
-              <w:pStyle w:val="Compact"/>
-              <w:jc w:val="center"/>
-            </w:pPr>
-            <w:r>
-              <w:t xml:space="preserve">✅ Finalizado (molde UFRB) ·</w:t>
-            </w:r>
-            <w:r>
-              <w:t xml:space="preserve"> </w:t>
-            </w:r>
-            <w:hyperlink r:id="rId34">
-              <w:r>
-                <w:rPr>
-                  <w:rStyle w:val="Hyperlink"/>
-                </w:rPr>
-                <w:t xml:space="preserve">ver</w:t>
-              </w:r>
-            </w:hyperlink>
+              <w:t xml:space="preserve">PDF + JPEG + DOCX</w:t>
+            </w:r>
+          </w:p>
+        </w:tc>
+        <w:tc>
+          <w:tcPr/>
+          <w:p>
+            <w:pPr>
+              <w:pStyle w:val="Compact"/>
+              <w:jc w:val="center"/>
+            </w:pPr>
+            <w:r>
+              <w:t xml:space="preserve">Converter</w:t>
+            </w:r>
           </w:p>
         </w:tc>
       </w:tr>
@@ -2451,19 +2257,19 @@
               <w:jc w:val="left"/>
             </w:pPr>
             <w:r>
-              <w:t xml:space="preserve">HTML funcional</w:t>
-            </w:r>
-          </w:p>
-        </w:tc>
-        <w:tc>
-          <w:tcPr/>
-          <w:p>
-            <w:pPr>
-              <w:pStyle w:val="Compact"/>
-              <w:jc w:val="center"/>
-            </w:pPr>
-            <w:r>
-              <w:t xml:space="preserve">✅ Disponível no hub</w:t>
+              <w:t xml:space="preserve">PDF com prints</w:t>
+            </w:r>
+          </w:p>
+        </w:tc>
+        <w:tc>
+          <w:tcPr/>
+          <w:p>
+            <w:pPr>
+              <w:pStyle w:val="Compact"/>
+              <w:jc w:val="center"/>
+            </w:pPr>
+            <w:r>
+              <w:t xml:space="preserve">Em produção no Figma</w:t>
             </w:r>
           </w:p>
         </w:tc>
@@ -2501,7 +2307,7 @@
               <w:jc w:val="center"/>
             </w:pPr>
             <w:r>
-              <w:t xml:space="preserve">⏳ Uélinton + Wallace</w:t>
+              <w:t xml:space="preserve">Criar</w:t>
             </w:r>
           </w:p>
         </w:tc>
@@ -2539,7 +2345,7 @@
               <w:jc w:val="center"/>
             </w:pPr>
             <w:r>
-              <w:t xml:space="preserve">⏳ Uélinton + Wallace</w:t>
+              <w:t xml:space="preserve">Criar</w:t>
             </w:r>
           </w:p>
         </w:tc>
@@ -2577,7 +2383,7 @@
               <w:jc w:val="center"/>
             </w:pPr>
             <w:r>
-              <w:t xml:space="preserve">📦 Arquivado</w:t>
+              <w:t xml:space="preserve">Consolidar</w:t>
             </w:r>
           </w:p>
         </w:tc>
@@ -2590,8 +2396,8 @@
         </w:pict>
       </w:r>
     </w:p>
-    <w:bookmarkEnd w:id="42"/>
-    <w:bookmarkStart w:id="43" w:name="status-atual"/>
+    <w:bookmarkEnd w:id="37"/>
+    <w:bookmarkStart w:id="39" w:name="status-atual"/>
     <w:p>
       <w:pPr>
         <w:pStyle w:val="Heading2"/>
@@ -2679,13 +2485,13 @@
           <w:b/>
           <w:bCs/>
         </w:rPr>
-        <w:t xml:space="preserve">Hub do projeto:</w:t>
+        <w:t xml:space="preserve">Fluxograma:</w:t>
       </w:r>
       <w:r>
         <w:t xml:space="preserve"> </w:t>
       </w:r>
       <w:r>
-        <w:t xml:space="preserve">https://deivisan.github.io/Metodologia-EAD/minhafila/ (landing page com todos os links)</w:t>
+        <w:t xml:space="preserve">finalizado e documentado</w:t>
       </w:r>
     </w:p>
     <w:p>
@@ -2707,8 +2513,19 @@
         <w:t xml:space="preserve"> </w:t>
       </w:r>
       <w:r>
-        <w:t xml:space="preserve">versão HTML com molde iPhone 15 disponível no hub</w:t>
-      </w:r>
+        <w:t xml:space="preserve">versão inicial disponível em</w:t>
+      </w:r>
+      <w:r>
+        <w:t xml:space="preserve"> </w:t>
+      </w:r>
+      <w:hyperlink r:id="rId38">
+        <w:r>
+          <w:rPr>
+            <w:rStyle w:val="VerbatimChar"/>
+          </w:rPr>
+          <w:t xml:space="preserve">prototipo-minhafila/</w:t>
+        </w:r>
+      </w:hyperlink>
     </w:p>
     <w:p>
       <w:pPr>
@@ -2723,14 +2540,25 @@
           <w:b/>
           <w:bCs/>
         </w:rPr>
-        <w:t xml:space="preserve">Documentos .docx:</w:t>
+        <w:t xml:space="preserve">Histórico do WhatsApp:</w:t>
       </w:r>
       <w:r>
         <w:t xml:space="preserve"> </w:t>
       </w:r>
       <w:r>
-        <w:t xml:space="preserve">todos com molde UFRB (logo, cores, Times New Roman) — abrem direto no navegador via Office Online</w:t>
-      </w:r>
+        <w:t xml:space="preserve">519 mensagens (05/06 a 25/06) em</w:t>
+      </w:r>
+      <w:r>
+        <w:t xml:space="preserve"> </w:t>
+      </w:r>
+      <w:hyperlink r:id="rId27">
+        <w:r>
+          <w:rPr>
+            <w:rStyle w:val="VerbatimChar"/>
+          </w:rPr>
+          <w:t xml:space="preserve">historico-whatsapp.json</w:t>
+        </w:r>
+      </w:hyperlink>
     </w:p>
     <w:p>
       <w:pPr>
@@ -2745,17 +2573,13 @@
           <w:b/>
           <w:bCs/>
         </w:rPr>
-        <w:t xml:space="preserve">Apresentação final:</w:t>
+        <w:t xml:space="preserve">GitHub Pages:</w:t>
       </w:r>
       <w:r>
         <w:t xml:space="preserve"> </w:t>
       </w:r>
       <w:r>
-        <w:rPr>
-          <w:b/>
-          <w:bCs/>
-        </w:rPr>
-        <w:t xml:space="preserve">29/06/2026 às 20h</w:t>
+        <w:t xml:space="preserve">https://deivisan.github.io/Metodologia-EAD/</w:t>
       </w:r>
     </w:p>
     <w:p>
@@ -2765,8 +2589,8 @@
         </w:pict>
       </w:r>
     </w:p>
-    <w:bookmarkEnd w:id="43"/>
-    <w:bookmarkStart w:id="44" w:name="fundamentação"/>
+    <w:bookmarkEnd w:id="39"/>
+    <w:bookmarkStart w:id="40" w:name="fundamentação"/>
     <w:p>
       <w:pPr>
         <w:pStyle w:val="Heading2"/>
@@ -2802,8 +2626,8 @@
         </w:pict>
       </w:r>
     </w:p>
-    <w:bookmarkEnd w:id="44"/>
-    <w:bookmarkStart w:id="47" w:name="links-rápidos"/>
+    <w:bookmarkEnd w:id="40"/>
+    <w:bookmarkStart w:id="44" w:name="links-rápidos"/>
     <w:p>
       <w:pPr>
         <w:pStyle w:val="Heading2"/>
@@ -2861,122 +2685,44 @@
               <w:jc w:val="left"/>
             </w:pPr>
             <w:r>
-              <w:t xml:space="preserve">🏠 Hub do projeto (landing page)</w:t>
-            </w:r>
-          </w:p>
-        </w:tc>
-        <w:tc>
-          <w:tcPr/>
-          <w:p>
-            <w:pPr>
-              <w:pStyle w:val="Compact"/>
-              <w:jc w:val="left"/>
-            </w:pPr>
-            <w:r>
-              <w:t xml:space="preserve">https://deivisan.github.io/Metodologia-EAD/minhafila/</w:t>
-            </w:r>
-          </w:p>
-        </w:tc>
-      </w:tr>
-      <w:tr>
-        <w:tc>
-          <w:tcPr/>
-          <w:p>
-            <w:pPr>
-              <w:pStyle w:val="Compact"/>
-              <w:jc w:val="left"/>
-            </w:pPr>
-            <w:r>
-              <w:t xml:space="preserve">📋 Problema Real (.docx)</w:t>
-            </w:r>
-          </w:p>
-        </w:tc>
-        <w:tc>
-          <w:tcPr/>
-          <w:p>
-            <w:pPr>
-              <w:pStyle w:val="Compact"/>
-              <w:jc w:val="left"/>
-            </w:pPr>
-            <w:r>
-              <w:t xml:space="preserve">https://view.officeapps.live.com/op/view.aspx?src=https://raw.githubusercontent.com/Deivisan/Metodologia-EAD/main/disciplinas/gcetens843-projeto-algoritmo-i/atividades/trabalhos/projeto-algoritmos/problema-real.docx&amp;wdDownloadButton=1</w:t>
-            </w:r>
-          </w:p>
-        </w:tc>
-      </w:tr>
-      <w:tr>
-        <w:tc>
-          <w:tcPr/>
-          <w:p>
-            <w:pPr>
-              <w:pStyle w:val="Compact"/>
-              <w:jc w:val="left"/>
-            </w:pPr>
-            <w:r>
-              <w:t xml:space="preserve">💡 Proposta (.docx)</w:t>
-            </w:r>
-          </w:p>
-        </w:tc>
-        <w:tc>
-          <w:tcPr/>
-          <w:p>
-            <w:pPr>
-              <w:pStyle w:val="Compact"/>
-              <w:jc w:val="left"/>
-            </w:pPr>
-            <w:r>
-              <w:t xml:space="preserve">https://view.officeapps.live.com/op/view.aspx?src=https://raw.githubusercontent.com/Deivisan/Metodologia-EAD/main/disciplinas/gcetens843-projeto-algoritmo-i/atividades/trabalhos/projeto-algoritmos/proposta.docx&amp;wdDownloadButton=1</w:t>
-            </w:r>
-          </w:p>
-        </w:tc>
-      </w:tr>
-      <w:tr>
-        <w:tc>
-          <w:tcPr/>
-          <w:p>
-            <w:pPr>
-              <w:pStyle w:val="Compact"/>
-              <w:jc w:val="left"/>
-            </w:pPr>
-            <w:r>
-              <w:t xml:space="preserve">🌊 Fluxograma (.docx)</w:t>
-            </w:r>
-          </w:p>
-        </w:tc>
-        <w:tc>
-          <w:tcPr/>
-          <w:p>
-            <w:pPr>
-              <w:pStyle w:val="Compact"/>
-              <w:jc w:val="left"/>
-            </w:pPr>
-            <w:r>
-              <w:t xml:space="preserve">https://view.officeapps.live.com/op/view.aspx?src=https://raw.githubusercontent.com/Deivisan/Metodologia-EAD/main/disciplinas/gcetens843-projeto-algoritmo-i/atividades/trabalhos/projeto-algoritmos/fluxograma.docx&amp;wdDownloadButton=1</w:t>
-            </w:r>
-          </w:p>
-        </w:tc>
-      </w:tr>
-      <w:tr>
-        <w:tc>
-          <w:tcPr/>
-          <w:p>
-            <w:pPr>
-              <w:pStyle w:val="Compact"/>
-              <w:jc w:val="left"/>
-            </w:pPr>
-            <w:r>
-              <w:t xml:space="preserve">📱 Protótipo MinhaFila</w:t>
-            </w:r>
-          </w:p>
-        </w:tc>
-        <w:tc>
-          <w:tcPr/>
-          <w:p>
-            <w:pPr>
-              <w:pStyle w:val="Compact"/>
-              <w:jc w:val="left"/>
-            </w:pPr>
-            <w:hyperlink r:id="rId26">
+              <w:t xml:space="preserve">Site do projeto (GitHub Pages)</w:t>
+            </w:r>
+          </w:p>
+        </w:tc>
+        <w:tc>
+          <w:tcPr/>
+          <w:p>
+            <w:pPr>
+              <w:pStyle w:val="Compact"/>
+              <w:jc w:val="left"/>
+            </w:pPr>
+            <w:r>
+              <w:t xml:space="preserve">https://deivisan.github.io/Metodologia-EAD/</w:t>
+            </w:r>
+          </w:p>
+        </w:tc>
+      </w:tr>
+      <w:tr>
+        <w:tc>
+          <w:tcPr/>
+          <w:p>
+            <w:pPr>
+              <w:pStyle w:val="Compact"/>
+              <w:jc w:val="left"/>
+            </w:pPr>
+            <w:r>
+              <w:t xml:space="preserve">Protótipo MinhaFila</w:t>
+            </w:r>
+          </w:p>
+        </w:tc>
+        <w:tc>
+          <w:tcPr/>
+          <w:p>
+            <w:pPr>
+              <w:pStyle w:val="Compact"/>
+              <w:jc w:val="left"/>
+            </w:pPr>
+            <w:hyperlink r:id="rId23">
               <w:r>
                 <w:rPr>
                   <w:rStyle w:val="VerbatimChar"/>
@@ -2996,95 +2742,308 @@
               <w:jc w:val="left"/>
             </w:pPr>
             <w:r>
-              <w:t xml:space="preserve">🎤 Slides</w:t>
-            </w:r>
-          </w:p>
-        </w:tc>
-        <w:tc>
-          <w:tcPr/>
-          <w:p>
-            <w:pPr>
-              <w:pStyle w:val="Compact"/>
-              <w:jc w:val="left"/>
-            </w:pPr>
-            <w:r>
-              <w:t xml:space="preserve">https://docs.google.com/presentation/d/1tiaZ7SRLPvVglSnaWAuX7mTcRaERZuAtp9iSgXoPR6Q/edit</w:t>
-            </w:r>
+              <w:t xml:space="preserve">Tema completo</w:t>
+            </w:r>
+          </w:p>
+        </w:tc>
+        <w:tc>
+          <w:tcPr/>
+          <w:p>
+            <w:pPr>
+              <w:pStyle w:val="Compact"/>
+              <w:jc w:val="left"/>
+            </w:pPr>
+            <w:hyperlink r:id="rId20">
+              <w:r>
+                <w:rPr>
+                  <w:rStyle w:val="VerbatimChar"/>
+                </w:rPr>
+                <w:t xml:space="preserve">tema-escolhido.md</w:t>
+              </w:r>
+            </w:hyperlink>
+          </w:p>
+        </w:tc>
+      </w:tr>
+      <w:tr>
+        <w:tc>
+          <w:tcPr/>
+          <w:p>
+            <w:pPr>
+              <w:pStyle w:val="Compact"/>
+              <w:jc w:val="left"/>
+            </w:pPr>
+            <w:r>
+              <w:t xml:space="preserve">Divisão de tarefas</w:t>
+            </w:r>
+          </w:p>
+        </w:tc>
+        <w:tc>
+          <w:tcPr/>
+          <w:p>
+            <w:pPr>
+              <w:pStyle w:val="Compact"/>
+              <w:jc w:val="left"/>
+            </w:pPr>
+            <w:hyperlink r:id="rId21">
+              <w:r>
+                <w:rPr>
+                  <w:rStyle w:val="VerbatimChar"/>
+                </w:rPr>
+                <w:t xml:space="preserve">divisao-de-tarefas.md</w:t>
+              </w:r>
+            </w:hyperlink>
+          </w:p>
+        </w:tc>
+      </w:tr>
+      <w:tr>
+        <w:tc>
+          <w:tcPr/>
+          <w:p>
+            <w:pPr>
+              <w:pStyle w:val="Compact"/>
+              <w:jc w:val="left"/>
+            </w:pPr>
+            <w:r>
+              <w:t xml:space="preserve">Decisões do projeto</w:t>
+            </w:r>
+          </w:p>
+        </w:tc>
+        <w:tc>
+          <w:tcPr/>
+          <w:p>
+            <w:pPr>
+              <w:pStyle w:val="Compact"/>
+              <w:jc w:val="left"/>
+            </w:pPr>
+            <w:hyperlink r:id="rId22">
+              <w:r>
+                <w:rPr>
+                  <w:rStyle w:val="VerbatimChar"/>
+                </w:rPr>
+                <w:t xml:space="preserve">decisoes.md</w:t>
+              </w:r>
+            </w:hyperlink>
+          </w:p>
+        </w:tc>
+      </w:tr>
+      <w:tr>
+        <w:tc>
+          <w:tcPr/>
+          <w:p>
+            <w:pPr>
+              <w:pStyle w:val="Compact"/>
+              <w:jc w:val="left"/>
+            </w:pPr>
+            <w:r>
+              <w:t xml:space="preserve">Fluxograma</w:t>
+            </w:r>
+          </w:p>
+        </w:tc>
+        <w:tc>
+          <w:tcPr/>
+          <w:p>
+            <w:pPr>
+              <w:pStyle w:val="Compact"/>
+              <w:jc w:val="left"/>
+            </w:pPr>
+            <w:hyperlink r:id="rId29">
+              <w:r>
+                <w:rPr>
+                  <w:rStyle w:val="VerbatimChar"/>
+                </w:rPr>
+                <w:t xml:space="preserve">fluxograma.md</w:t>
+              </w:r>
+            </w:hyperlink>
+          </w:p>
+        </w:tc>
+      </w:tr>
+      <w:tr>
+        <w:tc>
+          <w:tcPr/>
+          <w:p>
+            <w:pPr>
+              <w:pStyle w:val="Compact"/>
+              <w:jc w:val="left"/>
+            </w:pPr>
+            <w:r>
+              <w:t xml:space="preserve">Proposta</w:t>
+            </w:r>
+          </w:p>
+        </w:tc>
+        <w:tc>
+          <w:tcPr/>
+          <w:p>
+            <w:pPr>
+              <w:pStyle w:val="Compact"/>
+              <w:jc w:val="left"/>
+            </w:pPr>
+            <w:hyperlink r:id="rId33">
+              <w:r>
+                <w:rPr>
+                  <w:rStyle w:val="VerbatimChar"/>
+                </w:rPr>
+                <w:t xml:space="preserve">proposta.md</w:t>
+              </w:r>
+            </w:hyperlink>
+          </w:p>
+        </w:tc>
+      </w:tr>
+      <w:tr>
+        <w:tc>
+          <w:tcPr/>
+          <w:p>
+            <w:pPr>
+              <w:pStyle w:val="Compact"/>
+              <w:jc w:val="left"/>
+            </w:pPr>
+            <w:r>
+              <w:t xml:space="preserve">Problema real</w:t>
+            </w:r>
+          </w:p>
+        </w:tc>
+        <w:tc>
+          <w:tcPr/>
+          <w:p>
+            <w:pPr>
+              <w:pStyle w:val="Compact"/>
+              <w:jc w:val="left"/>
+            </w:pPr>
+            <w:hyperlink r:id="rId28">
+              <w:r>
+                <w:rPr>
+                  <w:rStyle w:val="VerbatimChar"/>
+                </w:rPr>
+                <w:t xml:space="preserve">problema-real.md</w:t>
+              </w:r>
+            </w:hyperlink>
+          </w:p>
+        </w:tc>
+      </w:tr>
+      <w:tr>
+        <w:tc>
+          <w:tcPr/>
+          <w:p>
+            <w:pPr>
+              <w:pStyle w:val="Compact"/>
+              <w:jc w:val="left"/>
+            </w:pPr>
+            <w:r>
+              <w:t xml:space="preserve">Identidade visual</w:t>
+            </w:r>
+          </w:p>
+        </w:tc>
+        <w:tc>
+          <w:tcPr/>
+          <w:p>
+            <w:pPr>
+              <w:pStyle w:val="Compact"/>
+              <w:jc w:val="left"/>
+            </w:pPr>
+            <w:hyperlink r:id="rId41">
+              <w:r>
+                <w:rPr>
+                  <w:rStyle w:val="VerbatimChar"/>
+                </w:rPr>
+                <w:t xml:space="preserve">Identidade-visual.md</w:t>
+              </w:r>
+            </w:hyperlink>
+          </w:p>
+        </w:tc>
+      </w:tr>
+      <w:tr>
+        <w:tc>
+          <w:tcPr/>
+          <w:p>
+            <w:pPr>
+              <w:pStyle w:val="Compact"/>
+              <w:jc w:val="left"/>
+            </w:pPr>
+            <w:r>
+              <w:t xml:space="preserve">Histórico WhatsApp</w:t>
+            </w:r>
+          </w:p>
+        </w:tc>
+        <w:tc>
+          <w:tcPr/>
+          <w:p>
+            <w:pPr>
+              <w:pStyle w:val="Compact"/>
+              <w:jc w:val="left"/>
+            </w:pPr>
+            <w:hyperlink r:id="rId27">
+              <w:r>
+                <w:rPr>
+                  <w:rStyle w:val="VerbatimChar"/>
+                </w:rPr>
+                <w:t xml:space="preserve">historico-whatsapp.json</w:t>
+              </w:r>
+            </w:hyperlink>
+          </w:p>
+        </w:tc>
+      </w:tr>
+      <w:tr>
+        <w:tc>
+          <w:tcPr/>
+          <w:p>
+            <w:pPr>
+              <w:pStyle w:val="Compact"/>
+              <w:jc w:val="left"/>
+            </w:pPr>
+            <w:r>
+              <w:t xml:space="preserve">Documentação geral</w:t>
+            </w:r>
+          </w:p>
+        </w:tc>
+        <w:tc>
+          <w:tcPr/>
+          <w:p>
+            <w:pPr>
+              <w:pStyle w:val="Compact"/>
+              <w:jc w:val="left"/>
+            </w:pPr>
+            <w:hyperlink r:id="rId42">
+              <w:r>
+                <w:rPr>
+                  <w:rStyle w:val="VerbatimChar"/>
+                </w:rPr>
+                <w:t xml:space="preserve">documentacao-geral-projeto-algoritmos.md</w:t>
+              </w:r>
+            </w:hyperlink>
+          </w:p>
+        </w:tc>
+      </w:tr>
+      <w:tr>
+        <w:tc>
+          <w:tcPr/>
+          <w:p>
+            <w:pPr>
+              <w:pStyle w:val="Compact"/>
+              <w:jc w:val="left"/>
+            </w:pPr>
+            <w:r>
+              <w:t xml:space="preserve">Imagens do grupo</w:t>
+            </w:r>
+          </w:p>
+        </w:tc>
+        <w:tc>
+          <w:tcPr/>
+          <w:p>
+            <w:pPr>
+              <w:pStyle w:val="Compact"/>
+              <w:jc w:val="left"/>
+            </w:pPr>
+            <w:hyperlink r:id="rId43">
+              <w:r>
+                <w:rPr>
+                  <w:rStyle w:val="VerbatimChar"/>
+                </w:rPr>
+                <w:t xml:space="preserve">imagens-grupo/</w:t>
+              </w:r>
+            </w:hyperlink>
           </w:p>
         </w:tc>
       </w:tr>
     </w:tbl>
-    <w:p>
-      <w:pPr>
-        <w:pStyle w:val="BodyText"/>
-      </w:pPr>
-      <w:r>
-        <w:t xml:space="preserve">Histórico WhatsApp |</w:t>
-      </w:r>
-      <w:r>
-        <w:t xml:space="preserve"> </w:t>
-      </w:r>
-      <w:hyperlink r:id="rId30">
-        <w:r>
-          <w:rPr>
-            <w:rStyle w:val="VerbatimChar"/>
-          </w:rPr>
-          <w:t xml:space="preserve">historico-whatsapp.json</w:t>
-        </w:r>
-      </w:hyperlink>
-      <w:r>
-        <w:t xml:space="preserve"> </w:t>
-      </w:r>
-      <w:r>
-        <w:t xml:space="preserve">|</w:t>
-      </w:r>
-      <w:r>
-        <w:br/>
-      </w:r>
-      <w:r>
-        <w:t xml:space="preserve">Documentação geral |</w:t>
-      </w:r>
-      <w:r>
-        <w:t xml:space="preserve"> </w:t>
-      </w:r>
-      <w:hyperlink r:id="rId45">
-        <w:r>
-          <w:rPr>
-            <w:rStyle w:val="VerbatimChar"/>
-          </w:rPr>
-          <w:t xml:space="preserve">documentacao-geral-projeto-algoritmos.md</w:t>
-        </w:r>
-      </w:hyperlink>
-      <w:r>
-        <w:t xml:space="preserve"> </w:t>
-      </w:r>
-      <w:r>
-        <w:t xml:space="preserve">|</w:t>
-      </w:r>
-      <w:r>
-        <w:br/>
-      </w:r>
-      <w:r>
-        <w:t xml:space="preserve">Imagens do grupo |</w:t>
-      </w:r>
-      <w:r>
-        <w:t xml:space="preserve"> </w:t>
-      </w:r>
-      <w:hyperlink r:id="rId46">
-        <w:r>
-          <w:rPr>
-            <w:rStyle w:val="VerbatimChar"/>
-          </w:rPr>
-          <w:t xml:space="preserve">imagens-grupo/</w:t>
-        </w:r>
-      </w:hyperlink>
-      <w:r>
-        <w:t xml:space="preserve"> </w:t>
-      </w:r>
-      <w:r>
-        <w:t xml:space="preserve">|</w:t>
-      </w:r>
-    </w:p>
     <w:p>
       <w:r>
         <w:pict>
@@ -3101,16 +3060,15 @@
           <w:i/>
           <w:iCs/>
         </w:rPr>
-        <w:t xml:space="preserve">Última atualização: 28/06/2026 — hub no ar, .docx com molde UFRB, tudo pronto para apresentação final em 29/06.</w:t>
+        <w:t xml:space="preserve">Última atualização: 25/06/2026 — rebranding para MinhaFila, escopo multissetorial, acessibilidade como recurso importante, preparação para apresentação final em 29/06.</w:t>
       </w:r>
     </w:p>
-    <w:bookmarkEnd w:id="47"/>
-    <w:bookmarkEnd w:id="48"/>
+    <w:bookmarkEnd w:id="44"/>
+    <w:bookmarkEnd w:id="45"/>
     <w:sectPr>
+      <w:headerReference w:type="default" r:id="rId9"/>
       <w:footerReference w:type="default" r:id="rId10"/>
-      <w:footnotePr>
-        <w:numRestart w:val="eachSect"/>
-      </w:footnotePr>
+      <w:pgMar w:top="1728" w:bottom="1440" w:left="1440" w:right="1440"/>
     </w:sectPr>
   </w:body>
 </w:document>
@@ -3157,6 +3115,142 @@
     </w:p>
   </w:footnote>
 </w:footnotes>
+</file>
+
+<file path=word/header1.xml><?xml version="1.0" encoding="utf-8"?>
+<w:hdr xmlns:m="http://schemas.openxmlformats.org/officeDocument/2006/math" xmlns:mc="http://schemas.openxmlformats.org/markup-compatibility/2006" xmlns:mo="http://schemas.microsoft.com/office/mac/office/2008/main" xmlns:mv="urn:schemas-microsoft-com:mac:vml" xmlns:o="urn:schemas-microsoft-com:office:office" xmlns:r="http://schemas.openxmlformats.org/officeDocument/2006/relationships" xmlns:v="urn:schemas-microsoft-com:vml" xmlns:w10="urn:schemas-microsoft-com:office:word" xmlns:w14="http://schemas.microsoft.com/office/word/2010/wordml" xmlns:w="http://schemas.openxmlformats.org/wordprocessingml/2006/main" xmlns:wne="http://schemas.microsoft.com/office/word/2006/wordml" xmlns:wp14="http://schemas.microsoft.com/office/word/2010/wordprocessingDrawing" xmlns:wp="http://schemas.openxmlformats.org/drawingml/2006/wordprocessingDrawing" xmlns:wpc="http://schemas.microsoft.com/office/word/2010/wordprocessingCanvas" xmlns:wpg="http://schemas.microsoft.com/office/word/2010/wordprocessingGroup" xmlns:wpi="http://schemas.microsoft.com/office/word/2010/wordprocessingInk" xmlns:wps="http://schemas.microsoft.com/office/word/2010/wordprocessingShape" mc:Ignorable="w14 wp14">
+  <w:p>
+    <w:pPr>
+      <w:pStyle w:val="Header"/>
+    </w:pPr>
+  </w:p>
+  <w:tbl>
+    <w:tblPr>
+      <w:tblW w:type="auto" w:w="0"/>
+      <w:tblLook w:firstColumn="1" w:firstRow="1" w:lastColumn="0" w:lastRow="0" w:noHBand="0" w:noVBand="1" w:val="04A0"/>
+    </w:tblPr>
+    <w:tblGrid>
+      <w:gridCol w:w="4680"/>
+      <w:gridCol w:w="4680"/>
+    </w:tblGrid>
+    <w:tr>
+      <w:tc>
+        <w:tcPr>
+          <w:tcW w:type="dxa" w:w="2016"/>
+          <w:tcBorders>
+            <w:top w:val="none" w:sz="0" w:space="0" w:color="auto"/>
+            <w:left w:val="none" w:sz="0" w:space="0" w:color="auto"/>
+            <w:bottom w:val="none" w:sz="0" w:space="0" w:color="auto"/>
+            <w:right w:val="none" w:sz="0" w:space="0" w:color="auto"/>
+          </w:tcBorders>
+        </w:tcPr>
+        <w:p>
+          <w:pPr>
+            <w:jc w:val="left"/>
+          </w:pPr>
+          <w:r>
+            <w:drawing>
+              <wp:inline xmlns:a="http://schemas.openxmlformats.org/drawingml/2006/main" xmlns:pic="http://schemas.openxmlformats.org/drawingml/2006/picture">
+                <wp:extent cx="1188720" cy="468220"/>
+                <wp:docPr id="1" name="Picture 1"/>
+                <wp:cNvGraphicFramePr>
+                  <a:graphicFrameLocks noChangeAspect="1"/>
+                </wp:cNvGraphicFramePr>
+                <a:graphic>
+                  <a:graphicData uri="http://schemas.openxmlformats.org/drawingml/2006/picture">
+                    <pic:pic>
+                      <pic:nvPicPr>
+                        <pic:cNvPr id="0" name="logo-ufrb-20-anos.png"/>
+                        <pic:cNvPicPr/>
+                      </pic:nvPicPr>
+                      <pic:blipFill>
+                        <a:blip r:embed="rId1"/>
+                        <a:stretch>
+                          <a:fillRect/>
+                        </a:stretch>
+                      </pic:blipFill>
+                      <pic:spPr>
+                        <a:xfrm>
+                          <a:off x="0" y="0"/>
+                          <a:ext cx="1188720" cy="468220"/>
+                        </a:xfrm>
+                        <a:prstGeom prst="rect"/>
+                      </pic:spPr>
+                    </pic:pic>
+                  </a:graphicData>
+                </a:graphic>
+              </wp:inline>
+            </w:drawing>
+          </w:r>
+        </w:p>
+      </w:tc>
+      <w:tc>
+        <w:tcPr>
+          <w:tcW w:type="dxa" w:w="7200"/>
+          <w:tcBorders>
+            <w:top w:val="none" w:sz="0" w:space="0" w:color="auto"/>
+            <w:left w:val="none" w:sz="0" w:space="0" w:color="auto"/>
+            <w:bottom w:val="none" w:sz="0" w:space="0" w:color="auto"/>
+            <w:right w:val="none" w:sz="0" w:space="0" w:color="auto"/>
+          </w:tcBorders>
+        </w:tcPr>
+        <w:p>
+          <w:pPr>
+            <w:jc w:val="left"/>
+          </w:pPr>
+          <w:r>
+            <w:rPr>
+              <w:rFonts w:ascii="Times New Roman" w:hAnsi="Times New Roman"/>
+              <w:b/>
+              <w:color w:val="003D6B"/>
+              <w:sz w:val="16"/>
+            </w:rPr>
+            <w:t>UNIVERSIDADE FEDERAL DO RECÔNCAVO DA BAHIA — UFRB</w:t>
+          </w:r>
+        </w:p>
+        <w:p>
+          <w:pPr>
+            <w:jc w:val="left"/>
+          </w:pPr>
+          <w:r>
+            <w:rPr>
+              <w:rFonts w:ascii="Times New Roman" w:hAnsi="Times New Roman"/>
+              <w:b/>
+              <w:color w:val="006DAA"/>
+              <w:sz w:val="15"/>
+            </w:rPr>
+            <w:t>CENTRO DE CIÊNCIA E TECNOLOGIA — CETENS</w:t>
+          </w:r>
+        </w:p>
+        <w:p>
+          <w:pPr>
+            <w:jc w:val="left"/>
+          </w:pPr>
+          <w:r>
+            <w:rPr>
+              <w:rFonts w:ascii="Times New Roman" w:hAnsi="Times New Roman"/>
+              <w:color w:val="505050"/>
+              <w:sz w:val="14"/>
+            </w:rPr>
+            <w:t>BACHARELADO EM SISTEMAS DE INFORMAÇÃO (EAD)</w:t>
+          </w:r>
+        </w:p>
+        <w:p>
+          <w:pPr>
+            <w:jc w:val="left"/>
+          </w:pPr>
+          <w:r>
+            <w:rPr>
+              <w:color w:val="C89B3C"/>
+              <w:sz w:val="8"/>
+            </w:rPr>
+            <w:t>────────────────────────────────────────────────────────────────────────────────</w:t>
+          </w:r>
+        </w:p>
+      </w:tc>
+    </w:tr>
+  </w:tbl>
+</w:hdr>
 </file>
 
 <file path=word/numbering.xml><?xml version="1.0" encoding="utf-8"?>

</xml_diff>